<commit_message>
docs: finalize lab 1 and lab 2 reports
</commit_message>
<xml_diff>
--- a/lab_1/report.docx
+++ b/lab_1/report.docx
@@ -42,10 +42,14 @@
         <w:spacing w:line="360" w:lineRule="auto"/>
         <w:ind w:firstLine="0"/>
         <w:jc w:val="center"/>
+        <w:rPr>
+          <w:lang w:val="ru-RU"/>
+        </w:rPr>
       </w:pPr>
       <w:r>
         <w:rPr>
           <w:b/>
+          <w:lang w:val="ru-RU"/>
         </w:rPr>
         <w:t>Лабораторная работа № 1</w:t>
       </w:r>
@@ -55,10 +59,14 @@
         <w:spacing w:line="360" w:lineRule="auto"/>
         <w:ind w:firstLine="0"/>
         <w:jc w:val="center"/>
+        <w:rPr>
+          <w:lang w:val="ru-RU"/>
+        </w:rPr>
       </w:pPr>
       <w:r>
         <w:rPr>
           <w:b/>
+          <w:lang w:val="ru-RU"/>
         </w:rPr>
         <w:t>«Шифр Цезаря»</w:t>
       </w:r>
@@ -68,6 +76,9 @@
         <w:spacing w:line="360" w:lineRule="auto"/>
         <w:ind w:firstLine="0"/>
         <w:jc w:val="center"/>
+        <w:rPr>
+          <w:lang w:val="ru-RU"/>
+        </w:rPr>
       </w:pPr>
     </w:p>
     <w:p>
@@ -75,8 +86,14 @@
         <w:spacing w:line="360" w:lineRule="auto"/>
         <w:ind w:firstLine="0"/>
         <w:jc w:val="center"/>
-      </w:pPr>
-      <w:r>
+        <w:rPr>
+          <w:lang w:val="ru-RU"/>
+        </w:rPr>
+      </w:pPr>
+      <w:r>
+        <w:rPr>
+          <w:lang w:val="ru-RU"/>
+        </w:rPr>
         <w:t>по дисциплине «Математические основы защиты информации»</w:t>
       </w:r>
     </w:p>
@@ -85,8 +102,14 @@
         <w:spacing w:line="360" w:lineRule="auto"/>
         <w:ind w:firstLine="0"/>
         <w:jc w:val="center"/>
-      </w:pPr>
-      <w:r>
+        <w:rPr>
+          <w:lang w:val="ru-RU"/>
+        </w:rPr>
+      </w:pPr>
+      <w:r>
+        <w:rPr>
+          <w:lang w:val="ru-RU"/>
+        </w:rPr>
         <w:t>Вариант 16</w:t>
       </w:r>
     </w:p>
@@ -95,6 +118,9 @@
         <w:spacing w:before="240" w:line="360" w:lineRule="auto"/>
         <w:ind w:firstLine="0"/>
         <w:jc w:val="center"/>
+        <w:rPr>
+          <w:lang w:val="ru-RU"/>
+        </w:rPr>
       </w:pPr>
     </w:p>
     <w:p>
@@ -102,68 +128,116 @@
         <w:spacing w:line="360" w:lineRule="auto"/>
         <w:ind w:firstLine="0"/>
         <w:jc w:val="center"/>
+        <w:rPr>
+          <w:lang w:val="ru-RU"/>
+        </w:rPr>
       </w:pPr>
     </w:p>
     <w:p>
       <w:pPr>
         <w:spacing w:line="360" w:lineRule="auto"/>
         <w:ind w:left="3540" w:firstLine="0"/>
+        <w:rPr>
+          <w:lang w:val="ru-RU"/>
+        </w:rPr>
       </w:pPr>
     </w:p>
     <w:p>
       <w:pPr>
         <w:spacing w:line="240" w:lineRule="auto"/>
         <w:ind w:left="3118" w:firstLine="0"/>
-      </w:pPr>
-      <w:r>
+        <w:rPr>
+          <w:lang w:val="ru-RU"/>
+        </w:rPr>
+      </w:pPr>
+      <w:r>
+        <w:rPr>
+          <w:lang w:val="ru-RU"/>
+        </w:rPr>
         <w:t>Студента</w:t>
       </w:r>
       <w:r>
+        <w:rPr>
+          <w:lang w:val="ru-RU"/>
+        </w:rPr>
         <w:tab/>
       </w:r>
       <w:r>
+        <w:rPr>
+          <w:lang w:val="ru-RU"/>
+        </w:rPr>
         <w:tab/>
       </w:r>
       <w:r>
         <w:rPr>
           <w:u w:val="single"/>
-        </w:rPr>
-        <w:t>Смирнов Никита Михайлович        </w:t>
+          <w:lang w:val="ru-RU"/>
+        </w:rPr>
+        <w:t>Смирнов Никита Михайлович</w:t>
+      </w:r>
+      <w:r>
+        <w:rPr>
+          <w:u w:val="single"/>
+        </w:rPr>
+        <w:t>        </w:t>
       </w:r>
     </w:p>
     <w:p>
       <w:pPr>
         <w:spacing w:line="360" w:lineRule="auto"/>
         <w:ind w:left="3120" w:firstLine="0"/>
-      </w:pPr>
-      <w:r>
+        <w:rPr>
+          <w:lang w:val="ru-RU"/>
+        </w:rPr>
+      </w:pPr>
+      <w:r>
+        <w:rPr>
+          <w:lang w:val="ru-RU"/>
+        </w:rPr>
         <w:t>Курс</w:t>
       </w:r>
       <w:r>
+        <w:rPr>
+          <w:lang w:val="ru-RU"/>
+        </w:rPr>
         <w:tab/>
       </w:r>
       <w:r>
+        <w:rPr>
+          <w:lang w:val="ru-RU"/>
+        </w:rPr>
         <w:tab/>
       </w:r>
       <w:r>
         <w:rPr>
           <w:u w:val="single"/>
+          <w:lang w:val="ru-RU"/>
         </w:rPr>
         <w:t>2</w:t>
       </w:r>
       <w:r>
+        <w:rPr>
+          <w:lang w:val="ru-RU"/>
+        </w:rPr>
         <w:tab/>
       </w:r>
       <w:r>
+        <w:rPr>
+          <w:lang w:val="ru-RU"/>
+        </w:rPr>
         <w:tab/>
         <w:t>Группа</w:t>
       </w:r>
       <w:r>
+        <w:rPr>
+          <w:lang w:val="ru-RU"/>
+        </w:rPr>
         <w:tab/>
       </w:r>
       <w:r>
         <w:rPr>
           <w:u w:val="single"/>
+          <w:lang w:val="ru-RU"/>
         </w:rPr>
         <w:t>ФИТ-242</w:t>
       </w:r>
@@ -172,16 +246,26 @@
       <w:pPr>
         <w:spacing w:line="360" w:lineRule="auto"/>
         <w:ind w:left="5039" w:hanging="1920"/>
-      </w:pPr>
-      <w:r>
+        <w:rPr>
+          <w:lang w:val="ru-RU"/>
+        </w:rPr>
+      </w:pPr>
+      <w:r>
+        <w:rPr>
+          <w:lang w:val="ru-RU"/>
+        </w:rPr>
         <w:t>Направление</w:t>
       </w:r>
       <w:r>
+        <w:rPr>
+          <w:lang w:val="ru-RU"/>
+        </w:rPr>
         <w:tab/>
       </w:r>
       <w:r>
         <w:rPr>
           <w:u w:val="single"/>
+          <w:lang w:val="ru-RU"/>
         </w:rPr>
         <w:t>02.03.02 Фундаментальная информатика и информационные технологии</w:t>
       </w:r>
@@ -190,31 +274,54 @@
       <w:pPr>
         <w:spacing w:line="240" w:lineRule="auto"/>
         <w:ind w:left="3120" w:firstLine="0"/>
-      </w:pPr>
-      <w:r>
+        <w:rPr>
+          <w:lang w:val="ru-RU"/>
+        </w:rPr>
+      </w:pPr>
+      <w:r>
+        <w:rPr>
+          <w:lang w:val="ru-RU"/>
+        </w:rPr>
         <w:t>Проверил</w:t>
       </w:r>
       <w:r>
+        <w:rPr>
+          <w:lang w:val="ru-RU"/>
+        </w:rPr>
         <w:tab/>
       </w:r>
       <w:r>
+        <w:rPr>
+          <w:lang w:val="ru-RU"/>
+        </w:rPr>
         <w:tab/>
       </w:r>
       <w:r>
         <w:rPr>
           <w:u w:val="single"/>
-        </w:rPr>
-        <w:t>канд. пед. наук, доцент                  </w:t>
+          <w:lang w:val="ru-RU"/>
+        </w:rPr>
+        <w:t>канд. пед. наук, доцент</w:t>
+      </w:r>
+      <w:r>
+        <w:rPr>
+          <w:u w:val="single"/>
+        </w:rPr>
+        <w:t>                  </w:t>
       </w:r>
     </w:p>
     <w:p>
       <w:pPr>
         <w:spacing w:line="360" w:lineRule="auto"/>
         <w:ind w:left="6406" w:firstLine="0"/>
+        <w:rPr>
+          <w:lang w:val="ru-RU"/>
+        </w:rPr>
       </w:pPr>
       <w:r>
         <w:rPr>
           <w:sz w:val="18"/>
+          <w:lang w:val="ru-RU"/>
         </w:rPr>
         <w:t>должность</w:t>
       </w:r>
@@ -223,23 +330,42 @@
       <w:pPr>
         <w:spacing w:line="240" w:lineRule="auto"/>
         <w:ind w:left="5102" w:firstLine="0"/>
+        <w:rPr>
+          <w:lang w:val="ru-RU"/>
+        </w:rPr>
       </w:pPr>
       <w:r>
         <w:rPr>
           <w:u w:val="single"/>
-        </w:rPr>
-        <w:t>Белим Светлана Юрьевна                                </w:t>
+          <w:lang w:val="ru-RU"/>
+        </w:rPr>
+        <w:t>Белим Светлана Юрьевна</w:t>
+      </w:r>
+      <w:r>
+        <w:rPr>
+          <w:u w:val="single"/>
+        </w:rPr>
+        <w:t>                                </w:t>
       </w:r>
     </w:p>
     <w:p>
       <w:pPr>
         <w:spacing w:line="240" w:lineRule="auto"/>
         <w:ind w:left="3120" w:firstLine="0"/>
-      </w:pPr>
-      <w:r>
+        <w:rPr>
+          <w:lang w:val="ru-RU"/>
+        </w:rPr>
+      </w:pPr>
+      <w:r>
+        <w:rPr>
+          <w:lang w:val="ru-RU"/>
+        </w:rPr>
         <w:t>Выполнил</w:t>
       </w:r>
       <w:r>
+        <w:rPr>
+          <w:lang w:val="ru-RU"/>
+        </w:rPr>
         <w:tab/>
       </w:r>
       <w:r>
@@ -253,10 +379,14 @@
       <w:pPr>
         <w:spacing w:line="360" w:lineRule="auto"/>
         <w:ind w:left="6519" w:firstLine="0"/>
+        <w:rPr>
+          <w:lang w:val="ru-RU"/>
+        </w:rPr>
       </w:pPr>
       <w:r>
         <w:rPr>
           <w:sz w:val="18"/>
+          <w:lang w:val="ru-RU"/>
         </w:rPr>
         <w:t>дата, подпись студента</w:t>
       </w:r>
@@ -265,6 +395,9 @@
       <w:pPr>
         <w:spacing w:line="240" w:lineRule="auto"/>
         <w:ind w:left="5102" w:firstLine="0"/>
+        <w:rPr>
+          <w:lang w:val="ru-RU"/>
+        </w:rPr>
       </w:pPr>
       <w:r>
         <w:rPr>
@@ -850,12 +983,16 @@
       <w:pPr>
         <w:pStyle w:val="1"/>
         <w:pageBreakBefore/>
+        <w:rPr>
+          <w:lang w:val="ru-RU"/>
+        </w:rPr>
       </w:pPr>
       <w:bookmarkStart w:id="0" w:name="_Toc241610193"/>
       <w:r>
         <w:rPr>
           <w:rFonts w:ascii="Times New Roman" w:eastAsia="Times New Roman" w:hAnsi="Times New Roman" w:cs="Times New Roman"/>
           <w:b w:val="0"/>
+          <w:lang w:val="ru-RU"/>
         </w:rPr>
         <w:lastRenderedPageBreak/>
         <w:t>ВВЕДЕНИЕ</w:t>
@@ -865,25 +1002,53 @@
     <w:p>
       <w:pPr>
         <w:jc w:val="both"/>
-      </w:pPr>
-      <w:r>
+        <w:rPr>
+          <w:lang w:val="ru-RU"/>
+        </w:rPr>
+      </w:pPr>
+      <w:r>
+        <w:rPr>
+          <w:lang w:val="ru-RU"/>
+        </w:rPr>
         <w:t>Цель работы – исследование математической модели и криптографических свойств классического симметричного моноалфавитного шифра Цезаря, разработка программного комплекса для прямого и обратного шифрования текстов в дискретном кольце вычетов по модулю мощности алфавита, а также реализация алгоритма криптоанализа шифр-текста методом полного перебора ключевого пространства (</w:t>
       </w:r>
       <w:r>
         <w:rPr>
           <w:i/>
         </w:rPr>
-        <w:t>brute-force</w:t>
-      </w:r>
-      <w:r>
+        <w:t>brute</w:t>
+      </w:r>
+      <w:r>
+        <w:rPr>
+          <w:i/>
+          <w:lang w:val="ru-RU"/>
+        </w:rPr>
+        <w:t>-</w:t>
+      </w:r>
+      <w:r>
+        <w:rPr>
+          <w:i/>
+        </w:rPr>
+        <w:t>force</w:t>
+      </w:r>
+      <w:r>
+        <w:rPr>
+          <w:lang w:val="ru-RU"/>
+        </w:rPr>
         <w:t>) для индивидуального варианта 16 в соответствии с методическими указаниями кафедры.</w:t>
       </w:r>
     </w:p>
     <w:p>
       <w:pPr>
         <w:jc w:val="both"/>
-      </w:pPr>
-      <w:r>
+        <w:rPr>
+          <w:lang w:val="ru-RU"/>
+        </w:rPr>
+      </w:pPr>
+      <w:r>
+        <w:rPr>
+          <w:lang w:val="ru-RU"/>
+        </w:rPr>
         <w:t>Для достижения поставленной цели необходимо решить следующие задачи:</w:t>
       </w:r>
     </w:p>
@@ -891,8 +1056,14 @@
       <w:pPr>
         <w:ind w:left="425" w:firstLine="0"/>
         <w:jc w:val="both"/>
-      </w:pPr>
-      <w:r>
+        <w:rPr>
+          <w:lang w:val="ru-RU"/>
+        </w:rPr>
+      </w:pPr>
+      <w:r>
+        <w:rPr>
+          <w:lang w:val="ru-RU"/>
+        </w:rPr>
         <w:t xml:space="preserve">1. Изучить математический аппарат моноалфавитной замены, структуру алфавитной кодировки и операции посимвольного циклического сдвига в кольце </w:t>
       </w:r>
       <m:oMath>
@@ -920,6 +1091,7 @@
                   </m:rPr>
                   <w:rPr>
                     <w:rFonts w:ascii="Cambria Math" w:hAnsi="Cambria Math"/>
+                    <w:lang w:val="ru-RU"/>
                   </w:rPr>
                   <m:t>Z</m:t>
                 </m:r>
@@ -937,6 +1109,9 @@
         </m:box>
       </m:oMath>
       <w:r>
+        <w:rPr>
+          <w:lang w:val="ru-RU"/>
+        </w:rPr>
         <w:t>.</w:t>
       </w:r>
     </w:p>
@@ -944,8 +1119,14 @@
       <w:pPr>
         <w:ind w:left="425" w:firstLine="0"/>
         <w:jc w:val="both"/>
-      </w:pPr>
-      <w:r>
+        <w:rPr>
+          <w:lang w:val="ru-RU"/>
+        </w:rPr>
+      </w:pPr>
+      <w:r>
+        <w:rPr>
+          <w:lang w:val="ru-RU"/>
+        </w:rPr>
         <w:t xml:space="preserve">2. Разработать программный модуль на языке </w:t>
       </w:r>
       <w:r>
@@ -955,6 +1136,9 @@
         <w:t>Python</w:t>
       </w:r>
       <w:r>
+        <w:rPr>
+          <w:lang w:val="ru-RU"/>
+        </w:rPr>
         <w:t>, обеспечивающий кодирование символов, прямое зашифрование, обратное расшифрование и исчерпывающий перебор ключевого пространства.</w:t>
       </w:r>
     </w:p>
@@ -962,12 +1146,15 @@
       <w:pPr>
         <w:ind w:left="425" w:firstLine="0"/>
         <w:jc w:val="both"/>
-      </w:pPr>
-      <w:r>
-        <w:t xml:space="preserve">3. </w:t>
-      </w:r>
-      <w:r>
-        <w:t xml:space="preserve">Выполнить криптоанализ перехваченного шифр-текста варианта 16: определить истинный секретный ключ </w:t>
+        <w:rPr>
+          <w:lang w:val="ru-RU"/>
+        </w:rPr>
+      </w:pPr>
+      <w:r>
+        <w:rPr>
+          <w:lang w:val="ru-RU"/>
+        </w:rPr>
+        <w:t xml:space="preserve">3. Выполнить криптоанализ перехваченного шифр-текста варианта 16: определить истинный секретный ключ </w:t>
       </w:r>
       <m:oMath>
         <m:box>
@@ -989,6 +1176,9 @@
         </m:box>
       </m:oMath>
       <w:r>
+        <w:rPr>
+          <w:lang w:val="ru-RU"/>
+        </w:rPr>
         <w:t>, восстановить исходный открытый текст, установить автора и название литературного произведения.</w:t>
       </w:r>
     </w:p>
@@ -996,30 +1186,31 @@
       <w:pPr>
         <w:ind w:left="425" w:firstLine="0"/>
         <w:jc w:val="both"/>
-      </w:pPr>
-      <w:r>
+        <w:rPr>
+          <w:lang w:val="ru-RU"/>
+        </w:rPr>
+      </w:pPr>
+      <w:r>
+        <w:rPr>
+          <w:lang w:val="ru-RU"/>
+        </w:rPr>
         <w:t>4. Выполнить контрольное зашифрование открытой строки, содержащей фамилию автора и название произведения, найденным ключом.</w:t>
-      </w:r>
-    </w:p>
-    <w:p>
-      <w:pPr>
-        <w:ind w:left="425" w:firstLine="0"/>
-        <w:jc w:val="both"/>
-      </w:pPr>
-      <w:r>
-        <w:t>5. Оформить результаты исследований в виде академического отчета в строгом соответствии с шаблоном методических указаний и профилем оформления кафедры ПМиФИ.</w:t>
       </w:r>
     </w:p>
     <w:p>
       <w:pPr>
         <w:pStyle w:val="1"/>
         <w:pageBreakBefore/>
+        <w:rPr>
+          <w:lang w:val="ru-RU"/>
+        </w:rPr>
       </w:pPr>
       <w:bookmarkStart w:id="1" w:name="_Toc241610194"/>
       <w:r>
         <w:rPr>
           <w:rFonts w:ascii="Times New Roman" w:eastAsia="Times New Roman" w:hAnsi="Times New Roman" w:cs="Times New Roman"/>
           <w:b w:val="0"/>
+          <w:lang w:val="ru-RU"/>
         </w:rPr>
         <w:lastRenderedPageBreak/>
         <w:t>ОСНОВНАЯ ЧАСТЬ</w:t>
@@ -1029,27 +1220,31 @@
     <w:p>
       <w:pPr>
         <w:pStyle w:val="21"/>
+        <w:rPr>
+          <w:lang w:val="ru-RU"/>
+        </w:rPr>
       </w:pPr>
       <w:bookmarkStart w:id="2" w:name="_Toc241610195"/>
       <w:r>
         <w:rPr>
           <w:rFonts w:ascii="Times New Roman" w:eastAsia="Times New Roman" w:hAnsi="Times New Roman" w:cs="Times New Roman"/>
-        </w:rPr>
-        <w:t xml:space="preserve">1. </w:t>
-      </w:r>
-      <w:r>
-        <w:rPr>
-          <w:rFonts w:ascii="Times New Roman" w:eastAsia="Times New Roman" w:hAnsi="Times New Roman" w:cs="Times New Roman"/>
-        </w:rPr>
-        <w:t>Основные сведения и математическая модель</w:t>
+          <w:lang w:val="ru-RU"/>
+        </w:rPr>
+        <w:t>1. Основные сведения и математическая модель</w:t>
       </w:r>
       <w:bookmarkEnd w:id="2"/>
     </w:p>
     <w:p>
       <w:pPr>
         <w:jc w:val="both"/>
-      </w:pPr>
-      <w:r>
+        <w:rPr>
+          <w:lang w:val="ru-RU"/>
+        </w:rPr>
+      </w:pPr>
+      <w:r>
+        <w:rPr>
+          <w:lang w:val="ru-RU"/>
+        </w:rPr>
         <w:t xml:space="preserve">Шифр Цезаря представляет собой классический моноалфавитный шифр простой подстановки, реализующий преобразование циклического сдвига в кольце вычетов </w:t>
       </w:r>
       <m:oMath>
@@ -1077,6 +1272,7 @@
                   </m:rPr>
                   <w:rPr>
                     <w:rFonts w:ascii="Cambria Math" w:hAnsi="Cambria Math"/>
+                    <w:lang w:val="ru-RU"/>
                   </w:rPr>
                   <m:t>Z</m:t>
                 </m:r>
@@ -1094,6 +1290,9 @@
         </m:box>
       </m:oMath>
       <w:r>
+        <w:rPr>
+          <w:lang w:val="ru-RU"/>
+        </w:rPr>
         <w:t xml:space="preserve">, где </w:t>
       </w:r>
       <m:oMath>
@@ -1116,6 +1315,9 @@
         </m:box>
       </m:oMath>
       <w:r>
+        <w:rPr>
+          <w:lang w:val="ru-RU"/>
+        </w:rPr>
         <w:t xml:space="preserve"> – мощность используемого алфавита. Каждому символу открытого текста сопоставляется числовой индекс </w:t>
       </w:r>
       <m:oMath>
@@ -1159,6 +1361,7 @@
               </m:rPr>
               <w:rPr>
                 <w:rFonts w:ascii="Cambria Math" w:hAnsi="Cambria Math"/>
+                <w:lang w:val="ru-RU"/>
               </w:rPr>
               <m:t>∈{0,1,…,</m:t>
             </m:r>
@@ -1174,6 +1377,7 @@
               </m:rPr>
               <w:rPr>
                 <w:rFonts w:ascii="Cambria Math" w:hAnsi="Cambria Math"/>
+                <w:lang w:val="ru-RU"/>
               </w:rPr>
               <m:t>-1}</m:t>
             </m:r>
@@ -1181,14 +1385,23 @@
         </m:box>
       </m:oMath>
       <w:r>
+        <w:rPr>
+          <w:lang w:val="ru-RU"/>
+        </w:rPr>
         <w:t>.</w:t>
       </w:r>
     </w:p>
     <w:p>
       <w:pPr>
         <w:jc w:val="both"/>
-      </w:pPr>
-      <w:r>
+        <w:rPr>
+          <w:lang w:val="ru-RU"/>
+        </w:rPr>
+      </w:pPr>
+      <w:r>
+        <w:rPr>
+          <w:lang w:val="ru-RU"/>
+        </w:rPr>
         <w:t>Прямое преобразование шифра Цезаря определяется соотношением:</w:t>
       </w:r>
     </w:p>
@@ -1197,6 +1410,9 @@
         <w:spacing w:before="120" w:after="120"/>
         <w:ind w:firstLine="0"/>
         <w:jc w:val="center"/>
+        <w:rPr>
+          <w:lang w:val="ru-RU"/>
+        </w:rPr>
       </w:pPr>
       <m:oMathPara>
         <m:oMath>
@@ -1221,6 +1437,7 @@
                 </m:rPr>
                 <w:rPr>
                   <w:rFonts w:ascii="Cambria Math" w:hAnsi="Cambria Math"/>
+                  <w:lang w:val="ru-RU"/>
                 </w:rPr>
                 <m:t>=</m:t>
               </m:r>
@@ -1255,6 +1472,7 @@
                 </m:rPr>
                 <w:rPr>
                   <w:rFonts w:ascii="Cambria Math" w:hAnsi="Cambria Math"/>
+                  <w:lang w:val="ru-RU"/>
                 </w:rPr>
                 <m:t>(</m:t>
               </m:r>
@@ -1270,6 +1488,7 @@
                 </m:rPr>
                 <w:rPr>
                   <w:rFonts w:ascii="Cambria Math" w:hAnsi="Cambria Math"/>
+                  <w:lang w:val="ru-RU"/>
                 </w:rPr>
                 <m:t>)=(</m:t>
               </m:r>
@@ -1285,6 +1504,7 @@
                 </m:rPr>
                 <w:rPr>
                   <w:rFonts w:ascii="Cambria Math" w:hAnsi="Cambria Math"/>
+                  <w:lang w:val="ru-RU"/>
                 </w:rPr>
                 <m:t>+</m:t>
               </m:r>
@@ -1300,6 +1520,7 @@
                 </m:rPr>
                 <w:rPr>
                   <w:rFonts w:ascii="Cambria Math" w:hAnsi="Cambria Math"/>
+                  <w:lang w:val="ru-RU"/>
                 </w:rPr>
                 <m:t>)</m:t>
               </m:r>
@@ -1360,8 +1581,14 @@
     <w:p>
       <w:pPr>
         <w:jc w:val="both"/>
-      </w:pPr>
-      <w:r>
+        <w:rPr>
+          <w:lang w:val="ru-RU"/>
+        </w:rPr>
+      </w:pPr>
+      <w:r>
+        <w:rPr>
+          <w:lang w:val="ru-RU"/>
+        </w:rPr>
         <w:t>Обратное преобразование шифра Цезаря определяется соотношением:</w:t>
       </w:r>
     </w:p>
@@ -1370,6 +1597,9 @@
         <w:spacing w:before="120" w:after="120"/>
         <w:ind w:firstLine="0"/>
         <w:jc w:val="center"/>
+        <w:rPr>
+          <w:lang w:val="ru-RU"/>
+        </w:rPr>
       </w:pPr>
       <m:oMathPara>
         <m:oMath>
@@ -1394,6 +1624,7 @@
                 </m:rPr>
                 <w:rPr>
                   <w:rFonts w:ascii="Cambria Math" w:hAnsi="Cambria Math"/>
+                  <w:lang w:val="ru-RU"/>
                 </w:rPr>
                 <m:t>=</m:t>
               </m:r>
@@ -1428,6 +1659,7 @@
                 </m:rPr>
                 <w:rPr>
                   <w:rFonts w:ascii="Cambria Math" w:hAnsi="Cambria Math"/>
+                  <w:lang w:val="ru-RU"/>
                 </w:rPr>
                 <m:t>(</m:t>
               </m:r>
@@ -1443,6 +1675,7 @@
                 </m:rPr>
                 <w:rPr>
                   <w:rFonts w:ascii="Cambria Math" w:hAnsi="Cambria Math"/>
+                  <w:lang w:val="ru-RU"/>
                 </w:rPr>
                 <m:t>)=(</m:t>
               </m:r>
@@ -1458,6 +1691,7 @@
                 </m:rPr>
                 <w:rPr>
                   <w:rFonts w:ascii="Cambria Math" w:hAnsi="Cambria Math"/>
+                  <w:lang w:val="ru-RU"/>
                 </w:rPr>
                 <m:t>-</m:t>
               </m:r>
@@ -1473,6 +1707,7 @@
                 </m:rPr>
                 <w:rPr>
                   <w:rFonts w:ascii="Cambria Math" w:hAnsi="Cambria Math"/>
+                  <w:lang w:val="ru-RU"/>
                 </w:rPr>
                 <m:t>)</m:t>
               </m:r>
@@ -1533,8 +1768,14 @@
     <w:p>
       <w:pPr>
         <w:jc w:val="both"/>
-      </w:pPr>
-      <w:r>
+        <w:rPr>
+          <w:lang w:val="ru-RU"/>
+        </w:rPr>
+      </w:pPr>
+      <w:r>
+        <w:rPr>
+          <w:lang w:val="ru-RU"/>
+        </w:rPr>
         <w:t xml:space="preserve">где </w:t>
       </w:r>
       <m:oMath>
@@ -1557,6 +1798,9 @@
         </m:box>
       </m:oMath>
       <w:r>
+        <w:rPr>
+          <w:lang w:val="ru-RU"/>
+        </w:rPr>
         <w:t xml:space="preserve"> – числовой код символа открытого сообщения, </w:t>
       </w:r>
       <m:oMath>
@@ -1579,6 +1823,9 @@
         </m:box>
       </m:oMath>
       <w:r>
+        <w:rPr>
+          <w:lang w:val="ru-RU"/>
+        </w:rPr>
         <w:t xml:space="preserve"> – числовой код символа зашифрованного сообщения, </w:t>
       </w:r>
       <m:oMath>
@@ -1603,6 +1850,7 @@
               </m:rPr>
               <w:rPr>
                 <w:rFonts w:ascii="Cambria Math" w:hAnsi="Cambria Math"/>
+                <w:lang w:val="ru-RU"/>
               </w:rPr>
               <m:t>∈{1,2,…,</m:t>
             </m:r>
@@ -1618,6 +1866,7 @@
               </m:rPr>
               <w:rPr>
                 <w:rFonts w:ascii="Cambria Math" w:hAnsi="Cambria Math"/>
+                <w:lang w:val="ru-RU"/>
               </w:rPr>
               <m:t>-1}</m:t>
             </m:r>
@@ -1625,6 +1874,9 @@
         </m:box>
       </m:oMath>
       <w:r>
+        <w:rPr>
+          <w:lang w:val="ru-RU"/>
+        </w:rPr>
         <w:t xml:space="preserve"> – секретный ключ шифрования, </w:t>
       </w:r>
       <m:oMath>
@@ -1649,6 +1901,7 @@
               </m:rPr>
               <w:rPr>
                 <w:rFonts w:ascii="Cambria Math" w:hAnsi="Cambria Math"/>
+                <w:lang w:val="ru-RU"/>
               </w:rPr>
               <m:t>=32</m:t>
             </m:r>
@@ -1656,24 +1909,45 @@
         </m:box>
       </m:oMath>
       <w:r>
+        <w:rPr>
+          <w:lang w:val="ru-RU"/>
+        </w:rPr>
         <w:t xml:space="preserve"> – мощность используемого русского алфавита. В соответствии с методическими указаниями буквы «е» и «ё» объединены под единым числовым кодом 5.</w:t>
       </w:r>
     </w:p>
     <w:p>
       <w:pPr>
         <w:jc w:val="both"/>
-      </w:pPr>
-      <w:r>
+        <w:rPr>
+          <w:lang w:val="ru-RU"/>
+        </w:rPr>
+      </w:pPr>
+      <w:r>
+        <w:rPr>
+          <w:lang w:val="ru-RU"/>
+        </w:rPr>
         <w:t>В таблице представлена полная таблица кодировки символов русского алфавита, применяемая при выполнении работы.</w:t>
       </w:r>
     </w:p>
-    <w:p/>
+    <w:p>
+      <w:pPr>
+        <w:rPr>
+          <w:lang w:val="ru-RU"/>
+        </w:rPr>
+      </w:pPr>
+    </w:p>
     <w:p>
       <w:pPr>
         <w:keepNext/>
         <w:ind w:firstLine="0"/>
-      </w:pPr>
-      <w:r>
+        <w:rPr>
+          <w:lang w:val="ru-RU"/>
+        </w:rPr>
+      </w:pPr>
+      <w:r>
+        <w:rPr>
+          <w:lang w:val="ru-RU"/>
+        </w:rPr>
         <w:t>Таблица 1 – Таблица кодировки символов русского алфавита (</w:t>
       </w:r>
       <w:r>
@@ -1683,6 +1957,9 @@
         <w:t>m</w:t>
       </w:r>
       <w:r>
+        <w:rPr>
+          <w:lang w:val="ru-RU"/>
+        </w:rPr>
         <w:t xml:space="preserve"> = 32)</w:t>
       </w:r>
     </w:p>
@@ -2784,28 +3061,42 @@
     <w:p>
       <w:pPr>
         <w:jc w:val="both"/>
-      </w:pPr>
-      <w:r>
+        <w:rPr>
+          <w:lang w:val="ru-RU"/>
+        </w:rPr>
+      </w:pPr>
+      <w:r>
+        <w:rPr>
+          <w:lang w:val="ru-RU"/>
+        </w:rPr>
         <w:t>Для варианта 16 исходное зашифрованное сообщение имеет следующий вид:</w:t>
       </w:r>
     </w:p>
     <w:p>
       <w:pPr>
         <w:jc w:val="both"/>
+        <w:rPr>
+          <w:lang w:val="ru-RU"/>
+        </w:rPr>
       </w:pPr>
       <w:r>
         <w:rPr>
           <w:b/>
+          <w:lang w:val="ru-RU"/>
         </w:rPr>
         <w:t>ШИФР-ТЕКСТ (ШТ):</w:t>
       </w:r>
       <w:r>
+        <w:rPr>
+          <w:lang w:val="ru-RU"/>
+        </w:rPr>
         <w:br/>
       </w:r>
       <w:r>
         <w:rPr>
           <w:rFonts w:ascii="DejaVu Sans" w:eastAsia="DejaVu Sans" w:hAnsi="DejaVu Sans" w:cs="DejaVu Sans"/>
           <w:sz w:val="22"/>
+          <w:lang w:val="ru-RU"/>
         </w:rPr>
         <w:t>юяингщжсадвгмюруюцэьцгтяфдщшуцшхсвшуцшхяпфяуябщг</w:t>
       </w:r>
@@ -2813,8 +3104,14 @@
     <w:p>
       <w:pPr>
         <w:jc w:val="both"/>
-      </w:pPr>
-      <w:r>
+        <w:rPr>
+          <w:lang w:val="ru-RU"/>
+        </w:rPr>
+      </w:pPr>
+      <w:r>
+        <w:rPr>
+          <w:lang w:val="ru-RU"/>
+        </w:rPr>
         <w:t xml:space="preserve">Длина шифр-текста составляет 48 символов. Так как объем ключевого пространства шифра Цезаря ограничен величиной </w:t>
       </w:r>
       <m:oMath>
@@ -2839,6 +3136,7 @@
               </m:rPr>
               <w:rPr>
                 <w:rFonts w:ascii="Cambria Math" w:hAnsi="Cambria Math"/>
+                <w:lang w:val="ru-RU"/>
               </w:rPr>
               <m:t>-1=31</m:t>
             </m:r>
@@ -2846,15 +3144,34 @@
         </m:box>
       </m:oMath>
       <w:r>
+        <w:rPr>
+          <w:lang w:val="ru-RU"/>
+        </w:rPr>
         <w:t>, криптоанализ проводился методом полного исчерпывающего перебора (</w:t>
       </w:r>
       <w:r>
         <w:rPr>
           <w:i/>
         </w:rPr>
-        <w:t>brute-force</w:t>
-      </w:r>
-      <w:r>
+        <w:t>brute</w:t>
+      </w:r>
+      <w:r>
+        <w:rPr>
+          <w:i/>
+          <w:lang w:val="ru-RU"/>
+        </w:rPr>
+        <w:t>-</w:t>
+      </w:r>
+      <w:r>
+        <w:rPr>
+          <w:i/>
+        </w:rPr>
+        <w:t>force</w:t>
+      </w:r>
+      <w:r>
+        <w:rPr>
+          <w:lang w:val="ru-RU"/>
+        </w:rPr>
         <w:t xml:space="preserve">). Результаты дешифрования исходного шифр-текста для всех возможных ключей </w:t>
       </w:r>
       <m:oMath>
@@ -2879,6 +3196,7 @@
               </m:rPr>
               <w:rPr>
                 <w:rFonts w:ascii="Cambria Math" w:hAnsi="Cambria Math"/>
+                <w:lang w:val="ru-RU"/>
               </w:rPr>
               <m:t>∈{1,2,…,31}</m:t>
             </m:r>
@@ -2886,16 +3204,31 @@
         </m:box>
       </m:oMath>
       <w:r>
+        <w:rPr>
+          <w:lang w:val="ru-RU"/>
+        </w:rPr>
         <w:t xml:space="preserve"> приведены в таблице.</w:t>
       </w:r>
     </w:p>
-    <w:p/>
+    <w:p>
+      <w:pPr>
+        <w:rPr>
+          <w:lang w:val="ru-RU"/>
+        </w:rPr>
+      </w:pPr>
+    </w:p>
     <w:p>
       <w:pPr>
         <w:keepNext/>
         <w:ind w:firstLine="0"/>
-      </w:pPr>
-      <w:r>
+        <w:rPr>
+          <w:lang w:val="ru-RU"/>
+        </w:rPr>
+      </w:pPr>
+      <w:r>
+        <w:rPr>
+          <w:lang w:val="ru-RU"/>
+        </w:rPr>
         <w:t>Таблица 2 – Варианты расшифрования исходного ШТ при различных значениях ключа</w:t>
       </w:r>
     </w:p>
@@ -4114,8 +4447,14 @@
     <w:p>
       <w:pPr>
         <w:jc w:val="both"/>
-      </w:pPr>
-      <w:r>
+        <w:rPr>
+          <w:lang w:val="ru-RU"/>
+        </w:rPr>
+      </w:pPr>
+      <w:r>
+        <w:rPr>
+          <w:lang w:val="ru-RU"/>
+        </w:rPr>
         <w:t xml:space="preserve">По результатам анализа таблицы перебора единственным осмысленным текстом является вариант при значении ключа </w:t>
       </w:r>
       <m:oMath>
@@ -4140,6 +4479,7 @@
               </m:rPr>
               <w:rPr>
                 <w:rFonts w:ascii="Cambria Math" w:hAnsi="Cambria Math"/>
+                <w:lang w:val="ru-RU"/>
               </w:rPr>
               <m:t>=17</m:t>
             </m:r>
@@ -4147,26 +4487,36 @@
         </m:box>
       </m:oMath>
       <w:r>
+        <w:rPr>
+          <w:lang w:val="ru-RU"/>
+        </w:rPr>
         <w:t>:</w:t>
       </w:r>
     </w:p>
     <w:p>
       <w:pPr>
-        <w:jc w:val="both"/>
+        <w:rPr>
+          <w:lang w:val="ru-RU"/>
+        </w:rPr>
       </w:pPr>
       <w:r>
         <w:rPr>
           <w:b/>
+          <w:lang w:val="ru-RU"/>
         </w:rPr>
         <w:t>РАСШИФРОВАННЫЙ ТЕКСТ (ОТ):</w:t>
       </w:r>
       <w:r>
+        <w:rPr>
+          <w:lang w:val="ru-RU"/>
+        </w:rPr>
         <w:br/>
       </w:r>
       <w:r>
         <w:rPr>
           <w:rFonts w:ascii="DejaVu Sans" w:eastAsia="DejaVu Sans" w:hAnsi="DejaVu Sans" w:cs="DejaVu Sans"/>
           <w:sz w:val="22"/>
+          <w:lang w:val="ru-RU"/>
         </w:rPr>
         <w:t>ночьтихапустынявнемлетбогуизвездасзвездоюговорит</w:t>
       </w:r>
@@ -4174,1504 +4524,1622 @@
     <w:p>
       <w:pPr>
         <w:jc w:val="both"/>
+        <w:rPr>
+          <w:lang w:val="ru-RU"/>
+        </w:rPr>
       </w:pPr>
       <w:r>
         <w:rPr>
           <w:b/>
+          <w:lang w:val="ru-RU"/>
         </w:rPr>
         <w:t>КЛЮЧ:</w:t>
       </w:r>
       <w:r>
+        <w:rPr>
+          <w:lang w:val="ru-RU"/>
+        </w:rPr>
         <w:br/>
-      </w:r>
-      <w:r>
         <w:t>17</w:t>
       </w:r>
     </w:p>
     <w:p>
       <w:pPr>
+        <w:rPr>
+          <w:lang w:val="ru-RU"/>
+        </w:rPr>
+      </w:pPr>
+      <w:r>
+        <w:rPr>
+          <w:b/>
+          <w:lang w:val="ru-RU"/>
+        </w:rPr>
+        <w:t>АВТОР И ПРОИЗВЕДЕНИЕ (ОТ):</w:t>
+      </w:r>
+      <w:r>
+        <w:rPr>
+          <w:lang w:val="ru-RU"/>
+        </w:rPr>
+        <w:br/>
+        <w:t>М. Ю. Лермонтов, «Выхожу один я на дорогу»</w:t>
+      </w:r>
+    </w:p>
+    <w:p>
+      <w:pPr>
         <w:jc w:val="both"/>
-      </w:pPr>
+        <w:rPr>
+          <w:lang w:val="ru-RU"/>
+        </w:rPr>
+      </w:pPr>
+      <w:r>
+        <w:rPr>
+          <w:lang w:val="ru-RU"/>
+        </w:rPr>
+        <w:t>Строка представляет собой фрагмент первой строфы стихотворения:</w:t>
+      </w:r>
+    </w:p>
+    <w:p>
+      <w:pPr>
+        <w:jc w:val="center"/>
+        <w:rPr>
+          <w:lang w:val="ru-RU"/>
+        </w:rPr>
+      </w:pPr>
+      <w:r>
+        <w:rPr>
+          <w:lang w:val="ru-RU"/>
+        </w:rPr>
+        <w:t>Выхожу один я на дорогу;</w:t>
+      </w:r>
+      <w:r>
+        <w:rPr>
+          <w:lang w:val="ru-RU"/>
+        </w:rPr>
+        <w:br/>
+        <w:t>Сквозь туман кремнистый путь блестит;</w:t>
+      </w:r>
+      <w:r>
+        <w:rPr>
+          <w:lang w:val="ru-RU"/>
+        </w:rPr>
+        <w:br/>
+        <w:t>Ночь тиха. Пустыня внемлет Богу,</w:t>
+      </w:r>
+      <w:r>
+        <w:rPr>
+          <w:lang w:val="ru-RU"/>
+        </w:rPr>
+        <w:br/>
+        <w:t>И звезда с звездою говорит.</w:t>
+      </w:r>
+    </w:p>
+    <w:p>
+      <w:pPr>
+        <w:jc w:val="both"/>
+        <w:rPr>
+          <w:lang w:val="ru-RU"/>
+        </w:rPr>
+      </w:pPr>
+      <w:r>
+        <w:rPr>
+          <w:lang w:val="ru-RU"/>
+        </w:rPr>
+        <w:t>В соответствии с заданием методических указаний выполнено контрольное зашифрование строки, составленной из фамилии автора и названия произведения:</w:t>
+      </w:r>
+    </w:p>
+    <w:p>
+      <w:pPr>
+        <w:ind w:left="425" w:firstLine="0"/>
+        <w:rPr>
+          <w:lang w:val="ru-RU"/>
+        </w:rPr>
+      </w:pPr>
+      <w:r>
+        <w:rPr>
+          <w:lang w:val="ru-RU"/>
+        </w:rPr>
+        <w:t xml:space="preserve">• Исходная открытая строка: </w:t>
+      </w:r>
+      <w:r>
+        <w:rPr>
+          <w:rFonts w:ascii="DejaVu Sans" w:eastAsia="DejaVu Sans" w:hAnsi="DejaVu Sans" w:cs="DejaVu Sans"/>
+          <w:sz w:val="22"/>
+          <w:lang w:val="ru-RU"/>
+        </w:rPr>
+        <w:t>лермонтоввыхожуодинянадорогу</w:t>
+      </w:r>
+    </w:p>
+    <w:p>
+      <w:pPr>
+        <w:ind w:left="425" w:firstLine="0"/>
+        <w:rPr>
+          <w:lang w:val="ru-RU"/>
+        </w:rPr>
+      </w:pPr>
+      <w:r>
+        <w:rPr>
+          <w:lang w:val="ru-RU"/>
+        </w:rPr>
+        <w:t xml:space="preserve">• </w:t>
+      </w:r>
       <w:r>
         <w:rPr>
           <w:b/>
-        </w:rPr>
-        <w:t>АВТОР И ПРОИЗВЕДЕНИЕ (ОТ):</w:t>
-      </w:r>
-      <w:r>
+          <w:lang w:val="ru-RU"/>
+        </w:rPr>
+        <w:t>ЗАШИФРОВАННЫЕ ФАМИЛИЯ И НАЗВАНИЕ (ШТ):</w:t>
+      </w:r>
+      <w:r>
+        <w:rPr>
+          <w:lang w:val="ru-RU"/>
+        </w:rPr>
         <w:br/>
       </w:r>
       <w:r>
-        <w:t>М. Ю. Лермонтов, «Выхожу один я на дорогу»</w:t>
-      </w:r>
+        <w:rPr>
+          <w:rFonts w:ascii="DejaVu Sans" w:eastAsia="DejaVu Sans" w:hAnsi="DejaVu Sans" w:cs="DejaVu Sans"/>
+          <w:sz w:val="22"/>
+          <w:lang w:val="ru-RU"/>
+        </w:rPr>
+        <w:t>ьцбэяюгяуумжячдяхщюрюсхябяфд</w:t>
+      </w:r>
+    </w:p>
+    <w:p>
+      <w:pPr>
+        <w:pStyle w:val="21"/>
+        <w:rPr>
+          <w:lang w:val="ru-RU"/>
+        </w:rPr>
+      </w:pPr>
+      <w:bookmarkStart w:id="4" w:name="_Toc241610197"/>
+      <w:r>
+        <w:rPr>
+          <w:rFonts w:ascii="Times New Roman" w:eastAsia="Times New Roman" w:hAnsi="Times New Roman" w:cs="Times New Roman"/>
+          <w:lang w:val="ru-RU"/>
+        </w:rPr>
+        <w:t>3. Программная реализация</w:t>
+      </w:r>
+      <w:bookmarkEnd w:id="4"/>
     </w:p>
     <w:p>
       <w:pPr>
         <w:jc w:val="both"/>
-      </w:pPr>
-      <w:r>
-        <w:t>Строка представляет собой фрагмент первой строфы стихотворения:</w:t>
-      </w:r>
+        <w:rPr>
+          <w:lang w:val="ru-RU"/>
+        </w:rPr>
+      </w:pPr>
+      <w:r>
+        <w:rPr>
+          <w:lang w:val="ru-RU"/>
+        </w:rPr>
+        <w:t xml:space="preserve">Программный модуль шифра Цезаря реализован на языке </w:t>
+      </w:r>
+      <w:r>
+        <w:rPr>
+          <w:i/>
+        </w:rPr>
+        <w:t>Python</w:t>
+      </w:r>
+      <w:r>
+        <w:rPr>
+          <w:lang w:val="ru-RU"/>
+        </w:rPr>
+        <w:t>. В листинге приведена реализация математического ядра, функций прямого и обратного шифрования, а также процедуры полного перебора ключей.</w:t>
+      </w:r>
+    </w:p>
+    <w:p>
+      <w:pPr>
+        <w:keepNext/>
+        <w:ind w:firstLine="0"/>
+        <w:rPr>
+          <w:lang w:val="ru-RU"/>
+        </w:rPr>
+      </w:pPr>
+      <w:r>
+        <w:rPr>
+          <w:lang w:val="ru-RU"/>
+        </w:rPr>
+        <w:lastRenderedPageBreak/>
+        <w:t>Листинг 1 – Реализация алгоритмов шифрования Цезаря и перебора ключей (</w:t>
+      </w:r>
+      <w:r>
+        <w:rPr>
+          <w:i/>
+        </w:rPr>
+        <w:t>caesar</w:t>
+      </w:r>
+      <w:r>
+        <w:rPr>
+          <w:i/>
+          <w:lang w:val="ru-RU"/>
+        </w:rPr>
+        <w:t>_</w:t>
+      </w:r>
+      <w:r>
+        <w:rPr>
+          <w:i/>
+        </w:rPr>
+        <w:t>cipher</w:t>
+      </w:r>
+      <w:r>
+        <w:rPr>
+          <w:i/>
+          <w:lang w:val="ru-RU"/>
+        </w:rPr>
+        <w:t>.</w:t>
+      </w:r>
+      <w:r>
+        <w:rPr>
+          <w:i/>
+        </w:rPr>
+        <w:t>py</w:t>
+      </w:r>
+      <w:r>
+        <w:rPr>
+          <w:lang w:val="ru-RU"/>
+        </w:rPr>
+        <w:t>)</w:t>
+      </w:r>
+    </w:p>
+    <w:p>
+      <w:pPr>
+        <w:spacing w:before="120" w:line="240" w:lineRule="auto"/>
+        <w:ind w:firstLine="0"/>
+      </w:pPr>
+      <w:r>
+        <w:rPr>
+          <w:rFonts w:ascii="DejaVu Sans" w:eastAsia="DejaVu Sans" w:hAnsi="DejaVu Sans" w:cs="DejaVu Sans"/>
+          <w:sz w:val="22"/>
+        </w:rPr>
+        <w:t>from typing import Dict, List, Optional, Tuple</w:t>
+      </w:r>
+    </w:p>
+    <w:p>
+      <w:pPr>
+        <w:spacing w:line="240" w:lineRule="auto"/>
+        <w:ind w:firstLine="0"/>
+      </w:pPr>
+    </w:p>
+    <w:p>
+      <w:pPr>
+        <w:spacing w:line="240" w:lineRule="auto"/>
+        <w:ind w:firstLine="0"/>
+      </w:pPr>
+    </w:p>
+    <w:p>
+      <w:pPr>
+        <w:spacing w:line="240" w:lineRule="auto"/>
+        <w:ind w:firstLine="0"/>
+      </w:pPr>
+      <w:r>
+        <w:rPr>
+          <w:rFonts w:ascii="DejaVu Sans" w:eastAsia="DejaVu Sans" w:hAnsi="DejaVu Sans" w:cs="DejaVu Sans"/>
+          <w:sz w:val="22"/>
+        </w:rPr>
+        <w:t>class Alphabet:</w:t>
+      </w:r>
+    </w:p>
+    <w:p>
+      <w:pPr>
+        <w:spacing w:line="240" w:lineRule="auto"/>
+        <w:ind w:firstLine="0"/>
+      </w:pPr>
+      <w:r>
+        <w:rPr>
+          <w:rFonts w:ascii="DejaVu Sans" w:eastAsia="DejaVu Sans" w:hAnsi="DejaVu Sans" w:cs="DejaVu Sans"/>
+          <w:sz w:val="22"/>
+        </w:rPr>
+        <w:t xml:space="preserve">    def __init__(</w:t>
+      </w:r>
+    </w:p>
+    <w:p>
+      <w:pPr>
+        <w:spacing w:line="240" w:lineRule="auto"/>
+        <w:ind w:firstLine="0"/>
+      </w:pPr>
+      <w:r>
+        <w:rPr>
+          <w:rFonts w:ascii="DejaVu Sans" w:eastAsia="DejaVu Sans" w:hAnsi="DejaVu Sans" w:cs="DejaVu Sans"/>
+          <w:sz w:val="22"/>
+        </w:rPr>
+        <w:t xml:space="preserve">        self,</w:t>
+      </w:r>
+    </w:p>
+    <w:p>
+      <w:pPr>
+        <w:spacing w:line="240" w:lineRule="auto"/>
+        <w:ind w:firstLine="0"/>
+      </w:pPr>
+      <w:r>
+        <w:rPr>
+          <w:rFonts w:ascii="DejaVu Sans" w:eastAsia="DejaVu Sans" w:hAnsi="DejaVu Sans" w:cs="DejaVu Sans"/>
+          <w:sz w:val="22"/>
+        </w:rPr>
+        <w:t xml:space="preserve">        name: str,</w:t>
+      </w:r>
+    </w:p>
+    <w:p>
+      <w:pPr>
+        <w:spacing w:line="240" w:lineRule="auto"/>
+        <w:ind w:firstLine="0"/>
+      </w:pPr>
+      <w:r>
+        <w:rPr>
+          <w:rFonts w:ascii="DejaVu Sans" w:eastAsia="DejaVu Sans" w:hAnsi="DejaVu Sans" w:cs="DejaVu Sans"/>
+          <w:sz w:val="22"/>
+        </w:rPr>
+        <w:t xml:space="preserve">        symbols: str,</w:t>
+      </w:r>
+    </w:p>
+    <w:p>
+      <w:pPr>
+        <w:spacing w:line="240" w:lineRule="auto"/>
+        <w:ind w:firstLine="0"/>
+      </w:pPr>
+      <w:r>
+        <w:rPr>
+          <w:rFonts w:ascii="DejaVu Sans" w:eastAsia="DejaVu Sans" w:hAnsi="DejaVu Sans" w:cs="DejaVu Sans"/>
+          <w:sz w:val="22"/>
+        </w:rPr>
+        <w:t xml:space="preserve">        normalize_map: Optional[Dict[str, str]] = None,</w:t>
+      </w:r>
+    </w:p>
+    <w:p>
+      <w:pPr>
+        <w:spacing w:line="240" w:lineRule="auto"/>
+        <w:ind w:firstLine="0"/>
+      </w:pPr>
+      <w:r>
+        <w:rPr>
+          <w:rFonts w:ascii="DejaVu Sans" w:eastAsia="DejaVu Sans" w:hAnsi="DejaVu Sans" w:cs="DejaVu Sans"/>
+          <w:sz w:val="22"/>
+        </w:rPr>
+        <w:t xml:space="preserve">        case_sensitive: bool = False</w:t>
+      </w:r>
+    </w:p>
+    <w:p>
+      <w:pPr>
+        <w:spacing w:line="240" w:lineRule="auto"/>
+        <w:ind w:firstLine="0"/>
+      </w:pPr>
+      <w:r>
+        <w:rPr>
+          <w:rFonts w:ascii="DejaVu Sans" w:eastAsia="DejaVu Sans" w:hAnsi="DejaVu Sans" w:cs="DejaVu Sans"/>
+          <w:sz w:val="22"/>
+        </w:rPr>
+        <w:t xml:space="preserve">    ):</w:t>
+      </w:r>
+    </w:p>
+    <w:p>
+      <w:pPr>
+        <w:spacing w:line="240" w:lineRule="auto"/>
+        <w:ind w:firstLine="0"/>
+      </w:pPr>
+      <w:r>
+        <w:rPr>
+          <w:rFonts w:ascii="DejaVu Sans" w:eastAsia="DejaVu Sans" w:hAnsi="DejaVu Sans" w:cs="DejaVu Sans"/>
+          <w:sz w:val="22"/>
+        </w:rPr>
+        <w:t xml:space="preserve">        self.name = name</w:t>
+      </w:r>
+    </w:p>
+    <w:p>
+      <w:pPr>
+        <w:spacing w:line="240" w:lineRule="auto"/>
+        <w:ind w:firstLine="0"/>
+      </w:pPr>
+      <w:r>
+        <w:rPr>
+          <w:rFonts w:ascii="DejaVu Sans" w:eastAsia="DejaVu Sans" w:hAnsi="DejaVu Sans" w:cs="DejaVu Sans"/>
+          <w:sz w:val="22"/>
+        </w:rPr>
+        <w:t xml:space="preserve">        self.symbols = symbols</w:t>
+      </w:r>
+    </w:p>
+    <w:p>
+      <w:pPr>
+        <w:spacing w:line="240" w:lineRule="auto"/>
+        <w:ind w:firstLine="0"/>
+      </w:pPr>
+      <w:r>
+        <w:rPr>
+          <w:rFonts w:ascii="DejaVu Sans" w:eastAsia="DejaVu Sans" w:hAnsi="DejaVu Sans" w:cs="DejaVu Sans"/>
+          <w:sz w:val="22"/>
+        </w:rPr>
+        <w:t xml:space="preserve">        self.power = len(symbols)</w:t>
+      </w:r>
+    </w:p>
+    <w:p>
+      <w:pPr>
+        <w:spacing w:line="240" w:lineRule="auto"/>
+        <w:ind w:firstLine="0"/>
+      </w:pPr>
+      <w:r>
+        <w:rPr>
+          <w:rFonts w:ascii="DejaVu Sans" w:eastAsia="DejaVu Sans" w:hAnsi="DejaVu Sans" w:cs="DejaVu Sans"/>
+          <w:sz w:val="22"/>
+        </w:rPr>
+        <w:t xml:space="preserve">        self.normalize_map = normalize_map or {}</w:t>
+      </w:r>
+    </w:p>
+    <w:p>
+      <w:pPr>
+        <w:spacing w:line="240" w:lineRule="auto"/>
+        <w:ind w:firstLine="0"/>
+      </w:pPr>
+      <w:r>
+        <w:rPr>
+          <w:rFonts w:ascii="DejaVu Sans" w:eastAsia="DejaVu Sans" w:hAnsi="DejaVu Sans" w:cs="DejaVu Sans"/>
+          <w:sz w:val="22"/>
+        </w:rPr>
+        <w:t xml:space="preserve">        self.case_sensitive = case_sensitive</w:t>
+      </w:r>
+    </w:p>
+    <w:p>
+      <w:pPr>
+        <w:spacing w:line="240" w:lineRule="auto"/>
+        <w:ind w:firstLine="0"/>
+      </w:pPr>
+      <w:r>
+        <w:rPr>
+          <w:rFonts w:ascii="DejaVu Sans" w:eastAsia="DejaVu Sans" w:hAnsi="DejaVu Sans" w:cs="DejaVu Sans"/>
+          <w:sz w:val="22"/>
+        </w:rPr>
+        <w:t xml:space="preserve">        self.char_to_code: Dict[str, int] = {char: idx for idx, char in enumerate(symbols)}</w:t>
+      </w:r>
+    </w:p>
+    <w:p>
+      <w:pPr>
+        <w:spacing w:line="240" w:lineRule="auto"/>
+        <w:ind w:firstLine="0"/>
+      </w:pPr>
+      <w:r>
+        <w:rPr>
+          <w:rFonts w:ascii="DejaVu Sans" w:eastAsia="DejaVu Sans" w:hAnsi="DejaVu Sans" w:cs="DejaVu Sans"/>
+          <w:sz w:val="22"/>
+        </w:rPr>
+        <w:t xml:space="preserve">        self.code_to_char: Dict[int, str] = {idx: char for idx, char in enumerate(symbols)}</w:t>
+      </w:r>
+    </w:p>
+    <w:p>
+      <w:pPr>
+        <w:spacing w:line="240" w:lineRule="auto"/>
+        <w:ind w:firstLine="0"/>
+      </w:pPr>
+    </w:p>
+    <w:p>
+      <w:pPr>
+        <w:spacing w:line="240" w:lineRule="auto"/>
+        <w:ind w:firstLine="0"/>
+      </w:pPr>
+      <w:r>
+        <w:rPr>
+          <w:rFonts w:ascii="DejaVu Sans" w:eastAsia="DejaVu Sans" w:hAnsi="DejaVu Sans" w:cs="DejaVu Sans"/>
+          <w:sz w:val="22"/>
+        </w:rPr>
+        <w:t xml:space="preserve">    def normalize_char(self, char: str) -&gt; str:</w:t>
+      </w:r>
+    </w:p>
+    <w:p>
+      <w:pPr>
+        <w:spacing w:line="240" w:lineRule="auto"/>
+        <w:ind w:firstLine="0"/>
+      </w:pPr>
+      <w:r>
+        <w:rPr>
+          <w:rFonts w:ascii="DejaVu Sans" w:eastAsia="DejaVu Sans" w:hAnsi="DejaVu Sans" w:cs="DejaVu Sans"/>
+          <w:sz w:val="22"/>
+        </w:rPr>
+        <w:t xml:space="preserve">        c = char if self.case_sensitive else char.lower()</w:t>
+      </w:r>
+    </w:p>
+    <w:p>
+      <w:pPr>
+        <w:spacing w:line="240" w:lineRule="auto"/>
+        <w:ind w:firstLine="0"/>
+      </w:pPr>
+      <w:r>
+        <w:rPr>
+          <w:rFonts w:ascii="DejaVu Sans" w:eastAsia="DejaVu Sans" w:hAnsi="DejaVu Sans" w:cs="DejaVu Sans"/>
+          <w:sz w:val="22"/>
+        </w:rPr>
+        <w:t xml:space="preserve">        return self.normalize_map.get(c, c)</w:t>
+      </w:r>
+    </w:p>
+    <w:p>
+      <w:pPr>
+        <w:spacing w:line="240" w:lineRule="auto"/>
+        <w:ind w:firstLine="0"/>
+      </w:pPr>
+    </w:p>
+    <w:p>
+      <w:pPr>
+        <w:spacing w:line="240" w:lineRule="auto"/>
+        <w:ind w:firstLine="0"/>
+      </w:pPr>
+      <w:r>
+        <w:rPr>
+          <w:rFonts w:ascii="DejaVu Sans" w:eastAsia="DejaVu Sans" w:hAnsi="DejaVu Sans" w:cs="DejaVu Sans"/>
+          <w:sz w:val="22"/>
+        </w:rPr>
+        <w:t xml:space="preserve">    def A(self, char: str) -&gt; int:</w:t>
+      </w:r>
+    </w:p>
+    <w:p>
+      <w:pPr>
+        <w:spacing w:line="240" w:lineRule="auto"/>
+        <w:ind w:firstLine="0"/>
+      </w:pPr>
+      <w:r>
+        <w:rPr>
+          <w:rFonts w:ascii="DejaVu Sans" w:eastAsia="DejaVu Sans" w:hAnsi="DejaVu Sans" w:cs="DejaVu Sans"/>
+          <w:sz w:val="22"/>
+        </w:rPr>
+        <w:t xml:space="preserve">        norm = self.normalize_char(char)</w:t>
+      </w:r>
+    </w:p>
+    <w:p>
+      <w:pPr>
+        <w:spacing w:line="240" w:lineRule="auto"/>
+        <w:ind w:firstLine="0"/>
+      </w:pPr>
+      <w:r>
+        <w:rPr>
+          <w:rFonts w:ascii="DejaVu Sans" w:eastAsia="DejaVu Sans" w:hAnsi="DejaVu Sans" w:cs="DejaVu Sans"/>
+          <w:sz w:val="22"/>
+        </w:rPr>
+        <w:t xml:space="preserve">        if norm in self.char_to_code:</w:t>
+      </w:r>
+    </w:p>
+    <w:p>
+      <w:pPr>
+        <w:spacing w:line="240" w:lineRule="auto"/>
+        <w:ind w:firstLine="0"/>
+      </w:pPr>
+      <w:r>
+        <w:rPr>
+          <w:rFonts w:ascii="DejaVu Sans" w:eastAsia="DejaVu Sans" w:hAnsi="DejaVu Sans" w:cs="DejaVu Sans"/>
+          <w:sz w:val="22"/>
+        </w:rPr>
+        <w:t xml:space="preserve">            return self.char_to_code[norm]</w:t>
+      </w:r>
+    </w:p>
+    <w:p>
+      <w:pPr>
+        <w:spacing w:line="240" w:lineRule="auto"/>
+        <w:ind w:firstLine="0"/>
+      </w:pPr>
+      <w:r>
+        <w:rPr>
+          <w:rFonts w:ascii="DejaVu Sans" w:eastAsia="DejaVu Sans" w:hAnsi="DejaVu Sans" w:cs="DejaVu Sans"/>
+          <w:sz w:val="22"/>
+        </w:rPr>
+        <w:t xml:space="preserve">        raise ValueError(f"Символ '{char}' не входит в алфавит '{self.name}' (m = {self.power})")</w:t>
+      </w:r>
+    </w:p>
+    <w:p>
+      <w:pPr>
+        <w:spacing w:line="240" w:lineRule="auto"/>
+        <w:ind w:firstLine="0"/>
+      </w:pPr>
+    </w:p>
+    <w:p>
+      <w:pPr>
+        <w:spacing w:line="240" w:lineRule="auto"/>
+        <w:ind w:firstLine="0"/>
+      </w:pPr>
+      <w:r>
+        <w:rPr>
+          <w:rFonts w:ascii="DejaVu Sans" w:eastAsia="DejaVu Sans" w:hAnsi="DejaVu Sans" w:cs="DejaVu Sans"/>
+          <w:sz w:val="22"/>
+        </w:rPr>
+        <w:t xml:space="preserve">    def A_inv(self, code: int) -&gt; str:</w:t>
+      </w:r>
+    </w:p>
+    <w:p>
+      <w:pPr>
+        <w:spacing w:line="240" w:lineRule="auto"/>
+        <w:ind w:firstLine="0"/>
+      </w:pPr>
+      <w:r>
+        <w:rPr>
+          <w:rFonts w:ascii="DejaVu Sans" w:eastAsia="DejaVu Sans" w:hAnsi="DejaVu Sans" w:cs="DejaVu Sans"/>
+          <w:sz w:val="22"/>
+        </w:rPr>
+        <w:t xml:space="preserve">        return self.code_to_char[code % self.power]</w:t>
+      </w:r>
+    </w:p>
+    <w:p>
+      <w:pPr>
+        <w:spacing w:line="240" w:lineRule="auto"/>
+        <w:ind w:firstLine="0"/>
+      </w:pPr>
+    </w:p>
+    <w:p>
+      <w:pPr>
+        <w:spacing w:line="240" w:lineRule="auto"/>
+        <w:ind w:firstLine="0"/>
+      </w:pPr>
+      <w:r>
+        <w:rPr>
+          <w:rFonts w:ascii="DejaVu Sans" w:eastAsia="DejaVu Sans" w:hAnsi="DejaVu Sans" w:cs="DejaVu Sans"/>
+          <w:sz w:val="22"/>
+        </w:rPr>
+        <w:t xml:space="preserve">    def E_k(self, x: int, k: int) -&gt; int:</w:t>
+      </w:r>
+    </w:p>
+    <w:p>
+      <w:pPr>
+        <w:spacing w:line="240" w:lineRule="auto"/>
+        <w:ind w:firstLine="0"/>
+      </w:pPr>
+      <w:r>
+        <w:rPr>
+          <w:rFonts w:ascii="DejaVu Sans" w:eastAsia="DejaVu Sans" w:hAnsi="DejaVu Sans" w:cs="DejaVu Sans"/>
+          <w:sz w:val="22"/>
+        </w:rPr>
+        <w:t xml:space="preserve">        return (x + k) % self.power</w:t>
+      </w:r>
+    </w:p>
+    <w:p>
+      <w:pPr>
+        <w:spacing w:line="240" w:lineRule="auto"/>
+        <w:ind w:firstLine="0"/>
+      </w:pPr>
+    </w:p>
+    <w:p>
+      <w:pPr>
+        <w:spacing w:line="240" w:lineRule="auto"/>
+        <w:ind w:firstLine="0"/>
+      </w:pPr>
+      <w:r>
+        <w:rPr>
+          <w:rFonts w:ascii="DejaVu Sans" w:eastAsia="DejaVu Sans" w:hAnsi="DejaVu Sans" w:cs="DejaVu Sans"/>
+          <w:sz w:val="22"/>
+        </w:rPr>
+        <w:t xml:space="preserve">    def D_k(self, y: int, k: int) -&gt; int:</w:t>
+      </w:r>
+    </w:p>
+    <w:p>
+      <w:pPr>
+        <w:spacing w:line="240" w:lineRule="auto"/>
+        <w:ind w:firstLine="0"/>
+      </w:pPr>
+      <w:r>
+        <w:rPr>
+          <w:rFonts w:ascii="DejaVu Sans" w:eastAsia="DejaVu Sans" w:hAnsi="DejaVu Sans" w:cs="DejaVu Sans"/>
+          <w:sz w:val="22"/>
+        </w:rPr>
+        <w:t xml:space="preserve">        return self.E_k(y, -k)</w:t>
+      </w:r>
+    </w:p>
+    <w:p>
+      <w:pPr>
+        <w:spacing w:line="240" w:lineRule="auto"/>
+        <w:ind w:firstLine="0"/>
+      </w:pPr>
+    </w:p>
+    <w:p>
+      <w:pPr>
+        <w:spacing w:line="240" w:lineRule="auto"/>
+        <w:ind w:firstLine="0"/>
+      </w:pPr>
+      <w:r>
+        <w:rPr>
+          <w:rFonts w:ascii="DejaVu Sans" w:eastAsia="DejaVu Sans" w:hAnsi="DejaVu Sans" w:cs="DejaVu Sans"/>
+          <w:sz w:val="22"/>
+        </w:rPr>
+        <w:t xml:space="preserve">    def encrypt_symbol(</w:t>
+      </w:r>
+    </w:p>
+    <w:p>
+      <w:pPr>
+        <w:spacing w:line="240" w:lineRule="auto"/>
+        <w:ind w:firstLine="0"/>
+      </w:pPr>
+      <w:r>
+        <w:rPr>
+          <w:rFonts w:ascii="DejaVu Sans" w:eastAsia="DejaVu Sans" w:hAnsi="DejaVu Sans" w:cs="DejaVu Sans"/>
+          <w:sz w:val="22"/>
+        </w:rPr>
+        <w:t xml:space="preserve">        self,</w:t>
+      </w:r>
+    </w:p>
+    <w:p>
+      <w:pPr>
+        <w:spacing w:line="240" w:lineRule="auto"/>
+        <w:ind w:firstLine="0"/>
+      </w:pPr>
+      <w:r>
+        <w:rPr>
+          <w:rFonts w:ascii="DejaVu Sans" w:eastAsia="DejaVu Sans" w:hAnsi="DejaVu Sans" w:cs="DejaVu Sans"/>
+          <w:sz w:val="22"/>
+        </w:rPr>
+        <w:t xml:space="preserve">        char: str,</w:t>
+      </w:r>
+    </w:p>
+    <w:p>
+      <w:pPr>
+        <w:spacing w:line="240" w:lineRule="auto"/>
+        <w:ind w:firstLine="0"/>
+      </w:pPr>
+      <w:r>
+        <w:rPr>
+          <w:rFonts w:ascii="DejaVu Sans" w:eastAsia="DejaVu Sans" w:hAnsi="DejaVu Sans" w:cs="DejaVu Sans"/>
+          <w:sz w:val="22"/>
+        </w:rPr>
+        <w:t xml:space="preserve">        k: int,</w:t>
+      </w:r>
+    </w:p>
+    <w:p>
+      <w:pPr>
+        <w:spacing w:line="240" w:lineRule="auto"/>
+        <w:ind w:firstLine="0"/>
+      </w:pPr>
+      <w:r>
+        <w:rPr>
+          <w:rFonts w:ascii="DejaVu Sans" w:eastAsia="DejaVu Sans" w:hAnsi="DejaVu Sans" w:cs="DejaVu Sans"/>
+          <w:sz w:val="22"/>
+        </w:rPr>
+        <w:t xml:space="preserve">        case_mode: str = "lower",</w:t>
+      </w:r>
+    </w:p>
+    <w:p>
+      <w:pPr>
+        <w:spacing w:line="240" w:lineRule="auto"/>
+        <w:ind w:firstLine="0"/>
+      </w:pPr>
+      <w:r>
+        <w:rPr>
+          <w:rFonts w:ascii="DejaVu Sans" w:eastAsia="DejaVu Sans" w:hAnsi="DejaVu Sans" w:cs="DejaVu Sans"/>
+          <w:sz w:val="22"/>
+        </w:rPr>
+        <w:t xml:space="preserve">        preserve_case: Optional[bool] = None</w:t>
+      </w:r>
+    </w:p>
+    <w:p>
+      <w:pPr>
+        <w:spacing w:line="240" w:lineRule="auto"/>
+        <w:ind w:firstLine="0"/>
+      </w:pPr>
+      <w:r>
+        <w:rPr>
+          <w:rFonts w:ascii="DejaVu Sans" w:eastAsia="DejaVu Sans" w:hAnsi="DejaVu Sans" w:cs="DejaVu Sans"/>
+          <w:sz w:val="22"/>
+        </w:rPr>
+        <w:t xml:space="preserve">    ) -&gt; str:</w:t>
+      </w:r>
+    </w:p>
+    <w:p>
+      <w:pPr>
+        <w:spacing w:line="240" w:lineRule="auto"/>
+        <w:ind w:firstLine="0"/>
+      </w:pPr>
+      <w:r>
+        <w:rPr>
+          <w:rFonts w:ascii="DejaVu Sans" w:eastAsia="DejaVu Sans" w:hAnsi="DejaVu Sans" w:cs="DejaVu Sans"/>
+          <w:sz w:val="22"/>
+        </w:rPr>
+        <w:t xml:space="preserve">        if preserve_case is not None:</w:t>
+      </w:r>
+    </w:p>
+    <w:p>
+      <w:pPr>
+        <w:spacing w:line="240" w:lineRule="auto"/>
+        <w:ind w:firstLine="0"/>
+      </w:pPr>
+      <w:r>
+        <w:rPr>
+          <w:rFonts w:ascii="DejaVu Sans" w:eastAsia="DejaVu Sans" w:hAnsi="DejaVu Sans" w:cs="DejaVu Sans"/>
+          <w:sz w:val="22"/>
+        </w:rPr>
+        <w:lastRenderedPageBreak/>
+        <w:t xml:space="preserve">            case_mode = "preserve" if preserve_case else "lower"</w:t>
+      </w:r>
+    </w:p>
+    <w:p>
+      <w:pPr>
+        <w:spacing w:line="240" w:lineRule="auto"/>
+        <w:ind w:firstLine="0"/>
+      </w:pPr>
+      <w:r>
+        <w:rPr>
+          <w:rFonts w:ascii="DejaVu Sans" w:eastAsia="DejaVu Sans" w:hAnsi="DejaVu Sans" w:cs="DejaVu Sans"/>
+          <w:sz w:val="22"/>
+        </w:rPr>
+        <w:t xml:space="preserve">        norm = self.normalize_char(char)</w:t>
+      </w:r>
+    </w:p>
+    <w:p>
+      <w:pPr>
+        <w:spacing w:line="240" w:lineRule="auto"/>
+        <w:ind w:firstLine="0"/>
+      </w:pPr>
+      <w:r>
+        <w:rPr>
+          <w:rFonts w:ascii="DejaVu Sans" w:eastAsia="DejaVu Sans" w:hAnsi="DejaVu Sans" w:cs="DejaVu Sans"/>
+          <w:sz w:val="22"/>
+        </w:rPr>
+        <w:t xml:space="preserve">        if norm in self.char_to_code:</w:t>
+      </w:r>
+    </w:p>
+    <w:p>
+      <w:pPr>
+        <w:spacing w:line="240" w:lineRule="auto"/>
+        <w:ind w:firstLine="0"/>
+      </w:pPr>
+      <w:r>
+        <w:rPr>
+          <w:rFonts w:ascii="DejaVu Sans" w:eastAsia="DejaVu Sans" w:hAnsi="DejaVu Sans" w:cs="DejaVu Sans"/>
+          <w:sz w:val="22"/>
+        </w:rPr>
+        <w:t xml:space="preserve">            res_char = self.A_inv(self.E_k(self.char_to_code[norm], k))</w:t>
+      </w:r>
+    </w:p>
+    <w:p>
+      <w:pPr>
+        <w:spacing w:line="240" w:lineRule="auto"/>
+        <w:ind w:firstLine="0"/>
+      </w:pPr>
+      <w:r>
+        <w:rPr>
+          <w:rFonts w:ascii="DejaVu Sans" w:eastAsia="DejaVu Sans" w:hAnsi="DejaVu Sans" w:cs="DejaVu Sans"/>
+          <w:sz w:val="22"/>
+        </w:rPr>
+        <w:t xml:space="preserve">            if self.case_sensitive:</w:t>
+      </w:r>
+    </w:p>
+    <w:p>
+      <w:pPr>
+        <w:spacing w:line="240" w:lineRule="auto"/>
+        <w:ind w:firstLine="0"/>
+      </w:pPr>
+      <w:r>
+        <w:rPr>
+          <w:rFonts w:ascii="DejaVu Sans" w:eastAsia="DejaVu Sans" w:hAnsi="DejaVu Sans" w:cs="DejaVu Sans"/>
+          <w:sz w:val="22"/>
+        </w:rPr>
+        <w:t xml:space="preserve">                return res_char</w:t>
+      </w:r>
+    </w:p>
+    <w:p>
+      <w:pPr>
+        <w:spacing w:line="240" w:lineRule="auto"/>
+        <w:ind w:firstLine="0"/>
+      </w:pPr>
+      <w:r>
+        <w:rPr>
+          <w:rFonts w:ascii="DejaVu Sans" w:eastAsia="DejaVu Sans" w:hAnsi="DejaVu Sans" w:cs="DejaVu Sans"/>
+          <w:sz w:val="22"/>
+        </w:rPr>
+        <w:t xml:space="preserve">            if case_mode == "preserve":</w:t>
+      </w:r>
+    </w:p>
+    <w:p>
+      <w:pPr>
+        <w:spacing w:line="240" w:lineRule="auto"/>
+        <w:ind w:firstLine="0"/>
+      </w:pPr>
+      <w:r>
+        <w:rPr>
+          <w:rFonts w:ascii="DejaVu Sans" w:eastAsia="DejaVu Sans" w:hAnsi="DejaVu Sans" w:cs="DejaVu Sans"/>
+          <w:sz w:val="22"/>
+        </w:rPr>
+        <w:t xml:space="preserve">                return res_char.upper() if char.isupper() else res_char.lower()</w:t>
+      </w:r>
+    </w:p>
+    <w:p>
+      <w:pPr>
+        <w:spacing w:line="240" w:lineRule="auto"/>
+        <w:ind w:firstLine="0"/>
+      </w:pPr>
+      <w:r>
+        <w:rPr>
+          <w:rFonts w:ascii="DejaVu Sans" w:eastAsia="DejaVu Sans" w:hAnsi="DejaVu Sans" w:cs="DejaVu Sans"/>
+          <w:sz w:val="22"/>
+        </w:rPr>
+        <w:t xml:space="preserve">            elif case_mode == "upper":</w:t>
+      </w:r>
+    </w:p>
+    <w:p>
+      <w:pPr>
+        <w:spacing w:line="240" w:lineRule="auto"/>
+        <w:ind w:firstLine="0"/>
+      </w:pPr>
+      <w:r>
+        <w:rPr>
+          <w:rFonts w:ascii="DejaVu Sans" w:eastAsia="DejaVu Sans" w:hAnsi="DejaVu Sans" w:cs="DejaVu Sans"/>
+          <w:sz w:val="22"/>
+        </w:rPr>
+        <w:t xml:space="preserve">                return res_char.upper()</w:t>
+      </w:r>
+    </w:p>
+    <w:p>
+      <w:pPr>
+        <w:spacing w:line="240" w:lineRule="auto"/>
+        <w:ind w:firstLine="0"/>
+      </w:pPr>
+      <w:r>
+        <w:rPr>
+          <w:rFonts w:ascii="DejaVu Sans" w:eastAsia="DejaVu Sans" w:hAnsi="DejaVu Sans" w:cs="DejaVu Sans"/>
+          <w:sz w:val="22"/>
+        </w:rPr>
+        <w:t xml:space="preserve">            elif case_mode == "lower":</w:t>
+      </w:r>
+    </w:p>
+    <w:p>
+      <w:pPr>
+        <w:spacing w:line="240" w:lineRule="auto"/>
+        <w:ind w:firstLine="0"/>
+      </w:pPr>
+      <w:r>
+        <w:rPr>
+          <w:rFonts w:ascii="DejaVu Sans" w:eastAsia="DejaVu Sans" w:hAnsi="DejaVu Sans" w:cs="DejaVu Sans"/>
+          <w:sz w:val="22"/>
+        </w:rPr>
+        <w:t xml:space="preserve">                return res_char.lower()</w:t>
+      </w:r>
+    </w:p>
+    <w:p>
+      <w:pPr>
+        <w:spacing w:line="240" w:lineRule="auto"/>
+        <w:ind w:firstLine="0"/>
+      </w:pPr>
+      <w:r>
+        <w:rPr>
+          <w:rFonts w:ascii="DejaVu Sans" w:eastAsia="DejaVu Sans" w:hAnsi="DejaVu Sans" w:cs="DejaVu Sans"/>
+          <w:sz w:val="22"/>
+        </w:rPr>
+        <w:t xml:space="preserve">            return res_char</w:t>
+      </w:r>
+    </w:p>
+    <w:p>
+      <w:pPr>
+        <w:spacing w:line="240" w:lineRule="auto"/>
+        <w:ind w:firstLine="0"/>
+      </w:pPr>
+      <w:r>
+        <w:rPr>
+          <w:rFonts w:ascii="DejaVu Sans" w:eastAsia="DejaVu Sans" w:hAnsi="DejaVu Sans" w:cs="DejaVu Sans"/>
+          <w:sz w:val="22"/>
+        </w:rPr>
+        <w:t xml:space="preserve">        return char</w:t>
+      </w:r>
+    </w:p>
+    <w:p>
+      <w:pPr>
+        <w:spacing w:line="240" w:lineRule="auto"/>
+        <w:ind w:firstLine="0"/>
+      </w:pPr>
+    </w:p>
+    <w:p>
+      <w:pPr>
+        <w:spacing w:line="240" w:lineRule="auto"/>
+        <w:ind w:firstLine="0"/>
+      </w:pPr>
+      <w:r>
+        <w:rPr>
+          <w:rFonts w:ascii="DejaVu Sans" w:eastAsia="DejaVu Sans" w:hAnsi="DejaVu Sans" w:cs="DejaVu Sans"/>
+          <w:sz w:val="22"/>
+        </w:rPr>
+        <w:t xml:space="preserve">    def decrypt_symbol(</w:t>
+      </w:r>
+    </w:p>
+    <w:p>
+      <w:pPr>
+        <w:spacing w:line="240" w:lineRule="auto"/>
+        <w:ind w:firstLine="0"/>
+      </w:pPr>
+      <w:r>
+        <w:rPr>
+          <w:rFonts w:ascii="DejaVu Sans" w:eastAsia="DejaVu Sans" w:hAnsi="DejaVu Sans" w:cs="DejaVu Sans"/>
+          <w:sz w:val="22"/>
+        </w:rPr>
+        <w:t xml:space="preserve">        self,</w:t>
+      </w:r>
+    </w:p>
+    <w:p>
+      <w:pPr>
+        <w:spacing w:line="240" w:lineRule="auto"/>
+        <w:ind w:firstLine="0"/>
+      </w:pPr>
+      <w:r>
+        <w:rPr>
+          <w:rFonts w:ascii="DejaVu Sans" w:eastAsia="DejaVu Sans" w:hAnsi="DejaVu Sans" w:cs="DejaVu Sans"/>
+          <w:sz w:val="22"/>
+        </w:rPr>
+        <w:t xml:space="preserve">        char: str,</w:t>
+      </w:r>
+    </w:p>
+    <w:p>
+      <w:pPr>
+        <w:spacing w:line="240" w:lineRule="auto"/>
+        <w:ind w:firstLine="0"/>
+      </w:pPr>
+      <w:r>
+        <w:rPr>
+          <w:rFonts w:ascii="DejaVu Sans" w:eastAsia="DejaVu Sans" w:hAnsi="DejaVu Sans" w:cs="DejaVu Sans"/>
+          <w:sz w:val="22"/>
+        </w:rPr>
+        <w:t xml:space="preserve">        k: int,</w:t>
+      </w:r>
+    </w:p>
+    <w:p>
+      <w:pPr>
+        <w:spacing w:line="240" w:lineRule="auto"/>
+        <w:ind w:firstLine="0"/>
+      </w:pPr>
+      <w:r>
+        <w:rPr>
+          <w:rFonts w:ascii="DejaVu Sans" w:eastAsia="DejaVu Sans" w:hAnsi="DejaVu Sans" w:cs="DejaVu Sans"/>
+          <w:sz w:val="22"/>
+        </w:rPr>
+        <w:t xml:space="preserve">        case_mode: str = "lower",</w:t>
+      </w:r>
+    </w:p>
+    <w:p>
+      <w:pPr>
+        <w:spacing w:line="240" w:lineRule="auto"/>
+        <w:ind w:firstLine="0"/>
+      </w:pPr>
+      <w:r>
+        <w:rPr>
+          <w:rFonts w:ascii="DejaVu Sans" w:eastAsia="DejaVu Sans" w:hAnsi="DejaVu Sans" w:cs="DejaVu Sans"/>
+          <w:sz w:val="22"/>
+        </w:rPr>
+        <w:t xml:space="preserve">        preserve_case: Optional[bool] = None</w:t>
+      </w:r>
+    </w:p>
+    <w:p>
+      <w:pPr>
+        <w:spacing w:line="240" w:lineRule="auto"/>
+        <w:ind w:firstLine="0"/>
+      </w:pPr>
+      <w:r>
+        <w:rPr>
+          <w:rFonts w:ascii="DejaVu Sans" w:eastAsia="DejaVu Sans" w:hAnsi="DejaVu Sans" w:cs="DejaVu Sans"/>
+          <w:sz w:val="22"/>
+        </w:rPr>
+        <w:t xml:space="preserve">    ) -&gt; str:</w:t>
+      </w:r>
+    </w:p>
+    <w:p>
+      <w:pPr>
+        <w:spacing w:line="240" w:lineRule="auto"/>
+        <w:ind w:firstLine="0"/>
+      </w:pPr>
+      <w:r>
+        <w:rPr>
+          <w:rFonts w:ascii="DejaVu Sans" w:eastAsia="DejaVu Sans" w:hAnsi="DejaVu Sans" w:cs="DejaVu Sans"/>
+          <w:sz w:val="22"/>
+        </w:rPr>
+        <w:t xml:space="preserve">        return self.encrypt_symbol(char, -k, case_mode=case_mode, preserve_case=preserve_case)</w:t>
+      </w:r>
+    </w:p>
+    <w:p>
+      <w:pPr>
+        <w:spacing w:line="240" w:lineRule="auto"/>
+        <w:ind w:firstLine="0"/>
+      </w:pPr>
+    </w:p>
+    <w:p>
+      <w:pPr>
+        <w:spacing w:line="240" w:lineRule="auto"/>
+        <w:ind w:firstLine="0"/>
+      </w:pPr>
+      <w:r>
+        <w:rPr>
+          <w:rFonts w:ascii="DejaVu Sans" w:eastAsia="DejaVu Sans" w:hAnsi="DejaVu Sans" w:cs="DejaVu Sans"/>
+          <w:sz w:val="22"/>
+        </w:rPr>
+        <w:t xml:space="preserve">    def prepare_canonical_text(self, text: str) -&gt; str:</w:t>
+      </w:r>
+    </w:p>
+    <w:p>
+      <w:pPr>
+        <w:spacing w:line="240" w:lineRule="auto"/>
+        <w:ind w:firstLine="0"/>
+      </w:pPr>
+      <w:r>
+        <w:rPr>
+          <w:rFonts w:ascii="DejaVu Sans" w:eastAsia="DejaVu Sans" w:hAnsi="DejaVu Sans" w:cs="DejaVu Sans"/>
+          <w:sz w:val="22"/>
+        </w:rPr>
+        <w:t xml:space="preserve">        return "".join(self.normalize_char(c) for c in text if self.normalize_char(c) in self.char_to_code)</w:t>
+      </w:r>
+    </w:p>
+    <w:p>
+      <w:pPr>
+        <w:spacing w:line="240" w:lineRule="auto"/>
+        <w:ind w:firstLine="0"/>
+      </w:pPr>
+    </w:p>
+    <w:p>
+      <w:pPr>
+        <w:spacing w:line="240" w:lineRule="auto"/>
+        <w:ind w:firstLine="0"/>
+      </w:pPr>
+      <w:r>
+        <w:rPr>
+          <w:rFonts w:ascii="DejaVu Sans" w:eastAsia="DejaVu Sans" w:hAnsi="DejaVu Sans" w:cs="DejaVu Sans"/>
+          <w:sz w:val="22"/>
+        </w:rPr>
+        <w:t xml:space="preserve">    def encrypt(</w:t>
+      </w:r>
+    </w:p>
+    <w:p>
+      <w:pPr>
+        <w:spacing w:line="240" w:lineRule="auto"/>
+        <w:ind w:firstLine="0"/>
+      </w:pPr>
+      <w:r>
+        <w:rPr>
+          <w:rFonts w:ascii="DejaVu Sans" w:eastAsia="DejaVu Sans" w:hAnsi="DejaVu Sans" w:cs="DejaVu Sans"/>
+          <w:sz w:val="22"/>
+        </w:rPr>
+        <w:t xml:space="preserve">        self,</w:t>
+      </w:r>
+    </w:p>
+    <w:p>
+      <w:pPr>
+        <w:spacing w:line="240" w:lineRule="auto"/>
+        <w:ind w:firstLine="0"/>
+      </w:pPr>
+      <w:r>
+        <w:rPr>
+          <w:rFonts w:ascii="DejaVu Sans" w:eastAsia="DejaVu Sans" w:hAnsi="DejaVu Sans" w:cs="DejaVu Sans"/>
+          <w:sz w:val="22"/>
+        </w:rPr>
+        <w:t xml:space="preserve">        text: str,</w:t>
+      </w:r>
+    </w:p>
+    <w:p>
+      <w:pPr>
+        <w:spacing w:line="240" w:lineRule="auto"/>
+        <w:ind w:firstLine="0"/>
+      </w:pPr>
+      <w:r>
+        <w:rPr>
+          <w:rFonts w:ascii="DejaVu Sans" w:eastAsia="DejaVu Sans" w:hAnsi="DejaVu Sans" w:cs="DejaVu Sans"/>
+          <w:sz w:val="22"/>
+        </w:rPr>
+        <w:t xml:space="preserve">        k: int,</w:t>
+      </w:r>
+    </w:p>
+    <w:p>
+      <w:pPr>
+        <w:spacing w:line="240" w:lineRule="auto"/>
+        <w:ind w:firstLine="0"/>
+      </w:pPr>
+      <w:r>
+        <w:rPr>
+          <w:rFonts w:ascii="DejaVu Sans" w:eastAsia="DejaVu Sans" w:hAnsi="DejaVu Sans" w:cs="DejaVu Sans"/>
+          <w:sz w:val="22"/>
+        </w:rPr>
+        <w:t xml:space="preserve">        filter_non_alpha: bool = False,</w:t>
+      </w:r>
+    </w:p>
+    <w:p>
+      <w:pPr>
+        <w:spacing w:line="240" w:lineRule="auto"/>
+        <w:ind w:firstLine="0"/>
+      </w:pPr>
+      <w:r>
+        <w:rPr>
+          <w:rFonts w:ascii="DejaVu Sans" w:eastAsia="DejaVu Sans" w:hAnsi="DejaVu Sans" w:cs="DejaVu Sans"/>
+          <w:sz w:val="22"/>
+        </w:rPr>
+        <w:t xml:space="preserve">        case_mode: str = "lower",</w:t>
+      </w:r>
+    </w:p>
+    <w:p>
+      <w:pPr>
+        <w:spacing w:line="240" w:lineRule="auto"/>
+        <w:ind w:firstLine="0"/>
+      </w:pPr>
+      <w:r>
+        <w:rPr>
+          <w:rFonts w:ascii="DejaVu Sans" w:eastAsia="DejaVu Sans" w:hAnsi="DejaVu Sans" w:cs="DejaVu Sans"/>
+          <w:sz w:val="22"/>
+        </w:rPr>
+        <w:t xml:space="preserve">        preserve_case: Optional[bool] = None</w:t>
+      </w:r>
+    </w:p>
+    <w:p>
+      <w:pPr>
+        <w:spacing w:line="240" w:lineRule="auto"/>
+        <w:ind w:firstLine="0"/>
+      </w:pPr>
+      <w:r>
+        <w:rPr>
+          <w:rFonts w:ascii="DejaVu Sans" w:eastAsia="DejaVu Sans" w:hAnsi="DejaVu Sans" w:cs="DejaVu Sans"/>
+          <w:sz w:val="22"/>
+        </w:rPr>
+        <w:t xml:space="preserve">    ) -&gt; str:</w:t>
+      </w:r>
+    </w:p>
+    <w:p>
+      <w:pPr>
+        <w:spacing w:line="240" w:lineRule="auto"/>
+        <w:ind w:firstLine="0"/>
+      </w:pPr>
+      <w:r>
+        <w:rPr>
+          <w:rFonts w:ascii="DejaVu Sans" w:eastAsia="DejaVu Sans" w:hAnsi="DejaVu Sans" w:cs="DejaVu Sans"/>
+          <w:sz w:val="22"/>
+        </w:rPr>
+        <w:t xml:space="preserve">        if preserve_case is not None:</w:t>
+      </w:r>
+    </w:p>
+    <w:p>
+      <w:pPr>
+        <w:spacing w:line="240" w:lineRule="auto"/>
+        <w:ind w:firstLine="0"/>
+      </w:pPr>
+      <w:r>
+        <w:rPr>
+          <w:rFonts w:ascii="DejaVu Sans" w:eastAsia="DejaVu Sans" w:hAnsi="DejaVu Sans" w:cs="DejaVu Sans"/>
+          <w:sz w:val="22"/>
+        </w:rPr>
+        <w:t xml:space="preserve">            case_mode = "preserve" if preserve_case else "lower"</w:t>
+      </w:r>
+    </w:p>
+    <w:p>
+      <w:pPr>
+        <w:spacing w:line="240" w:lineRule="auto"/>
+        <w:ind w:firstLine="0"/>
+      </w:pPr>
+      <w:r>
+        <w:rPr>
+          <w:rFonts w:ascii="DejaVu Sans" w:eastAsia="DejaVu Sans" w:hAnsi="DejaVu Sans" w:cs="DejaVu Sans"/>
+          <w:sz w:val="22"/>
+        </w:rPr>
+        <w:t xml:space="preserve">        if filter_non_alpha:</w:t>
+      </w:r>
+    </w:p>
+    <w:p>
+      <w:pPr>
+        <w:spacing w:line="240" w:lineRule="auto"/>
+        <w:ind w:firstLine="0"/>
+      </w:pPr>
+      <w:r>
+        <w:rPr>
+          <w:rFonts w:ascii="DejaVu Sans" w:eastAsia="DejaVu Sans" w:hAnsi="DejaVu Sans" w:cs="DejaVu Sans"/>
+          <w:sz w:val="22"/>
+        </w:rPr>
+        <w:t xml:space="preserve">            src = self.prepare_canonical_text(text)</w:t>
+      </w:r>
+    </w:p>
+    <w:p>
+      <w:pPr>
+        <w:spacing w:line="240" w:lineRule="auto"/>
+        <w:ind w:firstLine="0"/>
+      </w:pPr>
+      <w:r>
+        <w:rPr>
+          <w:rFonts w:ascii="DejaVu Sans" w:eastAsia="DejaVu Sans" w:hAnsi="DejaVu Sans" w:cs="DejaVu Sans"/>
+          <w:sz w:val="22"/>
+        </w:rPr>
+        <w:t xml:space="preserve">            return "".join(self.encrypt_symbol(c, k, case_mode="lower") for c in src)</w:t>
+      </w:r>
+    </w:p>
+    <w:p>
+      <w:pPr>
+        <w:spacing w:line="240" w:lineRule="auto"/>
+        <w:ind w:firstLine="0"/>
+      </w:pPr>
+      <w:r>
+        <w:rPr>
+          <w:rFonts w:ascii="DejaVu Sans" w:eastAsia="DejaVu Sans" w:hAnsi="DejaVu Sans" w:cs="DejaVu Sans"/>
+          <w:sz w:val="22"/>
+        </w:rPr>
+        <w:t xml:space="preserve">        return "".join(self.encrypt_symbol(c, k, case_mode=case_mode) for c in text)</w:t>
+      </w:r>
+    </w:p>
+    <w:p>
+      <w:pPr>
+        <w:spacing w:line="240" w:lineRule="auto"/>
+        <w:ind w:firstLine="0"/>
+      </w:pPr>
+    </w:p>
+    <w:p>
+      <w:pPr>
+        <w:spacing w:line="240" w:lineRule="auto"/>
+        <w:ind w:firstLine="0"/>
+      </w:pPr>
+      <w:r>
+        <w:rPr>
+          <w:rFonts w:ascii="DejaVu Sans" w:eastAsia="DejaVu Sans" w:hAnsi="DejaVu Sans" w:cs="DejaVu Sans"/>
+          <w:sz w:val="22"/>
+        </w:rPr>
+        <w:t xml:space="preserve">    def decrypt(</w:t>
+      </w:r>
+    </w:p>
+    <w:p>
+      <w:pPr>
+        <w:spacing w:line="240" w:lineRule="auto"/>
+        <w:ind w:firstLine="0"/>
+      </w:pPr>
+      <w:r>
+        <w:rPr>
+          <w:rFonts w:ascii="DejaVu Sans" w:eastAsia="DejaVu Sans" w:hAnsi="DejaVu Sans" w:cs="DejaVu Sans"/>
+          <w:sz w:val="22"/>
+        </w:rPr>
+        <w:t xml:space="preserve">        self,</w:t>
+      </w:r>
+    </w:p>
+    <w:p>
+      <w:pPr>
+        <w:spacing w:line="240" w:lineRule="auto"/>
+        <w:ind w:firstLine="0"/>
+      </w:pPr>
+      <w:r>
+        <w:rPr>
+          <w:rFonts w:ascii="DejaVu Sans" w:eastAsia="DejaVu Sans" w:hAnsi="DejaVu Sans" w:cs="DejaVu Sans"/>
+          <w:sz w:val="22"/>
+        </w:rPr>
+        <w:t xml:space="preserve">        text: str,</w:t>
+      </w:r>
+    </w:p>
+    <w:p>
+      <w:pPr>
+        <w:spacing w:line="240" w:lineRule="auto"/>
+        <w:ind w:firstLine="0"/>
+      </w:pPr>
+      <w:r>
+        <w:rPr>
+          <w:rFonts w:ascii="DejaVu Sans" w:eastAsia="DejaVu Sans" w:hAnsi="DejaVu Sans" w:cs="DejaVu Sans"/>
+          <w:sz w:val="22"/>
+        </w:rPr>
+        <w:t xml:space="preserve">        k: int,</w:t>
+      </w:r>
+    </w:p>
+    <w:p>
+      <w:pPr>
+        <w:spacing w:line="240" w:lineRule="auto"/>
+        <w:ind w:firstLine="0"/>
+      </w:pPr>
+      <w:r>
+        <w:rPr>
+          <w:rFonts w:ascii="DejaVu Sans" w:eastAsia="DejaVu Sans" w:hAnsi="DejaVu Sans" w:cs="DejaVu Sans"/>
+          <w:sz w:val="22"/>
+        </w:rPr>
+        <w:t xml:space="preserve">        case_mode: str = "lower",</w:t>
+      </w:r>
+    </w:p>
+    <w:p>
+      <w:pPr>
+        <w:spacing w:line="240" w:lineRule="auto"/>
+        <w:ind w:firstLine="0"/>
+      </w:pPr>
+      <w:r>
+        <w:rPr>
+          <w:rFonts w:ascii="DejaVu Sans" w:eastAsia="DejaVu Sans" w:hAnsi="DejaVu Sans" w:cs="DejaVu Sans"/>
+          <w:sz w:val="22"/>
+        </w:rPr>
+        <w:t xml:space="preserve">        preserve_case: Optional[bool] = None</w:t>
+      </w:r>
+    </w:p>
+    <w:p>
+      <w:pPr>
+        <w:spacing w:line="240" w:lineRule="auto"/>
+        <w:ind w:firstLine="0"/>
+      </w:pPr>
+      <w:r>
+        <w:rPr>
+          <w:rFonts w:ascii="DejaVu Sans" w:eastAsia="DejaVu Sans" w:hAnsi="DejaVu Sans" w:cs="DejaVu Sans"/>
+          <w:sz w:val="22"/>
+        </w:rPr>
+        <w:t xml:space="preserve">    ) -&gt; str:</w:t>
+      </w:r>
+    </w:p>
+    <w:p>
+      <w:pPr>
+        <w:spacing w:line="240" w:lineRule="auto"/>
+        <w:ind w:firstLine="0"/>
+      </w:pPr>
+      <w:r>
+        <w:rPr>
+          <w:rFonts w:ascii="DejaVu Sans" w:eastAsia="DejaVu Sans" w:hAnsi="DejaVu Sans" w:cs="DejaVu Sans"/>
+          <w:sz w:val="22"/>
+        </w:rPr>
+        <w:t xml:space="preserve">        return self.encrypt(text, -k, filter_non_alpha=False, case_mode=case_mode, preserve_case=preserve_case)</w:t>
+      </w:r>
+    </w:p>
+    <w:p>
+      <w:pPr>
+        <w:spacing w:line="240" w:lineRule="auto"/>
+        <w:ind w:firstLine="0"/>
+      </w:pPr>
+    </w:p>
+    <w:p>
+      <w:pPr>
+        <w:spacing w:line="240" w:lineRule="auto"/>
+        <w:ind w:firstLine="0"/>
+      </w:pPr>
+      <w:r>
+        <w:rPr>
+          <w:rFonts w:ascii="DejaVu Sans" w:eastAsia="DejaVu Sans" w:hAnsi="DejaVu Sans" w:cs="DejaVu Sans"/>
+          <w:sz w:val="22"/>
+        </w:rPr>
+        <w:t xml:space="preserve">    def brute_force(</w:t>
+      </w:r>
+    </w:p>
+    <w:p>
+      <w:pPr>
+        <w:spacing w:line="240" w:lineRule="auto"/>
+        <w:ind w:firstLine="0"/>
+      </w:pPr>
+      <w:r>
+        <w:rPr>
+          <w:rFonts w:ascii="DejaVu Sans" w:eastAsia="DejaVu Sans" w:hAnsi="DejaVu Sans" w:cs="DejaVu Sans"/>
+          <w:sz w:val="22"/>
+        </w:rPr>
+        <w:t xml:space="preserve">        self,</w:t>
+      </w:r>
+    </w:p>
+    <w:p>
+      <w:pPr>
+        <w:spacing w:line="240" w:lineRule="auto"/>
+        <w:ind w:firstLine="0"/>
+      </w:pPr>
+      <w:r>
+        <w:rPr>
+          <w:rFonts w:ascii="DejaVu Sans" w:eastAsia="DejaVu Sans" w:hAnsi="DejaVu Sans" w:cs="DejaVu Sans"/>
+          <w:sz w:val="22"/>
+        </w:rPr>
+        <w:t xml:space="preserve">        ciphertext: str,</w:t>
+      </w:r>
+    </w:p>
+    <w:p>
+      <w:pPr>
+        <w:spacing w:line="240" w:lineRule="auto"/>
+        <w:ind w:firstLine="0"/>
+      </w:pPr>
+      <w:r>
+        <w:rPr>
+          <w:rFonts w:ascii="DejaVu Sans" w:eastAsia="DejaVu Sans" w:hAnsi="DejaVu Sans" w:cs="DejaVu Sans"/>
+          <w:sz w:val="22"/>
+        </w:rPr>
+        <w:t xml:space="preserve">        filter_non_alpha: bool = False,</w:t>
+      </w:r>
+    </w:p>
+    <w:p>
+      <w:pPr>
+        <w:spacing w:line="240" w:lineRule="auto"/>
+        <w:ind w:firstLine="0"/>
+      </w:pPr>
+      <w:r>
+        <w:rPr>
+          <w:rFonts w:ascii="DejaVu Sans" w:eastAsia="DejaVu Sans" w:hAnsi="DejaVu Sans" w:cs="DejaVu Sans"/>
+          <w:sz w:val="22"/>
+        </w:rPr>
+        <w:t xml:space="preserve">        case_mode: str = "lower"</w:t>
+      </w:r>
+    </w:p>
+    <w:p>
+      <w:pPr>
+        <w:spacing w:line="240" w:lineRule="auto"/>
+        <w:ind w:firstLine="0"/>
+      </w:pPr>
+      <w:r>
+        <w:rPr>
+          <w:rFonts w:ascii="DejaVu Sans" w:eastAsia="DejaVu Sans" w:hAnsi="DejaVu Sans" w:cs="DejaVu Sans"/>
+          <w:sz w:val="22"/>
+        </w:rPr>
+        <w:t xml:space="preserve">    ) -&gt; List[Tuple[int, str]]:</w:t>
+      </w:r>
+    </w:p>
+    <w:p>
+      <w:pPr>
+        <w:spacing w:line="240" w:lineRule="auto"/>
+        <w:ind w:firstLine="0"/>
+      </w:pPr>
+      <w:r>
+        <w:rPr>
+          <w:rFonts w:ascii="DejaVu Sans" w:eastAsia="DejaVu Sans" w:hAnsi="DejaVu Sans" w:cs="DejaVu Sans"/>
+          <w:sz w:val="22"/>
+        </w:rPr>
+        <w:t xml:space="preserve">        return [</w:t>
+      </w:r>
+    </w:p>
+    <w:p>
+      <w:pPr>
+        <w:spacing w:line="240" w:lineRule="auto"/>
+        <w:ind w:firstLine="0"/>
+      </w:pPr>
+      <w:r>
+        <w:rPr>
+          <w:rFonts w:ascii="DejaVu Sans" w:eastAsia="DejaVu Sans" w:hAnsi="DejaVu Sans" w:cs="DejaVu Sans"/>
+          <w:sz w:val="22"/>
+        </w:rPr>
+        <w:t xml:space="preserve">            (k, self.decrypt(ciphertext, k, case_mode=case_mode))</w:t>
+      </w:r>
+    </w:p>
+    <w:p>
+      <w:pPr>
+        <w:spacing w:line="240" w:lineRule="auto"/>
+        <w:ind w:firstLine="0"/>
+      </w:pPr>
+      <w:r>
+        <w:rPr>
+          <w:rFonts w:ascii="DejaVu Sans" w:eastAsia="DejaVu Sans" w:hAnsi="DejaVu Sans" w:cs="DejaVu Sans"/>
+          <w:sz w:val="22"/>
+        </w:rPr>
+        <w:t xml:space="preserve">            for k in range(1, self.power)</w:t>
+      </w:r>
+    </w:p>
+    <w:p>
+      <w:pPr>
+        <w:spacing w:after="120" w:line="240" w:lineRule="auto"/>
+        <w:ind w:firstLine="0"/>
+        <w:rPr>
+          <w:lang w:val="ru-RU"/>
+        </w:rPr>
+      </w:pPr>
+      <w:r>
+        <w:rPr>
+          <w:rFonts w:ascii="DejaVu Sans" w:eastAsia="DejaVu Sans" w:hAnsi="DejaVu Sans" w:cs="DejaVu Sans"/>
+          <w:sz w:val="22"/>
+        </w:rPr>
+        <w:t xml:space="preserve">        </w:t>
+      </w:r>
+      <w:r>
+        <w:rPr>
+          <w:rFonts w:ascii="DejaVu Sans" w:eastAsia="DejaVu Sans" w:hAnsi="DejaVu Sans" w:cs="DejaVu Sans"/>
+          <w:sz w:val="22"/>
+          <w:lang w:val="ru-RU"/>
+        </w:rPr>
+        <w:t>]</w:t>
+      </w:r>
+    </w:p>
+    <w:p>
+      <w:pPr>
+        <w:pStyle w:val="1"/>
+        <w:pageBreakBefore/>
+        <w:rPr>
+          <w:lang w:val="ru-RU"/>
+        </w:rPr>
+      </w:pPr>
+      <w:bookmarkStart w:id="5" w:name="_Toc241610198"/>
+      <w:r>
+        <w:rPr>
+          <w:rFonts w:ascii="Times New Roman" w:eastAsia="Times New Roman" w:hAnsi="Times New Roman" w:cs="Times New Roman"/>
+          <w:b w:val="0"/>
+          <w:lang w:val="ru-RU"/>
+        </w:rPr>
+        <w:lastRenderedPageBreak/>
+        <w:t>ЗАКЛЮЧЕНИЕ</w:t>
+      </w:r>
+      <w:bookmarkEnd w:id="5"/>
     </w:p>
     <w:p>
       <w:pPr>
         <w:jc w:val="both"/>
-      </w:pPr>
-      <w:r>
-        <w:t>Выхожу один я на дорогу;</w:t>
-      </w:r>
-      <w:r>
-        <w:br/>
-      </w:r>
-      <w:r>
-        <w:t>Сквозь туман кремнистый путь блестит;</w:t>
-      </w:r>
-      <w:r>
-        <w:br/>
-      </w:r>
-      <w:r>
-        <w:t>Ночь тиха. Пустыня внемлет Богу,</w:t>
-      </w:r>
-      <w:r>
-        <w:br/>
-      </w:r>
-      <w:r>
-        <w:t>И звезда с звездою говорит.</w:t>
-      </w:r>
-    </w:p>
-    <w:p>
-      <w:pPr>
-        <w:jc w:val="both"/>
-      </w:pPr>
-      <w:r>
-        <w:t>В соответствии с заданием методических указаний выполнено контрольное зашифрование строки, составленной из фамилии автора и названия произведения:</w:t>
+        <w:rPr>
+          <w:lang w:val="ru-RU"/>
+        </w:rPr>
+      </w:pPr>
+      <w:r>
+        <w:rPr>
+          <w:lang w:val="ru-RU"/>
+        </w:rPr>
+        <w:t>В ходе выполнения лабораторной работы были получены следующие основные результаты:</w:t>
       </w:r>
     </w:p>
     <w:p>
       <w:pPr>
         <w:ind w:left="425" w:firstLine="0"/>
         <w:jc w:val="both"/>
-      </w:pPr>
-      <w:r>
-        <w:t xml:space="preserve">• Исходная открытая строка: </w:t>
-      </w:r>
-      <w:r>
-        <w:rPr>
-          <w:rFonts w:ascii="DejaVu Sans" w:eastAsia="DejaVu Sans" w:hAnsi="DejaVu Sans" w:cs="DejaVu Sans"/>
-          <w:sz w:val="22"/>
-        </w:rPr>
-        <w:t>лермонтоввыхожуодинянадорогу</w:t>
-      </w:r>
-    </w:p>
-    <w:p>
-      <w:pPr>
-        <w:ind w:left="425" w:firstLine="0"/>
-        <w:jc w:val="both"/>
-      </w:pPr>
-      <w:r>
-        <w:t xml:space="preserve">• </w:t>
-      </w:r>
-      <w:r>
-        <w:rPr>
-          <w:b/>
-        </w:rPr>
-        <w:t>ЗАШИФРОВАННЫЕ ФАМИЛИЯ И НАЗВАНИЕ (ШТ):</w:t>
-      </w:r>
-      <w:r>
-        <w:br/>
-      </w:r>
-      <w:r>
-        <w:rPr>
-          <w:rFonts w:ascii="DejaVu Sans" w:eastAsia="DejaVu Sans" w:hAnsi="DejaVu Sans" w:cs="DejaVu Sans"/>
-          <w:sz w:val="22"/>
-        </w:rPr>
-        <w:t>ьцбэяюгяуумжячдяхщюрюсхябяфд</w:t>
-      </w:r>
-    </w:p>
-    <w:p>
-      <w:pPr>
-        <w:pStyle w:val="21"/>
-      </w:pPr>
-      <w:bookmarkStart w:id="4" w:name="_Toc241610197"/>
-      <w:r>
-        <w:rPr>
-          <w:rFonts w:ascii="Times New Roman" w:eastAsia="Times New Roman" w:hAnsi="Times New Roman" w:cs="Times New Roman"/>
-        </w:rPr>
-        <w:t>3. Программная реализация</w:t>
-      </w:r>
-      <w:bookmarkEnd w:id="4"/>
-    </w:p>
-    <w:p>
-      <w:pPr>
-        <w:jc w:val="both"/>
-      </w:pPr>
-      <w:r>
-        <w:t xml:space="preserve">Программный модуль шифра Цезаря реализован на языке </w:t>
-      </w:r>
-      <w:r>
-        <w:rPr>
-          <w:i/>
-        </w:rPr>
-        <w:t>Python</w:t>
-      </w:r>
-      <w:r>
-        <w:t>. В листинге приведена реализация математического ядра, функций прямого и обратного шифрования, а также процедуры полного перебора ключей.</w:t>
-      </w:r>
-    </w:p>
-    <w:p>
-      <w:pPr>
-        <w:keepNext/>
-        <w:ind w:firstLine="0"/>
-      </w:pPr>
-      <w:r>
-        <w:lastRenderedPageBreak/>
-        <w:t>Листинг 1 – Реализация алгоритмов шифрования Цезаря и перебора ключей (</w:t>
-      </w:r>
-      <w:r>
-        <w:rPr>
-          <w:i/>
-        </w:rPr>
-        <w:t>caesar_cipher.py</w:t>
-      </w:r>
-      <w:r>
-        <w:t>)</w:t>
-      </w:r>
-    </w:p>
-    <w:p>
-      <w:pPr>
-        <w:spacing w:before="120" w:line="240" w:lineRule="auto"/>
-        <w:ind w:firstLine="0"/>
-      </w:pPr>
-      <w:r>
-        <w:rPr>
-          <w:rFonts w:ascii="DejaVu Sans" w:eastAsia="DejaVu Sans" w:hAnsi="DejaVu Sans" w:cs="DejaVu Sans"/>
-          <w:sz w:val="22"/>
-        </w:rPr>
-        <w:t>from typing import Dict, List, Optional, Tuple</w:t>
-      </w:r>
-    </w:p>
-    <w:p>
-      <w:pPr>
-        <w:spacing w:line="240" w:lineRule="auto"/>
-        <w:ind w:firstLine="0"/>
-      </w:pPr>
-    </w:p>
-    <w:p>
-      <w:pPr>
-        <w:spacing w:line="240" w:lineRule="auto"/>
-        <w:ind w:firstLine="0"/>
-      </w:pPr>
-    </w:p>
-    <w:p>
-      <w:pPr>
-        <w:spacing w:line="240" w:lineRule="auto"/>
-        <w:ind w:firstLine="0"/>
-      </w:pPr>
-      <w:r>
-        <w:rPr>
-          <w:rFonts w:ascii="DejaVu Sans" w:eastAsia="DejaVu Sans" w:hAnsi="DejaVu Sans" w:cs="DejaVu Sans"/>
-          <w:sz w:val="22"/>
-        </w:rPr>
-        <w:t>class Alphabet:</w:t>
-      </w:r>
-    </w:p>
-    <w:p>
-      <w:pPr>
-        <w:spacing w:line="240" w:lineRule="auto"/>
-        <w:ind w:firstLine="0"/>
-      </w:pPr>
-      <w:r>
-        <w:rPr>
-          <w:rFonts w:ascii="DejaVu Sans" w:eastAsia="DejaVu Sans" w:hAnsi="DejaVu Sans" w:cs="DejaVu Sans"/>
-          <w:sz w:val="22"/>
-        </w:rPr>
-        <w:t xml:space="preserve">    def __init__(</w:t>
-      </w:r>
-    </w:p>
-    <w:p>
-      <w:pPr>
-        <w:spacing w:line="240" w:lineRule="auto"/>
-        <w:ind w:firstLine="0"/>
-      </w:pPr>
-      <w:r>
-        <w:rPr>
-          <w:rFonts w:ascii="DejaVu Sans" w:eastAsia="DejaVu Sans" w:hAnsi="DejaVu Sans" w:cs="DejaVu Sans"/>
-          <w:sz w:val="22"/>
-        </w:rPr>
-        <w:t xml:space="preserve">        self,</w:t>
-      </w:r>
-    </w:p>
-    <w:p>
-      <w:pPr>
-        <w:spacing w:line="240" w:lineRule="auto"/>
-        <w:ind w:firstLine="0"/>
-      </w:pPr>
-      <w:r>
-        <w:rPr>
-          <w:rFonts w:ascii="DejaVu Sans" w:eastAsia="DejaVu Sans" w:hAnsi="DejaVu Sans" w:cs="DejaVu Sans"/>
-          <w:sz w:val="22"/>
-        </w:rPr>
-        <w:t xml:space="preserve">        name: str,</w:t>
-      </w:r>
-    </w:p>
-    <w:p>
-      <w:pPr>
-        <w:spacing w:line="240" w:lineRule="auto"/>
-        <w:ind w:firstLine="0"/>
-      </w:pPr>
-      <w:r>
-        <w:rPr>
-          <w:rFonts w:ascii="DejaVu Sans" w:eastAsia="DejaVu Sans" w:hAnsi="DejaVu Sans" w:cs="DejaVu Sans"/>
-          <w:sz w:val="22"/>
-        </w:rPr>
-        <w:t xml:space="preserve">        symbols: str,</w:t>
-      </w:r>
-    </w:p>
-    <w:p>
-      <w:pPr>
-        <w:spacing w:line="240" w:lineRule="auto"/>
-        <w:ind w:firstLine="0"/>
-      </w:pPr>
-      <w:r>
-        <w:rPr>
-          <w:rFonts w:ascii="DejaVu Sans" w:eastAsia="DejaVu Sans" w:hAnsi="DejaVu Sans" w:cs="DejaVu Sans"/>
-          <w:sz w:val="22"/>
-        </w:rPr>
-        <w:t xml:space="preserve">        normalize_map: Optional[Dict[str, str]] = None,</w:t>
-      </w:r>
-    </w:p>
-    <w:p>
-      <w:pPr>
-        <w:spacing w:line="240" w:lineRule="auto"/>
-        <w:ind w:firstLine="0"/>
-      </w:pPr>
-      <w:r>
-        <w:rPr>
-          <w:rFonts w:ascii="DejaVu Sans" w:eastAsia="DejaVu Sans" w:hAnsi="DejaVu Sans" w:cs="DejaVu Sans"/>
-          <w:sz w:val="22"/>
-        </w:rPr>
-        <w:t xml:space="preserve">        case_sensitive: bool = False</w:t>
-      </w:r>
-    </w:p>
-    <w:p>
-      <w:pPr>
-        <w:spacing w:line="240" w:lineRule="auto"/>
-        <w:ind w:firstLine="0"/>
-      </w:pPr>
-      <w:r>
-        <w:rPr>
-          <w:rFonts w:ascii="DejaVu Sans" w:eastAsia="DejaVu Sans" w:hAnsi="DejaVu Sans" w:cs="DejaVu Sans"/>
-          <w:sz w:val="22"/>
-        </w:rPr>
-        <w:t xml:space="preserve">    ):</w:t>
-      </w:r>
-    </w:p>
-    <w:p>
-      <w:pPr>
-        <w:spacing w:line="240" w:lineRule="auto"/>
-        <w:ind w:firstLine="0"/>
-      </w:pPr>
-      <w:r>
-        <w:rPr>
-          <w:rFonts w:ascii="DejaVu Sans" w:eastAsia="DejaVu Sans" w:hAnsi="DejaVu Sans" w:cs="DejaVu Sans"/>
-          <w:sz w:val="22"/>
-        </w:rPr>
-        <w:t xml:space="preserve">        self.name = name</w:t>
-      </w:r>
-    </w:p>
-    <w:p>
-      <w:pPr>
-        <w:spacing w:line="240" w:lineRule="auto"/>
-        <w:ind w:firstLine="0"/>
-      </w:pPr>
-      <w:r>
-        <w:rPr>
-          <w:rFonts w:ascii="DejaVu Sans" w:eastAsia="DejaVu Sans" w:hAnsi="DejaVu Sans" w:cs="DejaVu Sans"/>
-          <w:sz w:val="22"/>
-        </w:rPr>
-        <w:t xml:space="preserve">        self.symbols = symbols</w:t>
-      </w:r>
-    </w:p>
-    <w:p>
-      <w:pPr>
-        <w:spacing w:line="240" w:lineRule="auto"/>
-        <w:ind w:firstLine="0"/>
-      </w:pPr>
-      <w:r>
-        <w:rPr>
-          <w:rFonts w:ascii="DejaVu Sans" w:eastAsia="DejaVu Sans" w:hAnsi="DejaVu Sans" w:cs="DejaVu Sans"/>
-          <w:sz w:val="22"/>
-        </w:rPr>
-        <w:t xml:space="preserve">        self.power = len(symbols)</w:t>
-      </w:r>
-    </w:p>
-    <w:p>
-      <w:pPr>
-        <w:spacing w:line="240" w:lineRule="auto"/>
-        <w:ind w:firstLine="0"/>
-      </w:pPr>
-      <w:r>
-        <w:rPr>
-          <w:rFonts w:ascii="DejaVu Sans" w:eastAsia="DejaVu Sans" w:hAnsi="DejaVu Sans" w:cs="DejaVu Sans"/>
-          <w:sz w:val="22"/>
-        </w:rPr>
-        <w:t xml:space="preserve">        self.normalize_map = normalize_map or {}</w:t>
-      </w:r>
-    </w:p>
-    <w:p>
-      <w:pPr>
-        <w:spacing w:line="240" w:lineRule="auto"/>
-        <w:ind w:firstLine="0"/>
-      </w:pPr>
-      <w:r>
-        <w:rPr>
-          <w:rFonts w:ascii="DejaVu Sans" w:eastAsia="DejaVu Sans" w:hAnsi="DejaVu Sans" w:cs="DejaVu Sans"/>
-          <w:sz w:val="22"/>
-        </w:rPr>
-        <w:t xml:space="preserve">        self.case_sensitive = case_sensitive</w:t>
-      </w:r>
-    </w:p>
-    <w:p>
-      <w:pPr>
-        <w:spacing w:line="240" w:lineRule="auto"/>
-        <w:ind w:firstLine="0"/>
-      </w:pPr>
-      <w:r>
-        <w:rPr>
-          <w:rFonts w:ascii="DejaVu Sans" w:eastAsia="DejaVu Sans" w:hAnsi="DejaVu Sans" w:cs="DejaVu Sans"/>
-          <w:sz w:val="22"/>
-        </w:rPr>
-        <w:t xml:space="preserve">        self.char_to_code: Dict[str, int] = {char: idx for idx, char in enumerate(symbols)}</w:t>
-      </w:r>
-    </w:p>
-    <w:p>
-      <w:pPr>
-        <w:spacing w:line="240" w:lineRule="auto"/>
-        <w:ind w:firstLine="0"/>
-      </w:pPr>
-      <w:r>
-        <w:rPr>
-          <w:rFonts w:ascii="DejaVu Sans" w:eastAsia="DejaVu Sans" w:hAnsi="DejaVu Sans" w:cs="DejaVu Sans"/>
-          <w:sz w:val="22"/>
-        </w:rPr>
-        <w:t xml:space="preserve">        self.code_to_char: Dict[int, str] = {idx: char for idx, char in enumerate(symbols)}</w:t>
-      </w:r>
-    </w:p>
-    <w:p>
-      <w:pPr>
-        <w:spacing w:line="240" w:lineRule="auto"/>
-        <w:ind w:firstLine="0"/>
-      </w:pPr>
-    </w:p>
-    <w:p>
-      <w:pPr>
-        <w:spacing w:line="240" w:lineRule="auto"/>
-        <w:ind w:firstLine="0"/>
-      </w:pPr>
-      <w:r>
-        <w:rPr>
-          <w:rFonts w:ascii="DejaVu Sans" w:eastAsia="DejaVu Sans" w:hAnsi="DejaVu Sans" w:cs="DejaVu Sans"/>
-          <w:sz w:val="22"/>
-        </w:rPr>
-        <w:t xml:space="preserve">    def normalize_char(self, char: str) -&gt; str:</w:t>
-      </w:r>
-    </w:p>
-    <w:p>
-      <w:pPr>
-        <w:spacing w:line="240" w:lineRule="auto"/>
-        <w:ind w:firstLine="0"/>
-      </w:pPr>
-      <w:r>
-        <w:rPr>
-          <w:rFonts w:ascii="DejaVu Sans" w:eastAsia="DejaVu Sans" w:hAnsi="DejaVu Sans" w:cs="DejaVu Sans"/>
-          <w:sz w:val="22"/>
-        </w:rPr>
-        <w:t xml:space="preserve">        c = char if self.case_sensitive else char.lower()</w:t>
-      </w:r>
-    </w:p>
-    <w:p>
-      <w:pPr>
-        <w:spacing w:line="240" w:lineRule="auto"/>
-        <w:ind w:firstLine="0"/>
-      </w:pPr>
-      <w:r>
-        <w:rPr>
-          <w:rFonts w:ascii="DejaVu Sans" w:eastAsia="DejaVu Sans" w:hAnsi="DejaVu Sans" w:cs="DejaVu Sans"/>
-          <w:sz w:val="22"/>
-        </w:rPr>
-        <w:t xml:space="preserve">        return self.normalize_map.get(c, c)</w:t>
-      </w:r>
-    </w:p>
-    <w:p>
-      <w:pPr>
-        <w:spacing w:line="240" w:lineRule="auto"/>
-        <w:ind w:firstLine="0"/>
-      </w:pPr>
-    </w:p>
-    <w:p>
-      <w:pPr>
-        <w:spacing w:line="240" w:lineRule="auto"/>
-        <w:ind w:firstLine="0"/>
-      </w:pPr>
-      <w:r>
-        <w:rPr>
-          <w:rFonts w:ascii="DejaVu Sans" w:eastAsia="DejaVu Sans" w:hAnsi="DejaVu Sans" w:cs="DejaVu Sans"/>
-          <w:sz w:val="22"/>
-        </w:rPr>
-        <w:t xml:space="preserve">    def A(self, char: str) -&gt; int:</w:t>
-      </w:r>
-    </w:p>
-    <w:p>
-      <w:pPr>
-        <w:spacing w:line="240" w:lineRule="auto"/>
-        <w:ind w:firstLine="0"/>
-      </w:pPr>
-      <w:r>
-        <w:rPr>
-          <w:rFonts w:ascii="DejaVu Sans" w:eastAsia="DejaVu Sans" w:hAnsi="DejaVu Sans" w:cs="DejaVu Sans"/>
-          <w:sz w:val="22"/>
-        </w:rPr>
-        <w:t xml:space="preserve">        norm = self.normalize_char(char)</w:t>
-      </w:r>
-    </w:p>
-    <w:p>
-      <w:pPr>
-        <w:spacing w:line="240" w:lineRule="auto"/>
-        <w:ind w:firstLine="0"/>
-      </w:pPr>
-      <w:r>
-        <w:rPr>
-          <w:rFonts w:ascii="DejaVu Sans" w:eastAsia="DejaVu Sans" w:hAnsi="DejaVu Sans" w:cs="DejaVu Sans"/>
-          <w:sz w:val="22"/>
-        </w:rPr>
-        <w:t xml:space="preserve">        if norm in self.char_to_code:</w:t>
-      </w:r>
-    </w:p>
-    <w:p>
-      <w:pPr>
-        <w:spacing w:line="240" w:lineRule="auto"/>
-        <w:ind w:firstLine="0"/>
-      </w:pPr>
-      <w:r>
-        <w:rPr>
-          <w:rFonts w:ascii="DejaVu Sans" w:eastAsia="DejaVu Sans" w:hAnsi="DejaVu Sans" w:cs="DejaVu Sans"/>
-          <w:sz w:val="22"/>
-        </w:rPr>
-        <w:t xml:space="preserve">            return self.char_to_code[norm]</w:t>
-      </w:r>
-    </w:p>
-    <w:p>
-      <w:pPr>
-        <w:spacing w:line="240" w:lineRule="auto"/>
-        <w:ind w:firstLine="0"/>
-      </w:pPr>
-      <w:r>
-        <w:rPr>
-          <w:rFonts w:ascii="DejaVu Sans" w:eastAsia="DejaVu Sans" w:hAnsi="DejaVu Sans" w:cs="DejaVu Sans"/>
-          <w:sz w:val="22"/>
-        </w:rPr>
-        <w:t xml:space="preserve">        raise ValueError(f"Символ '{char}' не входит в алфавит '{self.name}' (m = {self.power})")</w:t>
-      </w:r>
-    </w:p>
-    <w:p>
-      <w:pPr>
-        <w:spacing w:line="240" w:lineRule="auto"/>
-        <w:ind w:firstLine="0"/>
-      </w:pPr>
-    </w:p>
-    <w:p>
-      <w:pPr>
-        <w:spacing w:line="240" w:lineRule="auto"/>
-        <w:ind w:firstLine="0"/>
-      </w:pPr>
-      <w:r>
-        <w:rPr>
-          <w:rFonts w:ascii="DejaVu Sans" w:eastAsia="DejaVu Sans" w:hAnsi="DejaVu Sans" w:cs="DejaVu Sans"/>
-          <w:sz w:val="22"/>
-        </w:rPr>
-        <w:t xml:space="preserve">    def A_inv(self, code: int) -&gt; str:</w:t>
-      </w:r>
-    </w:p>
-    <w:p>
-      <w:pPr>
-        <w:spacing w:line="240" w:lineRule="auto"/>
-        <w:ind w:firstLine="0"/>
-      </w:pPr>
-      <w:r>
-        <w:rPr>
-          <w:rFonts w:ascii="DejaVu Sans" w:eastAsia="DejaVu Sans" w:hAnsi="DejaVu Sans" w:cs="DejaVu Sans"/>
-          <w:sz w:val="22"/>
-        </w:rPr>
-        <w:t xml:space="preserve">        return self.code_to_char[code % self.power]</w:t>
-      </w:r>
-    </w:p>
-    <w:p>
-      <w:pPr>
-        <w:spacing w:line="240" w:lineRule="auto"/>
-        <w:ind w:firstLine="0"/>
-      </w:pPr>
-    </w:p>
-    <w:p>
-      <w:pPr>
-        <w:spacing w:line="240" w:lineRule="auto"/>
-        <w:ind w:firstLine="0"/>
-      </w:pPr>
-      <w:r>
-        <w:rPr>
-          <w:rFonts w:ascii="DejaVu Sans" w:eastAsia="DejaVu Sans" w:hAnsi="DejaVu Sans" w:cs="DejaVu Sans"/>
-          <w:sz w:val="22"/>
-        </w:rPr>
-        <w:t xml:space="preserve">    def E_k(self, x: int, k: int) -&gt; int:</w:t>
-      </w:r>
-    </w:p>
-    <w:p>
-      <w:pPr>
-        <w:spacing w:line="240" w:lineRule="auto"/>
-        <w:ind w:firstLine="0"/>
-      </w:pPr>
-      <w:r>
-        <w:rPr>
-          <w:rFonts w:ascii="DejaVu Sans" w:eastAsia="DejaVu Sans" w:hAnsi="DejaVu Sans" w:cs="DejaVu Sans"/>
-          <w:sz w:val="22"/>
-        </w:rPr>
-        <w:t xml:space="preserve">        return (x + k) % self.power</w:t>
-      </w:r>
-    </w:p>
-    <w:p>
-      <w:pPr>
-        <w:spacing w:line="240" w:lineRule="auto"/>
-        <w:ind w:firstLine="0"/>
-      </w:pPr>
-    </w:p>
-    <w:p>
-      <w:pPr>
-        <w:spacing w:line="240" w:lineRule="auto"/>
-        <w:ind w:firstLine="0"/>
-      </w:pPr>
-      <w:r>
-        <w:rPr>
-          <w:rFonts w:ascii="DejaVu Sans" w:eastAsia="DejaVu Sans" w:hAnsi="DejaVu Sans" w:cs="DejaVu Sans"/>
-          <w:sz w:val="22"/>
-        </w:rPr>
-        <w:t xml:space="preserve">    def D_k(self, y: int, k: int) -&gt; int:</w:t>
-      </w:r>
-    </w:p>
-    <w:p>
-      <w:pPr>
-        <w:spacing w:line="240" w:lineRule="auto"/>
-        <w:ind w:firstLine="0"/>
-      </w:pPr>
-      <w:r>
-        <w:rPr>
-          <w:rFonts w:ascii="DejaVu Sans" w:eastAsia="DejaVu Sans" w:hAnsi="DejaVu Sans" w:cs="DejaVu Sans"/>
-          <w:sz w:val="22"/>
-        </w:rPr>
-        <w:t xml:space="preserve">        return self.E_k(y, -k)</w:t>
-      </w:r>
-    </w:p>
-    <w:p>
-      <w:pPr>
-        <w:spacing w:line="240" w:lineRule="auto"/>
-        <w:ind w:firstLine="0"/>
-      </w:pPr>
-    </w:p>
-    <w:p>
-      <w:pPr>
-        <w:spacing w:line="240" w:lineRule="auto"/>
-        <w:ind w:firstLine="0"/>
-      </w:pPr>
-      <w:r>
-        <w:rPr>
-          <w:rFonts w:ascii="DejaVu Sans" w:eastAsia="DejaVu Sans" w:hAnsi="DejaVu Sans" w:cs="DejaVu Sans"/>
-          <w:sz w:val="22"/>
-        </w:rPr>
-        <w:t xml:space="preserve">    def encrypt_symbol(</w:t>
-      </w:r>
-    </w:p>
-    <w:p>
-      <w:pPr>
-        <w:spacing w:line="240" w:lineRule="auto"/>
-        <w:ind w:firstLine="0"/>
-      </w:pPr>
-      <w:r>
-        <w:rPr>
-          <w:rFonts w:ascii="DejaVu Sans" w:eastAsia="DejaVu Sans" w:hAnsi="DejaVu Sans" w:cs="DejaVu Sans"/>
-          <w:sz w:val="22"/>
-        </w:rPr>
-        <w:t xml:space="preserve">        self,</w:t>
-      </w:r>
-    </w:p>
-    <w:p>
-      <w:pPr>
-        <w:spacing w:line="240" w:lineRule="auto"/>
-        <w:ind w:firstLine="0"/>
-      </w:pPr>
-      <w:r>
-        <w:rPr>
-          <w:rFonts w:ascii="DejaVu Sans" w:eastAsia="DejaVu Sans" w:hAnsi="DejaVu Sans" w:cs="DejaVu Sans"/>
-          <w:sz w:val="22"/>
-        </w:rPr>
-        <w:t xml:space="preserve">        char: str,</w:t>
-      </w:r>
-    </w:p>
-    <w:p>
-      <w:pPr>
-        <w:spacing w:line="240" w:lineRule="auto"/>
-        <w:ind w:firstLine="0"/>
-      </w:pPr>
-      <w:r>
-        <w:rPr>
-          <w:rFonts w:ascii="DejaVu Sans" w:eastAsia="DejaVu Sans" w:hAnsi="DejaVu Sans" w:cs="DejaVu Sans"/>
-          <w:sz w:val="22"/>
-        </w:rPr>
-        <w:t xml:space="preserve">        k: int,</w:t>
-      </w:r>
-    </w:p>
-    <w:p>
-      <w:pPr>
-        <w:spacing w:line="240" w:lineRule="auto"/>
-        <w:ind w:firstLine="0"/>
-      </w:pPr>
-      <w:r>
-        <w:rPr>
-          <w:rFonts w:ascii="DejaVu Sans" w:eastAsia="DejaVu Sans" w:hAnsi="DejaVu Sans" w:cs="DejaVu Sans"/>
-          <w:sz w:val="22"/>
-        </w:rPr>
-        <w:t xml:space="preserve">        case_mode: str = "lower",</w:t>
-      </w:r>
-    </w:p>
-    <w:p>
-      <w:pPr>
-        <w:spacing w:line="240" w:lineRule="auto"/>
-        <w:ind w:firstLine="0"/>
-      </w:pPr>
-      <w:r>
-        <w:rPr>
-          <w:rFonts w:ascii="DejaVu Sans" w:eastAsia="DejaVu Sans" w:hAnsi="DejaVu Sans" w:cs="DejaVu Sans"/>
-          <w:sz w:val="22"/>
-        </w:rPr>
-        <w:t xml:space="preserve">        preserve_case: Optional[bool] = None</w:t>
-      </w:r>
-    </w:p>
-    <w:p>
-      <w:pPr>
-        <w:spacing w:line="240" w:lineRule="auto"/>
-        <w:ind w:firstLine="0"/>
-      </w:pPr>
-      <w:r>
-        <w:rPr>
-          <w:rFonts w:ascii="DejaVu Sans" w:eastAsia="DejaVu Sans" w:hAnsi="DejaVu Sans" w:cs="DejaVu Sans"/>
-          <w:sz w:val="22"/>
-        </w:rPr>
-        <w:t xml:space="preserve">    ) -&gt; str:</w:t>
-      </w:r>
-    </w:p>
-    <w:p>
-      <w:pPr>
-        <w:spacing w:line="240" w:lineRule="auto"/>
-        <w:ind w:firstLine="0"/>
-      </w:pPr>
-      <w:r>
-        <w:rPr>
-          <w:rFonts w:ascii="DejaVu Sans" w:eastAsia="DejaVu Sans" w:hAnsi="DejaVu Sans" w:cs="DejaVu Sans"/>
-          <w:sz w:val="22"/>
-        </w:rPr>
-        <w:t xml:space="preserve">        if preserve_case is not None:</w:t>
-      </w:r>
-    </w:p>
-    <w:p>
-      <w:pPr>
-        <w:spacing w:line="240" w:lineRule="auto"/>
-        <w:ind w:firstLine="0"/>
-      </w:pPr>
-      <w:r>
-        <w:rPr>
-          <w:rFonts w:ascii="DejaVu Sans" w:eastAsia="DejaVu Sans" w:hAnsi="DejaVu Sans" w:cs="DejaVu Sans"/>
-          <w:sz w:val="22"/>
-        </w:rPr>
-        <w:lastRenderedPageBreak/>
-        <w:t xml:space="preserve">            case_mode = "preserve" if preserve_case else "lower"</w:t>
-      </w:r>
-    </w:p>
-    <w:p>
-      <w:pPr>
-        <w:spacing w:line="240" w:lineRule="auto"/>
-        <w:ind w:firstLine="0"/>
-      </w:pPr>
-      <w:r>
-        <w:rPr>
-          <w:rFonts w:ascii="DejaVu Sans" w:eastAsia="DejaVu Sans" w:hAnsi="DejaVu Sans" w:cs="DejaVu Sans"/>
-          <w:sz w:val="22"/>
-        </w:rPr>
-        <w:t xml:space="preserve">        norm = self.normalize_char(char)</w:t>
-      </w:r>
-    </w:p>
-    <w:p>
-      <w:pPr>
-        <w:spacing w:line="240" w:lineRule="auto"/>
-        <w:ind w:firstLine="0"/>
-      </w:pPr>
-      <w:r>
-        <w:rPr>
-          <w:rFonts w:ascii="DejaVu Sans" w:eastAsia="DejaVu Sans" w:hAnsi="DejaVu Sans" w:cs="DejaVu Sans"/>
-          <w:sz w:val="22"/>
-        </w:rPr>
-        <w:t xml:space="preserve">        if norm in self.char_to_code:</w:t>
-      </w:r>
-    </w:p>
-    <w:p>
-      <w:pPr>
-        <w:spacing w:line="240" w:lineRule="auto"/>
-        <w:ind w:firstLine="0"/>
-      </w:pPr>
-      <w:r>
-        <w:rPr>
-          <w:rFonts w:ascii="DejaVu Sans" w:eastAsia="DejaVu Sans" w:hAnsi="DejaVu Sans" w:cs="DejaVu Sans"/>
-          <w:sz w:val="22"/>
-        </w:rPr>
-        <w:t xml:space="preserve">            res_char = self.A_inv(self.E_k(self.char_to_code[norm], k))</w:t>
-      </w:r>
-    </w:p>
-    <w:p>
-      <w:pPr>
-        <w:spacing w:line="240" w:lineRule="auto"/>
-        <w:ind w:firstLine="0"/>
-      </w:pPr>
-      <w:r>
-        <w:rPr>
-          <w:rFonts w:ascii="DejaVu Sans" w:eastAsia="DejaVu Sans" w:hAnsi="DejaVu Sans" w:cs="DejaVu Sans"/>
-          <w:sz w:val="22"/>
-        </w:rPr>
-        <w:t xml:space="preserve">            if self.case_sensitive:</w:t>
-      </w:r>
-    </w:p>
-    <w:p>
-      <w:pPr>
-        <w:spacing w:line="240" w:lineRule="auto"/>
-        <w:ind w:firstLine="0"/>
-      </w:pPr>
-      <w:r>
-        <w:rPr>
-          <w:rFonts w:ascii="DejaVu Sans" w:eastAsia="DejaVu Sans" w:hAnsi="DejaVu Sans" w:cs="DejaVu Sans"/>
-          <w:sz w:val="22"/>
-        </w:rPr>
-        <w:t xml:space="preserve">                return res_char</w:t>
-      </w:r>
-    </w:p>
-    <w:p>
-      <w:pPr>
-        <w:spacing w:line="240" w:lineRule="auto"/>
-        <w:ind w:firstLine="0"/>
-      </w:pPr>
-      <w:r>
-        <w:rPr>
-          <w:rFonts w:ascii="DejaVu Sans" w:eastAsia="DejaVu Sans" w:hAnsi="DejaVu Sans" w:cs="DejaVu Sans"/>
-          <w:sz w:val="22"/>
-        </w:rPr>
-        <w:t xml:space="preserve">            if case_mode == "preserve":</w:t>
-      </w:r>
-    </w:p>
-    <w:p>
-      <w:pPr>
-        <w:spacing w:line="240" w:lineRule="auto"/>
-        <w:ind w:firstLine="0"/>
-      </w:pPr>
-      <w:r>
-        <w:rPr>
-          <w:rFonts w:ascii="DejaVu Sans" w:eastAsia="DejaVu Sans" w:hAnsi="DejaVu Sans" w:cs="DejaVu Sans"/>
-          <w:sz w:val="22"/>
-        </w:rPr>
-        <w:t xml:space="preserve">                return res_char.upper() if char.isupper() else res_char.lower()</w:t>
-      </w:r>
-    </w:p>
-    <w:p>
-      <w:pPr>
-        <w:spacing w:line="240" w:lineRule="auto"/>
-        <w:ind w:firstLine="0"/>
-      </w:pPr>
-      <w:r>
-        <w:rPr>
-          <w:rFonts w:ascii="DejaVu Sans" w:eastAsia="DejaVu Sans" w:hAnsi="DejaVu Sans" w:cs="DejaVu Sans"/>
-          <w:sz w:val="22"/>
-        </w:rPr>
-        <w:t xml:space="preserve">            elif case_mode == "upper":</w:t>
-      </w:r>
-    </w:p>
-    <w:p>
-      <w:pPr>
-        <w:spacing w:line="240" w:lineRule="auto"/>
-        <w:ind w:firstLine="0"/>
-      </w:pPr>
-      <w:r>
-        <w:rPr>
-          <w:rFonts w:ascii="DejaVu Sans" w:eastAsia="DejaVu Sans" w:hAnsi="DejaVu Sans" w:cs="DejaVu Sans"/>
-          <w:sz w:val="22"/>
-        </w:rPr>
-        <w:t xml:space="preserve">                return res_char.upper()</w:t>
-      </w:r>
-    </w:p>
-    <w:p>
-      <w:pPr>
-        <w:spacing w:line="240" w:lineRule="auto"/>
-        <w:ind w:firstLine="0"/>
-      </w:pPr>
-      <w:r>
-        <w:rPr>
-          <w:rFonts w:ascii="DejaVu Sans" w:eastAsia="DejaVu Sans" w:hAnsi="DejaVu Sans" w:cs="DejaVu Sans"/>
-          <w:sz w:val="22"/>
-        </w:rPr>
-        <w:t xml:space="preserve">            elif case_mode == "lower":</w:t>
-      </w:r>
-    </w:p>
-    <w:p>
-      <w:pPr>
-        <w:spacing w:line="240" w:lineRule="auto"/>
-        <w:ind w:firstLine="0"/>
-      </w:pPr>
-      <w:r>
-        <w:rPr>
-          <w:rFonts w:ascii="DejaVu Sans" w:eastAsia="DejaVu Sans" w:hAnsi="DejaVu Sans" w:cs="DejaVu Sans"/>
-          <w:sz w:val="22"/>
-        </w:rPr>
-        <w:t xml:space="preserve">                return res_char.lower()</w:t>
-      </w:r>
-    </w:p>
-    <w:p>
-      <w:pPr>
-        <w:spacing w:line="240" w:lineRule="auto"/>
-        <w:ind w:firstLine="0"/>
-      </w:pPr>
-      <w:r>
-        <w:rPr>
-          <w:rFonts w:ascii="DejaVu Sans" w:eastAsia="DejaVu Sans" w:hAnsi="DejaVu Sans" w:cs="DejaVu Sans"/>
-          <w:sz w:val="22"/>
-        </w:rPr>
-        <w:t xml:space="preserve">            return res_char</w:t>
-      </w:r>
-    </w:p>
-    <w:p>
-      <w:pPr>
-        <w:spacing w:line="240" w:lineRule="auto"/>
-        <w:ind w:firstLine="0"/>
-      </w:pPr>
-      <w:r>
-        <w:rPr>
-          <w:rFonts w:ascii="DejaVu Sans" w:eastAsia="DejaVu Sans" w:hAnsi="DejaVu Sans" w:cs="DejaVu Sans"/>
-          <w:sz w:val="22"/>
-        </w:rPr>
-        <w:t xml:space="preserve">        return char</w:t>
-      </w:r>
-    </w:p>
-    <w:p>
-      <w:pPr>
-        <w:spacing w:line="240" w:lineRule="auto"/>
-        <w:ind w:firstLine="0"/>
-      </w:pPr>
-    </w:p>
-    <w:p>
-      <w:pPr>
-        <w:spacing w:line="240" w:lineRule="auto"/>
-        <w:ind w:firstLine="0"/>
-      </w:pPr>
-      <w:r>
-        <w:rPr>
-          <w:rFonts w:ascii="DejaVu Sans" w:eastAsia="DejaVu Sans" w:hAnsi="DejaVu Sans" w:cs="DejaVu Sans"/>
-          <w:sz w:val="22"/>
-        </w:rPr>
-        <w:t xml:space="preserve">    def decrypt_symbol(</w:t>
-      </w:r>
-    </w:p>
-    <w:p>
-      <w:pPr>
-        <w:spacing w:line="240" w:lineRule="auto"/>
-        <w:ind w:firstLine="0"/>
-      </w:pPr>
-      <w:r>
-        <w:rPr>
-          <w:rFonts w:ascii="DejaVu Sans" w:eastAsia="DejaVu Sans" w:hAnsi="DejaVu Sans" w:cs="DejaVu Sans"/>
-          <w:sz w:val="22"/>
-        </w:rPr>
-        <w:t xml:space="preserve">        self,</w:t>
-      </w:r>
-    </w:p>
-    <w:p>
-      <w:pPr>
-        <w:spacing w:line="240" w:lineRule="auto"/>
-        <w:ind w:firstLine="0"/>
-      </w:pPr>
-      <w:r>
-        <w:rPr>
-          <w:rFonts w:ascii="DejaVu Sans" w:eastAsia="DejaVu Sans" w:hAnsi="DejaVu Sans" w:cs="DejaVu Sans"/>
-          <w:sz w:val="22"/>
-        </w:rPr>
-        <w:t xml:space="preserve">        char: str,</w:t>
-      </w:r>
-    </w:p>
-    <w:p>
-      <w:pPr>
-        <w:spacing w:line="240" w:lineRule="auto"/>
-        <w:ind w:firstLine="0"/>
-      </w:pPr>
-      <w:r>
-        <w:rPr>
-          <w:rFonts w:ascii="DejaVu Sans" w:eastAsia="DejaVu Sans" w:hAnsi="DejaVu Sans" w:cs="DejaVu Sans"/>
-          <w:sz w:val="22"/>
-        </w:rPr>
-        <w:t xml:space="preserve">        k: int,</w:t>
-      </w:r>
-    </w:p>
-    <w:p>
-      <w:pPr>
-        <w:spacing w:line="240" w:lineRule="auto"/>
-        <w:ind w:firstLine="0"/>
-      </w:pPr>
-      <w:r>
-        <w:rPr>
-          <w:rFonts w:ascii="DejaVu Sans" w:eastAsia="DejaVu Sans" w:hAnsi="DejaVu Sans" w:cs="DejaVu Sans"/>
-          <w:sz w:val="22"/>
-        </w:rPr>
-        <w:t xml:space="preserve">        case_mode: str = "lower",</w:t>
-      </w:r>
-    </w:p>
-    <w:p>
-      <w:pPr>
-        <w:spacing w:line="240" w:lineRule="auto"/>
-        <w:ind w:firstLine="0"/>
-      </w:pPr>
-      <w:r>
-        <w:rPr>
-          <w:rFonts w:ascii="DejaVu Sans" w:eastAsia="DejaVu Sans" w:hAnsi="DejaVu Sans" w:cs="DejaVu Sans"/>
-          <w:sz w:val="22"/>
-        </w:rPr>
-        <w:t xml:space="preserve">        preserve_case: Optional[bool] = None</w:t>
-      </w:r>
-    </w:p>
-    <w:p>
-      <w:pPr>
-        <w:spacing w:line="240" w:lineRule="auto"/>
-        <w:ind w:firstLine="0"/>
-      </w:pPr>
-      <w:r>
-        <w:rPr>
-          <w:rFonts w:ascii="DejaVu Sans" w:eastAsia="DejaVu Sans" w:hAnsi="DejaVu Sans" w:cs="DejaVu Sans"/>
-          <w:sz w:val="22"/>
-        </w:rPr>
-        <w:t xml:space="preserve">    ) -&gt; str:</w:t>
-      </w:r>
-    </w:p>
-    <w:p>
-      <w:pPr>
-        <w:spacing w:line="240" w:lineRule="auto"/>
-        <w:ind w:firstLine="0"/>
-      </w:pPr>
-      <w:r>
-        <w:rPr>
-          <w:rFonts w:ascii="DejaVu Sans" w:eastAsia="DejaVu Sans" w:hAnsi="DejaVu Sans" w:cs="DejaVu Sans"/>
-          <w:sz w:val="22"/>
-        </w:rPr>
-        <w:t xml:space="preserve">        return self.encrypt_symbol(char, -k, case_mode=case_mode, preserve_case=preserve_case)</w:t>
-      </w:r>
-    </w:p>
-    <w:p>
-      <w:pPr>
-        <w:spacing w:line="240" w:lineRule="auto"/>
-        <w:ind w:firstLine="0"/>
-      </w:pPr>
-    </w:p>
-    <w:p>
-      <w:pPr>
-        <w:spacing w:line="240" w:lineRule="auto"/>
-        <w:ind w:firstLine="0"/>
-      </w:pPr>
-      <w:r>
-        <w:rPr>
-          <w:rFonts w:ascii="DejaVu Sans" w:eastAsia="DejaVu Sans" w:hAnsi="DejaVu Sans" w:cs="DejaVu Sans"/>
-          <w:sz w:val="22"/>
-        </w:rPr>
-        <w:t xml:space="preserve">    def prepare_canonical_text(self, text: str) -&gt; str:</w:t>
-      </w:r>
-    </w:p>
-    <w:p>
-      <w:pPr>
-        <w:spacing w:line="240" w:lineRule="auto"/>
-        <w:ind w:firstLine="0"/>
-      </w:pPr>
-      <w:r>
-        <w:rPr>
-          <w:rFonts w:ascii="DejaVu Sans" w:eastAsia="DejaVu Sans" w:hAnsi="DejaVu Sans" w:cs="DejaVu Sans"/>
-          <w:sz w:val="22"/>
-        </w:rPr>
-        <w:t xml:space="preserve">        return "".join(self.normalize_char(c) for c in text if self.normalize_char(c) in self.char_to_code)</w:t>
-      </w:r>
-    </w:p>
-    <w:p>
-      <w:pPr>
-        <w:spacing w:line="240" w:lineRule="auto"/>
-        <w:ind w:firstLine="0"/>
-      </w:pPr>
-    </w:p>
-    <w:p>
-      <w:pPr>
-        <w:spacing w:line="240" w:lineRule="auto"/>
-        <w:ind w:firstLine="0"/>
-      </w:pPr>
-      <w:r>
-        <w:rPr>
-          <w:rFonts w:ascii="DejaVu Sans" w:eastAsia="DejaVu Sans" w:hAnsi="DejaVu Sans" w:cs="DejaVu Sans"/>
-          <w:sz w:val="22"/>
-        </w:rPr>
-        <w:t xml:space="preserve">    def encrypt(</w:t>
-      </w:r>
-    </w:p>
-    <w:p>
-      <w:pPr>
-        <w:spacing w:line="240" w:lineRule="auto"/>
-        <w:ind w:firstLine="0"/>
-      </w:pPr>
-      <w:r>
-        <w:rPr>
-          <w:rFonts w:ascii="DejaVu Sans" w:eastAsia="DejaVu Sans" w:hAnsi="DejaVu Sans" w:cs="DejaVu Sans"/>
-          <w:sz w:val="22"/>
-        </w:rPr>
-        <w:t xml:space="preserve">        self,</w:t>
-      </w:r>
-    </w:p>
-    <w:p>
-      <w:pPr>
-        <w:spacing w:line="240" w:lineRule="auto"/>
-        <w:ind w:firstLine="0"/>
-      </w:pPr>
-      <w:r>
-        <w:rPr>
-          <w:rFonts w:ascii="DejaVu Sans" w:eastAsia="DejaVu Sans" w:hAnsi="DejaVu Sans" w:cs="DejaVu Sans"/>
-          <w:sz w:val="22"/>
-        </w:rPr>
-        <w:t xml:space="preserve">        text: str,</w:t>
-      </w:r>
-    </w:p>
-    <w:p>
-      <w:pPr>
-        <w:spacing w:line="240" w:lineRule="auto"/>
-        <w:ind w:firstLine="0"/>
-      </w:pPr>
-      <w:r>
-        <w:rPr>
-          <w:rFonts w:ascii="DejaVu Sans" w:eastAsia="DejaVu Sans" w:hAnsi="DejaVu Sans" w:cs="DejaVu Sans"/>
-          <w:sz w:val="22"/>
-        </w:rPr>
-        <w:t xml:space="preserve">        k: int,</w:t>
-      </w:r>
-    </w:p>
-    <w:p>
-      <w:pPr>
-        <w:spacing w:line="240" w:lineRule="auto"/>
-        <w:ind w:firstLine="0"/>
-      </w:pPr>
-      <w:r>
-        <w:rPr>
-          <w:rFonts w:ascii="DejaVu Sans" w:eastAsia="DejaVu Sans" w:hAnsi="DejaVu Sans" w:cs="DejaVu Sans"/>
-          <w:sz w:val="22"/>
-        </w:rPr>
-        <w:t xml:space="preserve">        filter_non_alpha: bool = False,</w:t>
-      </w:r>
-    </w:p>
-    <w:p>
-      <w:pPr>
-        <w:spacing w:line="240" w:lineRule="auto"/>
-        <w:ind w:firstLine="0"/>
-      </w:pPr>
-      <w:r>
-        <w:rPr>
-          <w:rFonts w:ascii="DejaVu Sans" w:eastAsia="DejaVu Sans" w:hAnsi="DejaVu Sans" w:cs="DejaVu Sans"/>
-          <w:sz w:val="22"/>
-        </w:rPr>
-        <w:t xml:space="preserve">        case_mode: str = "lower",</w:t>
-      </w:r>
-    </w:p>
-    <w:p>
-      <w:pPr>
-        <w:spacing w:line="240" w:lineRule="auto"/>
-        <w:ind w:firstLine="0"/>
-      </w:pPr>
-      <w:r>
-        <w:rPr>
-          <w:rFonts w:ascii="DejaVu Sans" w:eastAsia="DejaVu Sans" w:hAnsi="DejaVu Sans" w:cs="DejaVu Sans"/>
-          <w:sz w:val="22"/>
-        </w:rPr>
-        <w:t xml:space="preserve">        preserve_case: Optional[bool] = None</w:t>
-      </w:r>
-    </w:p>
-    <w:p>
-      <w:pPr>
-        <w:spacing w:line="240" w:lineRule="auto"/>
-        <w:ind w:firstLine="0"/>
-      </w:pPr>
-      <w:r>
-        <w:rPr>
-          <w:rFonts w:ascii="DejaVu Sans" w:eastAsia="DejaVu Sans" w:hAnsi="DejaVu Sans" w:cs="DejaVu Sans"/>
-          <w:sz w:val="22"/>
-        </w:rPr>
-        <w:t xml:space="preserve">    ) -&gt; str:</w:t>
-      </w:r>
-    </w:p>
-    <w:p>
-      <w:pPr>
-        <w:spacing w:line="240" w:lineRule="auto"/>
-        <w:ind w:firstLine="0"/>
-      </w:pPr>
-      <w:r>
-        <w:rPr>
-          <w:rFonts w:ascii="DejaVu Sans" w:eastAsia="DejaVu Sans" w:hAnsi="DejaVu Sans" w:cs="DejaVu Sans"/>
-          <w:sz w:val="22"/>
-        </w:rPr>
-        <w:t xml:space="preserve">        if preserve_case is not None:</w:t>
-      </w:r>
-    </w:p>
-    <w:p>
-      <w:pPr>
-        <w:spacing w:line="240" w:lineRule="auto"/>
-        <w:ind w:firstLine="0"/>
-      </w:pPr>
-      <w:r>
-        <w:rPr>
-          <w:rFonts w:ascii="DejaVu Sans" w:eastAsia="DejaVu Sans" w:hAnsi="DejaVu Sans" w:cs="DejaVu Sans"/>
-          <w:sz w:val="22"/>
-        </w:rPr>
-        <w:t xml:space="preserve">            case_mode = "preserve" if preserve_case else "lower"</w:t>
-      </w:r>
-    </w:p>
-    <w:p>
-      <w:pPr>
-        <w:spacing w:line="240" w:lineRule="auto"/>
-        <w:ind w:firstLine="0"/>
-      </w:pPr>
-      <w:r>
-        <w:rPr>
-          <w:rFonts w:ascii="DejaVu Sans" w:eastAsia="DejaVu Sans" w:hAnsi="DejaVu Sans" w:cs="DejaVu Sans"/>
-          <w:sz w:val="22"/>
-        </w:rPr>
-        <w:t xml:space="preserve">        if filter_non_alpha:</w:t>
-      </w:r>
-    </w:p>
-    <w:p>
-      <w:pPr>
-        <w:spacing w:line="240" w:lineRule="auto"/>
-        <w:ind w:firstLine="0"/>
-      </w:pPr>
-      <w:r>
-        <w:rPr>
-          <w:rFonts w:ascii="DejaVu Sans" w:eastAsia="DejaVu Sans" w:hAnsi="DejaVu Sans" w:cs="DejaVu Sans"/>
-          <w:sz w:val="22"/>
-        </w:rPr>
-        <w:t xml:space="preserve">            src = self.prepare_canonical_text(text)</w:t>
-      </w:r>
-    </w:p>
-    <w:p>
-      <w:pPr>
-        <w:spacing w:line="240" w:lineRule="auto"/>
-        <w:ind w:firstLine="0"/>
-      </w:pPr>
-      <w:r>
-        <w:rPr>
-          <w:rFonts w:ascii="DejaVu Sans" w:eastAsia="DejaVu Sans" w:hAnsi="DejaVu Sans" w:cs="DejaVu Sans"/>
-          <w:sz w:val="22"/>
-        </w:rPr>
-        <w:t xml:space="preserve">            return "".join(self.encrypt_symbol(c, k, case_mode="lower") for c in src)</w:t>
-      </w:r>
-    </w:p>
-    <w:p>
-      <w:pPr>
-        <w:spacing w:line="240" w:lineRule="auto"/>
-        <w:ind w:firstLine="0"/>
-      </w:pPr>
-      <w:r>
-        <w:rPr>
-          <w:rFonts w:ascii="DejaVu Sans" w:eastAsia="DejaVu Sans" w:hAnsi="DejaVu Sans" w:cs="DejaVu Sans"/>
-          <w:sz w:val="22"/>
-        </w:rPr>
-        <w:t xml:space="preserve">        return "".join(self.encrypt_symbol(c, k, case_mode=case_mode) for c in text)</w:t>
-      </w:r>
-    </w:p>
-    <w:p>
-      <w:pPr>
-        <w:spacing w:line="240" w:lineRule="auto"/>
-        <w:ind w:firstLine="0"/>
-      </w:pPr>
-    </w:p>
-    <w:p>
-      <w:pPr>
-        <w:spacing w:line="240" w:lineRule="auto"/>
-        <w:ind w:firstLine="0"/>
-      </w:pPr>
-      <w:r>
-        <w:rPr>
-          <w:rFonts w:ascii="DejaVu Sans" w:eastAsia="DejaVu Sans" w:hAnsi="DejaVu Sans" w:cs="DejaVu Sans"/>
-          <w:sz w:val="22"/>
-        </w:rPr>
-        <w:t xml:space="preserve">    def decrypt(</w:t>
-      </w:r>
-    </w:p>
-    <w:p>
-      <w:pPr>
-        <w:spacing w:line="240" w:lineRule="auto"/>
-        <w:ind w:firstLine="0"/>
-      </w:pPr>
-      <w:r>
-        <w:rPr>
-          <w:rFonts w:ascii="DejaVu Sans" w:eastAsia="DejaVu Sans" w:hAnsi="DejaVu Sans" w:cs="DejaVu Sans"/>
-          <w:sz w:val="22"/>
-        </w:rPr>
-        <w:t xml:space="preserve">        self,</w:t>
-      </w:r>
-    </w:p>
-    <w:p>
-      <w:pPr>
-        <w:spacing w:line="240" w:lineRule="auto"/>
-        <w:ind w:firstLine="0"/>
-      </w:pPr>
-      <w:r>
-        <w:rPr>
-          <w:rFonts w:ascii="DejaVu Sans" w:eastAsia="DejaVu Sans" w:hAnsi="DejaVu Sans" w:cs="DejaVu Sans"/>
-          <w:sz w:val="22"/>
-        </w:rPr>
-        <w:t xml:space="preserve">        text: str,</w:t>
-      </w:r>
-    </w:p>
-    <w:p>
-      <w:pPr>
-        <w:spacing w:line="240" w:lineRule="auto"/>
-        <w:ind w:firstLine="0"/>
-      </w:pPr>
-      <w:r>
-        <w:rPr>
-          <w:rFonts w:ascii="DejaVu Sans" w:eastAsia="DejaVu Sans" w:hAnsi="DejaVu Sans" w:cs="DejaVu Sans"/>
-          <w:sz w:val="22"/>
-        </w:rPr>
-        <w:t xml:space="preserve">        k: int,</w:t>
-      </w:r>
-    </w:p>
-    <w:p>
-      <w:pPr>
-        <w:spacing w:line="240" w:lineRule="auto"/>
-        <w:ind w:firstLine="0"/>
-      </w:pPr>
-      <w:r>
-        <w:rPr>
-          <w:rFonts w:ascii="DejaVu Sans" w:eastAsia="DejaVu Sans" w:hAnsi="DejaVu Sans" w:cs="DejaVu Sans"/>
-          <w:sz w:val="22"/>
-        </w:rPr>
-        <w:t xml:space="preserve">        case_mode: str = "lower",</w:t>
-      </w:r>
-    </w:p>
-    <w:p>
-      <w:pPr>
-        <w:spacing w:line="240" w:lineRule="auto"/>
-        <w:ind w:firstLine="0"/>
-      </w:pPr>
-      <w:r>
-        <w:rPr>
-          <w:rFonts w:ascii="DejaVu Sans" w:eastAsia="DejaVu Sans" w:hAnsi="DejaVu Sans" w:cs="DejaVu Sans"/>
-          <w:sz w:val="22"/>
-        </w:rPr>
-        <w:t xml:space="preserve">        preserve_case: Optional[bool] = None</w:t>
-      </w:r>
-    </w:p>
-    <w:p>
-      <w:pPr>
-        <w:spacing w:line="240" w:lineRule="auto"/>
-        <w:ind w:firstLine="0"/>
-      </w:pPr>
-      <w:r>
-        <w:rPr>
-          <w:rFonts w:ascii="DejaVu Sans" w:eastAsia="DejaVu Sans" w:hAnsi="DejaVu Sans" w:cs="DejaVu Sans"/>
-          <w:sz w:val="22"/>
-        </w:rPr>
-        <w:t xml:space="preserve">    ) -&gt; str:</w:t>
-      </w:r>
-    </w:p>
-    <w:p>
-      <w:pPr>
-        <w:spacing w:line="240" w:lineRule="auto"/>
-        <w:ind w:firstLine="0"/>
-      </w:pPr>
-      <w:r>
-        <w:rPr>
-          <w:rFonts w:ascii="DejaVu Sans" w:eastAsia="DejaVu Sans" w:hAnsi="DejaVu Sans" w:cs="DejaVu Sans"/>
-          <w:sz w:val="22"/>
-        </w:rPr>
-        <w:t xml:space="preserve">        return self.encrypt(text, -k, filter_non_alpha=False, case_mode=case_mode, preserve_case=preserve_case)</w:t>
-      </w:r>
-    </w:p>
-    <w:p>
-      <w:pPr>
-        <w:spacing w:line="240" w:lineRule="auto"/>
-        <w:ind w:firstLine="0"/>
-      </w:pPr>
-    </w:p>
-    <w:p>
-      <w:pPr>
-        <w:spacing w:line="240" w:lineRule="auto"/>
-        <w:ind w:firstLine="0"/>
-      </w:pPr>
-      <w:r>
-        <w:rPr>
-          <w:rFonts w:ascii="DejaVu Sans" w:eastAsia="DejaVu Sans" w:hAnsi="DejaVu Sans" w:cs="DejaVu Sans"/>
-          <w:sz w:val="22"/>
-        </w:rPr>
-        <w:t xml:space="preserve">    def brute_force(</w:t>
-      </w:r>
-    </w:p>
-    <w:p>
-      <w:pPr>
-        <w:spacing w:line="240" w:lineRule="auto"/>
-        <w:ind w:firstLine="0"/>
-      </w:pPr>
-      <w:r>
-        <w:rPr>
-          <w:rFonts w:ascii="DejaVu Sans" w:eastAsia="DejaVu Sans" w:hAnsi="DejaVu Sans" w:cs="DejaVu Sans"/>
-          <w:sz w:val="22"/>
-        </w:rPr>
-        <w:t xml:space="preserve">        self,</w:t>
-      </w:r>
-    </w:p>
-    <w:p>
-      <w:pPr>
-        <w:spacing w:line="240" w:lineRule="auto"/>
-        <w:ind w:firstLine="0"/>
-      </w:pPr>
-      <w:r>
-        <w:rPr>
-          <w:rFonts w:ascii="DejaVu Sans" w:eastAsia="DejaVu Sans" w:hAnsi="DejaVu Sans" w:cs="DejaVu Sans"/>
-          <w:sz w:val="22"/>
-        </w:rPr>
-        <w:t xml:space="preserve">        ciphertext: str,</w:t>
-      </w:r>
-    </w:p>
-    <w:p>
-      <w:pPr>
-        <w:spacing w:line="240" w:lineRule="auto"/>
-        <w:ind w:firstLine="0"/>
-      </w:pPr>
-      <w:r>
-        <w:rPr>
-          <w:rFonts w:ascii="DejaVu Sans" w:eastAsia="DejaVu Sans" w:hAnsi="DejaVu Sans" w:cs="DejaVu Sans"/>
-          <w:sz w:val="22"/>
-        </w:rPr>
-        <w:t xml:space="preserve">        filter_non_alpha: bool = False,</w:t>
-      </w:r>
-    </w:p>
-    <w:p>
-      <w:pPr>
-        <w:spacing w:line="240" w:lineRule="auto"/>
-        <w:ind w:firstLine="0"/>
-      </w:pPr>
-      <w:r>
-        <w:rPr>
-          <w:rFonts w:ascii="DejaVu Sans" w:eastAsia="DejaVu Sans" w:hAnsi="DejaVu Sans" w:cs="DejaVu Sans"/>
-          <w:sz w:val="22"/>
-        </w:rPr>
-        <w:t xml:space="preserve">        case_mode: str = "lower"</w:t>
-      </w:r>
-    </w:p>
-    <w:p>
-      <w:pPr>
-        <w:spacing w:line="240" w:lineRule="auto"/>
-        <w:ind w:firstLine="0"/>
-      </w:pPr>
-      <w:r>
-        <w:rPr>
-          <w:rFonts w:ascii="DejaVu Sans" w:eastAsia="DejaVu Sans" w:hAnsi="DejaVu Sans" w:cs="DejaVu Sans"/>
-          <w:sz w:val="22"/>
-        </w:rPr>
-        <w:t xml:space="preserve">    ) -&gt; List[Tuple[int, str]]:</w:t>
-      </w:r>
-    </w:p>
-    <w:p>
-      <w:pPr>
-        <w:spacing w:line="240" w:lineRule="auto"/>
-        <w:ind w:firstLine="0"/>
-      </w:pPr>
-      <w:r>
-        <w:rPr>
-          <w:rFonts w:ascii="DejaVu Sans" w:eastAsia="DejaVu Sans" w:hAnsi="DejaVu Sans" w:cs="DejaVu Sans"/>
-          <w:sz w:val="22"/>
-        </w:rPr>
-        <w:t xml:space="preserve">        return [</w:t>
-      </w:r>
-    </w:p>
-    <w:p>
-      <w:pPr>
-        <w:spacing w:line="240" w:lineRule="auto"/>
-        <w:ind w:firstLine="0"/>
-      </w:pPr>
-      <w:r>
-        <w:rPr>
-          <w:rFonts w:ascii="DejaVu Sans" w:eastAsia="DejaVu Sans" w:hAnsi="DejaVu Sans" w:cs="DejaVu Sans"/>
-          <w:sz w:val="22"/>
-        </w:rPr>
-        <w:t xml:space="preserve">            (k, self.decrypt(ciphertext, k, case_mode=case_mode))</w:t>
-      </w:r>
-    </w:p>
-    <w:p>
-      <w:pPr>
-        <w:spacing w:line="240" w:lineRule="auto"/>
-        <w:ind w:firstLine="0"/>
-      </w:pPr>
-      <w:r>
-        <w:rPr>
-          <w:rFonts w:ascii="DejaVu Sans" w:eastAsia="DejaVu Sans" w:hAnsi="DejaVu Sans" w:cs="DejaVu Sans"/>
-          <w:sz w:val="22"/>
-        </w:rPr>
-        <w:t xml:space="preserve">            for k in range(1, self.power)</w:t>
-      </w:r>
-    </w:p>
-    <w:p>
-      <w:pPr>
-        <w:spacing w:after="120" w:line="240" w:lineRule="auto"/>
-        <w:ind w:firstLine="0"/>
-      </w:pPr>
-      <w:r>
-        <w:rPr>
-          <w:rFonts w:ascii="DejaVu Sans" w:eastAsia="DejaVu Sans" w:hAnsi="DejaVu Sans" w:cs="DejaVu Sans"/>
-          <w:sz w:val="22"/>
-        </w:rPr>
-        <w:t xml:space="preserve">        ]</w:t>
-      </w:r>
-    </w:p>
-    <w:p>
-      <w:pPr>
-        <w:pStyle w:val="1"/>
-        <w:pageBreakBefore/>
-      </w:pPr>
-      <w:bookmarkStart w:id="5" w:name="_Toc241610198"/>
-      <w:r>
-        <w:rPr>
-          <w:rFonts w:ascii="Times New Roman" w:eastAsia="Times New Roman" w:hAnsi="Times New Roman" w:cs="Times New Roman"/>
-          <w:b w:val="0"/>
-        </w:rPr>
-        <w:lastRenderedPageBreak/>
-        <w:t>ЗАКЛЮЧЕНИЕ</w:t>
-      </w:r>
-      <w:bookmarkEnd w:id="5"/>
-    </w:p>
-    <w:p>
-      <w:pPr>
-        <w:jc w:val="both"/>
-      </w:pPr>
-      <w:r>
-        <w:t>В ходе выполнения лабораторной работы были получены следующие основные результаты:</w:t>
-      </w:r>
-    </w:p>
-    <w:p>
-      <w:pPr>
-        <w:ind w:left="425" w:firstLine="0"/>
-        <w:jc w:val="both"/>
-      </w:pPr>
-      <w:r>
-        <w:t xml:space="preserve">1. </w:t>
-      </w:r>
-      <w:r>
-        <w:t xml:space="preserve">Изучены математические основы моноалфавитной замены и модулярной арифметики на примере симметричного шифра Цезаря в кольце вычетов </w:t>
+        <w:rPr>
+          <w:lang w:val="ru-RU"/>
+        </w:rPr>
+      </w:pPr>
+      <w:r>
+        <w:rPr>
+          <w:lang w:val="ru-RU"/>
+        </w:rPr>
+        <w:t xml:space="preserve">1. Изучены математические основы моноалфавитной замены и модулярной арифметики на примере симметричного шифра Цезаря в кольце вычетов </w:t>
       </w:r>
       <m:oMath>
         <m:box>
@@ -5698,6 +6166,7 @@
                   </m:rPr>
                   <w:rPr>
                     <w:rFonts w:ascii="Cambria Math" w:hAnsi="Cambria Math"/>
+                    <w:lang w:val="ru-RU"/>
                   </w:rPr>
                   <m:t>Z</m:t>
                 </m:r>
@@ -5715,6 +6184,9 @@
         </m:box>
       </m:oMath>
       <w:r>
+        <w:rPr>
+          <w:lang w:val="ru-RU"/>
+        </w:rPr>
         <w:t>.</w:t>
       </w:r>
     </w:p>
@@ -5722,8 +6194,14 @@
       <w:pPr>
         <w:ind w:left="425" w:firstLine="0"/>
         <w:jc w:val="both"/>
-      </w:pPr>
-      <w:r>
+        <w:rPr>
+          <w:lang w:val="ru-RU"/>
+        </w:rPr>
+      </w:pPr>
+      <w:r>
+        <w:rPr>
+          <w:lang w:val="ru-RU"/>
+        </w:rPr>
         <w:t xml:space="preserve">2. Разработан программный модуль на языке </w:t>
       </w:r>
       <w:r>
@@ -5733,6 +6211,9 @@
         <w:t>Python</w:t>
       </w:r>
       <w:r>
+        <w:rPr>
+          <w:lang w:val="ru-RU"/>
+        </w:rPr>
         <w:t>, реализующий алгоритмы посимвольного шифрования, дешифрования и исчерпывающего перебора ключевого пространства.</w:t>
       </w:r>
     </w:p>
@@ -5740,8 +6221,14 @@
       <w:pPr>
         <w:ind w:left="425" w:firstLine="0"/>
         <w:jc w:val="both"/>
-      </w:pPr>
-      <w:r>
+        <w:rPr>
+          <w:lang w:val="ru-RU"/>
+        </w:rPr>
+      </w:pPr>
+      <w:r>
+        <w:rPr>
+          <w:lang w:val="ru-RU"/>
+        </w:rPr>
         <w:t xml:space="preserve">3. Проведен криптоанализ перехваченного шифр-текста индивидуального варианта 16. Установлен истинный ключ </w:t>
       </w:r>
       <m:oMath>
@@ -5766,6 +6253,7 @@
               </m:rPr>
               <w:rPr>
                 <w:rFonts w:ascii="Cambria Math" w:hAnsi="Cambria Math"/>
+                <w:lang w:val="ru-RU"/>
               </w:rPr>
               <m:t>=17</m:t>
             </m:r>
@@ -5773,6 +6261,9 @@
         </m:box>
       </m:oMath>
       <w:r>
+        <w:rPr>
+          <w:lang w:val="ru-RU"/>
+        </w:rPr>
         <w:t>, восстановлен исходный открытый текст цитаты из произведения М. Ю. Лермонтова «Выхожу один я на дорогу», и выполнено контрольное зашифрование авторской строки.</w:t>
       </w:r>
     </w:p>
@@ -5780,8 +6271,14 @@
       <w:pPr>
         <w:ind w:left="425" w:firstLine="0"/>
         <w:jc w:val="both"/>
-      </w:pPr>
-      <w:r>
+        <w:rPr>
+          <w:lang w:val="ru-RU"/>
+        </w:rPr>
+      </w:pPr>
+      <w:r>
+        <w:rPr>
+          <w:lang w:val="ru-RU"/>
+        </w:rPr>
         <w:t>4. Практически подтверждена абсолютная криптографическая нестойкость шифра Цезаря к атаке на основе только шифр-текста вследствие малого объема пространства возможных ключей (</w:t>
       </w:r>
       <m:oMath>
@@ -5806,6 +6303,7 @@
               </m:rPr>
               <w:rPr>
                 <w:rFonts w:ascii="Cambria Math" w:hAnsi="Cambria Math"/>
+                <w:lang w:val="ru-RU"/>
               </w:rPr>
               <m:t>-1=31</m:t>
             </m:r>
@@ -5813,28 +6311,26 @@
         </m:box>
       </m:oMath>
       <w:r>
+        <w:rPr>
+          <w:lang w:val="ru-RU"/>
+        </w:rPr>
         <w:t>).</w:t>
-      </w:r>
-    </w:p>
-    <w:p>
-      <w:pPr>
-        <w:ind w:left="425" w:firstLine="0"/>
-        <w:jc w:val="both"/>
-      </w:pPr>
-      <w:r>
-        <w:t>5. Отчет оформлен в соответствии с требованиями кафедры ПМиФИ ОмГТУ и шаблоном Приложения 1 методических указаний.</w:t>
       </w:r>
     </w:p>
     <w:p>
       <w:pPr>
         <w:pStyle w:val="1"/>
         <w:pageBreakBefore/>
+        <w:rPr>
+          <w:lang w:val="ru-RU"/>
+        </w:rPr>
       </w:pPr>
       <w:bookmarkStart w:id="6" w:name="_Toc241610199"/>
       <w:r>
         <w:rPr>
           <w:rFonts w:ascii="Times New Roman" w:eastAsia="Times New Roman" w:hAnsi="Times New Roman" w:cs="Times New Roman"/>
           <w:b w:val="0"/>
+          <w:lang w:val="ru-RU"/>
         </w:rPr>
         <w:lastRenderedPageBreak/>
         <w:t>СПИСОК ИСПОЛЬЗОВАННЫХ ИСТОЧНИКОВ</w:t>
@@ -5844,31 +6340,133 @@
     <w:p>
       <w:pPr>
         <w:jc w:val="both"/>
-      </w:pPr>
-      <w:r>
-        <w:t xml:space="preserve">1. </w:t>
-      </w:r>
-      <w:r>
-        <w:t>Белим, С. Ю. Математические основы защиты информации : методические указания к лабораторным работам / С. Ю. Белим, С. В. Белим. — Омск : Издательство ОмГТУ, 2023. — 56 с. — Текст : электронный.</w:t>
+        <w:rPr>
+          <w:lang w:val="ru-RU"/>
+        </w:rPr>
+      </w:pPr>
+      <w:r>
+        <w:rPr>
+          <w:lang w:val="ru-RU"/>
+        </w:rPr>
+        <w:t>1. Белим, С. Ю. Математические основы защиты информации : методические указания к лабораторным работам / С. Ю. Белим, С. В. Белим. — Омск : Издательство ОмГТУ, 2023. — 56 с. — Текст : электронный.</w:t>
       </w:r>
     </w:p>
     <w:p>
       <w:pPr>
         <w:jc w:val="both"/>
-      </w:pPr>
-      <w:r>
+        <w:rPr>
+          <w:lang w:val="ru-RU"/>
+        </w:rPr>
+      </w:pPr>
+      <w:r>
+        <w:rPr>
+          <w:lang w:val="ru-RU"/>
+        </w:rPr>
         <w:t>2. Бабаш, А. В. Криптографические методы защиты информации : учебник для вузов / А. В. Бабаш, Г. П. Шанкин. — Москва : Гелиос АРВ, 2016. — 512 с. — Текст : непосредственный.</w:t>
       </w:r>
     </w:p>
     <w:p>
       <w:pPr>
         <w:jc w:val="both"/>
-      </w:pPr>
-      <w:r>
+        <w:rPr>
+          <w:lang w:val="ru-RU"/>
+        </w:rPr>
+      </w:pPr>
+      <w:r>
+        <w:rPr>
+          <w:lang w:val="ru-RU"/>
+        </w:rPr>
         <w:t xml:space="preserve">3. </w:t>
       </w:r>
       <w:r>
-        <w:t>Python 3 Documentation : [сайт] / Python Software Foundation. — URL: https://docs.python.org/3/ (дата обращения: 29.09.2026). — Текст : электронный.</w:t>
+        <w:t>Python</w:t>
+      </w:r>
+      <w:r>
+        <w:rPr>
+          <w:lang w:val="ru-RU"/>
+        </w:rPr>
+        <w:t xml:space="preserve"> 3 </w:t>
+      </w:r>
+      <w:r>
+        <w:t>Documentation</w:t>
+      </w:r>
+      <w:r>
+        <w:rPr>
+          <w:lang w:val="ru-RU"/>
+        </w:rPr>
+        <w:t xml:space="preserve"> : [сайт] / </w:t>
+      </w:r>
+      <w:r>
+        <w:t>Python</w:t>
+      </w:r>
+      <w:r>
+        <w:rPr>
+          <w:lang w:val="ru-RU"/>
+        </w:rPr>
+        <w:t xml:space="preserve"> </w:t>
+      </w:r>
+      <w:r>
+        <w:t>Software</w:t>
+      </w:r>
+      <w:r>
+        <w:rPr>
+          <w:lang w:val="ru-RU"/>
+        </w:rPr>
+        <w:t xml:space="preserve"> </w:t>
+      </w:r>
+      <w:r>
+        <w:t>Foundation</w:t>
+      </w:r>
+      <w:r>
+        <w:rPr>
+          <w:lang w:val="ru-RU"/>
+        </w:rPr>
+        <w:t xml:space="preserve">. — </w:t>
+      </w:r>
+      <w:r>
+        <w:t>URL</w:t>
+      </w:r>
+      <w:r>
+        <w:rPr>
+          <w:lang w:val="ru-RU"/>
+        </w:rPr>
+        <w:t xml:space="preserve">: </w:t>
+      </w:r>
+      <w:r>
+        <w:t>https</w:t>
+      </w:r>
+      <w:r>
+        <w:rPr>
+          <w:lang w:val="ru-RU"/>
+        </w:rPr>
+        <w:t>://</w:t>
+      </w:r>
+      <w:r>
+        <w:t>docs</w:t>
+      </w:r>
+      <w:r>
+        <w:rPr>
+          <w:lang w:val="ru-RU"/>
+        </w:rPr>
+        <w:t>.</w:t>
+      </w:r>
+      <w:r>
+        <w:t>python</w:t>
+      </w:r>
+      <w:r>
+        <w:rPr>
+          <w:lang w:val="ru-RU"/>
+        </w:rPr>
+        <w:t>.</w:t>
+      </w:r>
+      <w:r>
+        <w:t>org</w:t>
+      </w:r>
+      <w:r>
+        <w:rPr>
+          <w:lang w:val="ru-RU"/>
+        </w:rPr>
+        <w:t>/3/ (дата обращения: 29.09.2026). — Текст : электронный.</w:t>
       </w:r>
     </w:p>
     <w:sectPr>
@@ -5978,10 +6576,14 @@
       <w:spacing w:before="20"/>
       <w:ind w:firstLine="0"/>
       <w:jc w:val="center"/>
+      <w:rPr>
+        <w:lang w:val="ru-RU"/>
+      </w:rPr>
     </w:pPr>
     <w:r>
       <w:rPr>
         <w:sz w:val="24"/>
+        <w:lang w:val="ru-RU"/>
       </w:rPr>
       <w:t>Министерство науки и высшего образования РФ</w:t>
     </w:r>
@@ -5991,10 +6593,14 @@
       <w:spacing w:before="60" w:after="240" w:line="240" w:lineRule="auto"/>
       <w:ind w:firstLine="0"/>
       <w:jc w:val="center"/>
+      <w:rPr>
+        <w:lang w:val="ru-RU"/>
+      </w:rPr>
     </w:pPr>
     <w:r>
       <w:rPr>
         <w:sz w:val="24"/>
+        <w:lang w:val="ru-RU"/>
       </w:rPr>
       <w:t>федеральное государственное автономное образовательное учреждение высшего образования</w:t>
     </w:r>
@@ -6004,10 +6610,14 @@
       <w:spacing w:line="240" w:lineRule="auto"/>
       <w:ind w:left="2060" w:firstLine="0"/>
       <w:jc w:val="center"/>
+      <w:rPr>
+        <w:lang w:val="ru-RU"/>
+      </w:rPr>
     </w:pPr>
     <w:r>
       <w:rPr>
         <w:sz w:val="24"/>
+        <w:lang w:val="ru-RU"/>
       </w:rPr>
       <w:t>«Омский государственный технический университет»</w:t>
     </w:r>
@@ -6017,10 +6627,14 @@
       <w:spacing w:before="240" w:line="240" w:lineRule="auto"/>
       <w:ind w:firstLine="0"/>
       <w:jc w:val="center"/>
+      <w:rPr>
+        <w:lang w:val="ru-RU"/>
+      </w:rPr>
     </w:pPr>
     <w:r>
       <w:rPr>
         <w:sz w:val="24"/>
+        <w:lang w:val="ru-RU"/>
       </w:rPr>
       <w:t>Факультет информационных технологий и компьютерных систем</w:t>
     </w:r>
@@ -6030,10 +6644,14 @@
       <w:spacing w:before="240" w:line="240" w:lineRule="auto"/>
       <w:ind w:firstLine="0"/>
       <w:jc w:val="center"/>
+      <w:rPr>
+        <w:lang w:val="ru-RU"/>
+      </w:rPr>
     </w:pPr>
     <w:r>
       <w:rPr>
         <w:sz w:val="24"/>
+        <w:lang w:val="ru-RU"/>
       </w:rPr>
       <w:t>Кафедра «Прикладная математика и фундаментальная информатика»</w:t>
     </w:r>

</xml_diff>

<commit_message>
fix: enforce least positive residue for mod_inverse, show explicit negative Bezout conversion, and update report
</commit_message>
<xml_diff>
--- a/lab_1/report.docx
+++ b/lab_1/report.docx
@@ -42,14 +42,10 @@
         <w:spacing w:line="360" w:lineRule="auto"/>
         <w:ind w:firstLine="0"/>
         <w:jc w:val="center"/>
-        <w:rPr>
-          <w:lang w:val="ru-RU"/>
-        </w:rPr>
       </w:pPr>
       <w:r>
         <w:rPr>
           <w:b/>
-          <w:lang w:val="ru-RU"/>
         </w:rPr>
         <w:t>Лабораторная работа № 1</w:t>
       </w:r>
@@ -59,14 +55,10 @@
         <w:spacing w:line="360" w:lineRule="auto"/>
         <w:ind w:firstLine="0"/>
         <w:jc w:val="center"/>
-        <w:rPr>
-          <w:lang w:val="ru-RU"/>
-        </w:rPr>
       </w:pPr>
       <w:r>
         <w:rPr>
           <w:b/>
-          <w:lang w:val="ru-RU"/>
         </w:rPr>
         <w:t>«Шифр Цезаря»</w:t>
       </w:r>
@@ -76,9 +68,6 @@
         <w:spacing w:line="360" w:lineRule="auto"/>
         <w:ind w:firstLine="0"/>
         <w:jc w:val="center"/>
-        <w:rPr>
-          <w:lang w:val="ru-RU"/>
-        </w:rPr>
       </w:pPr>
     </w:p>
     <w:p>
@@ -86,14 +75,8 @@
         <w:spacing w:line="360" w:lineRule="auto"/>
         <w:ind w:firstLine="0"/>
         <w:jc w:val="center"/>
-        <w:rPr>
-          <w:lang w:val="ru-RU"/>
-        </w:rPr>
-      </w:pPr>
-      <w:r>
-        <w:rPr>
-          <w:lang w:val="ru-RU"/>
-        </w:rPr>
+      </w:pPr>
+      <w:r>
         <w:t>по дисциплине «Математические основы защиты информации»</w:t>
       </w:r>
     </w:p>
@@ -102,14 +85,8 @@
         <w:spacing w:line="360" w:lineRule="auto"/>
         <w:ind w:firstLine="0"/>
         <w:jc w:val="center"/>
-        <w:rPr>
-          <w:lang w:val="ru-RU"/>
-        </w:rPr>
-      </w:pPr>
-      <w:r>
-        <w:rPr>
-          <w:lang w:val="ru-RU"/>
-        </w:rPr>
+      </w:pPr>
+      <w:r>
         <w:t>Вариант 16</w:t>
       </w:r>
     </w:p>
@@ -118,9 +95,6 @@
         <w:spacing w:before="240" w:line="360" w:lineRule="auto"/>
         <w:ind w:firstLine="0"/>
         <w:jc w:val="center"/>
-        <w:rPr>
-          <w:lang w:val="ru-RU"/>
-        </w:rPr>
       </w:pPr>
     </w:p>
     <w:p>
@@ -128,244 +102,144 @@
         <w:spacing w:line="360" w:lineRule="auto"/>
         <w:ind w:firstLine="0"/>
         <w:jc w:val="center"/>
-        <w:rPr>
-          <w:lang w:val="ru-RU"/>
-        </w:rPr>
       </w:pPr>
     </w:p>
     <w:p>
       <w:pPr>
         <w:spacing w:line="360" w:lineRule="auto"/>
         <w:ind w:left="3540" w:firstLine="0"/>
-        <w:rPr>
-          <w:lang w:val="ru-RU"/>
-        </w:rPr>
       </w:pPr>
     </w:p>
     <w:p>
       <w:pPr>
         <w:spacing w:line="240" w:lineRule="auto"/>
         <w:ind w:left="3118" w:firstLine="0"/>
-        <w:rPr>
-          <w:lang w:val="ru-RU"/>
-        </w:rPr>
-      </w:pPr>
-      <w:r>
-        <w:rPr>
-          <w:lang w:val="ru-RU"/>
-        </w:rPr>
+      </w:pPr>
+      <w:r>
         <w:t>Студента</w:t>
       </w:r>
       <w:r>
-        <w:rPr>
-          <w:lang w:val="ru-RU"/>
-        </w:rPr>
         <w:tab/>
       </w:r>
       <w:r>
-        <w:rPr>
-          <w:lang w:val="ru-RU"/>
-        </w:rPr>
         <w:tab/>
-      </w:r>
-      <w:r>
-        <w:rPr>
-          <w:u w:val="single"/>
-          <w:lang w:val="ru-RU"/>
-        </w:rPr>
-        <w:t>Смирнов Никита Михайлович</w:t>
       </w:r>
       <w:r>
         <w:rPr>
           <w:u w:val="single"/>
         </w:rPr>
-        <w:t>        </w:t>
+        <w:t>Смирнов Никита Михайлович        </w:t>
       </w:r>
     </w:p>
     <w:p>
       <w:pPr>
         <w:spacing w:line="360" w:lineRule="auto"/>
         <w:ind w:left="3120" w:firstLine="0"/>
-        <w:rPr>
-          <w:lang w:val="ru-RU"/>
-        </w:rPr>
-      </w:pPr>
-      <w:r>
-        <w:rPr>
-          <w:lang w:val="ru-RU"/>
-        </w:rPr>
+      </w:pPr>
+      <w:r>
         <w:t>Курс</w:t>
       </w:r>
       <w:r>
-        <w:rPr>
-          <w:lang w:val="ru-RU"/>
-        </w:rPr>
         <w:tab/>
       </w:r>
       <w:r>
-        <w:rPr>
-          <w:lang w:val="ru-RU"/>
-        </w:rPr>
         <w:tab/>
-      </w:r>
-      <w:r>
-        <w:rPr>
-          <w:u w:val="single"/>
-          <w:lang w:val="ru-RU"/>
-        </w:rPr>
-        <w:t>2</w:t>
-      </w:r>
-      <w:r>
-        <w:rPr>
-          <w:lang w:val="ru-RU"/>
-        </w:rPr>
-        <w:tab/>
-      </w:r>
-      <w:r>
-        <w:rPr>
-          <w:lang w:val="ru-RU"/>
-        </w:rPr>
-        <w:tab/>
-        <w:t>Группа</w:t>
-      </w:r>
-      <w:r>
-        <w:rPr>
-          <w:lang w:val="ru-RU"/>
-        </w:rPr>
-        <w:tab/>
-      </w:r>
-      <w:r>
-        <w:rPr>
-          <w:u w:val="single"/>
-          <w:lang w:val="ru-RU"/>
-        </w:rPr>
-        <w:t>ФИТ-242</w:t>
-      </w:r>
-    </w:p>
-    <w:p>
-      <w:pPr>
-        <w:spacing w:line="360" w:lineRule="auto"/>
-        <w:ind w:left="5039" w:hanging="1920"/>
-        <w:rPr>
-          <w:lang w:val="ru-RU"/>
-        </w:rPr>
-      </w:pPr>
-      <w:r>
-        <w:rPr>
-          <w:lang w:val="ru-RU"/>
-        </w:rPr>
-        <w:t>Направление</w:t>
-      </w:r>
-      <w:r>
-        <w:rPr>
-          <w:lang w:val="ru-RU"/>
-        </w:rPr>
-        <w:tab/>
-      </w:r>
-      <w:r>
-        <w:rPr>
-          <w:u w:val="single"/>
-          <w:lang w:val="ru-RU"/>
-        </w:rPr>
-        <w:t>02.03.02 Фундаментальная информатика и информационные технологии</w:t>
-      </w:r>
-    </w:p>
-    <w:p>
-      <w:pPr>
-        <w:spacing w:line="240" w:lineRule="auto"/>
-        <w:ind w:left="3120" w:firstLine="0"/>
-        <w:rPr>
-          <w:lang w:val="ru-RU"/>
-        </w:rPr>
-      </w:pPr>
-      <w:r>
-        <w:rPr>
-          <w:lang w:val="ru-RU"/>
-        </w:rPr>
-        <w:t>Проверил</w:t>
-      </w:r>
-      <w:r>
-        <w:rPr>
-          <w:lang w:val="ru-RU"/>
-        </w:rPr>
-        <w:tab/>
-      </w:r>
-      <w:r>
-        <w:rPr>
-          <w:lang w:val="ru-RU"/>
-        </w:rPr>
-        <w:tab/>
-      </w:r>
-      <w:r>
-        <w:rPr>
-          <w:u w:val="single"/>
-          <w:lang w:val="ru-RU"/>
-        </w:rPr>
-        <w:t>канд. пед. наук, доцент</w:t>
       </w:r>
       <w:r>
         <w:rPr>
           <w:u w:val="single"/>
         </w:rPr>
-        <w:t>                  </w:t>
-      </w:r>
-    </w:p>
-    <w:p>
-      <w:pPr>
-        <w:spacing w:line="360" w:lineRule="auto"/>
-        <w:ind w:left="6406" w:firstLine="0"/>
-        <w:rPr>
-          <w:lang w:val="ru-RU"/>
-        </w:rPr>
-      </w:pPr>
-      <w:r>
-        <w:rPr>
-          <w:sz w:val="18"/>
-          <w:lang w:val="ru-RU"/>
-        </w:rPr>
-        <w:t>должность</w:t>
-      </w:r>
-    </w:p>
-    <w:p>
-      <w:pPr>
-        <w:spacing w:line="240" w:lineRule="auto"/>
-        <w:ind w:left="5102" w:firstLine="0"/>
-        <w:rPr>
-          <w:lang w:val="ru-RU"/>
-        </w:rPr>
-      </w:pPr>
-      <w:r>
-        <w:rPr>
-          <w:u w:val="single"/>
-          <w:lang w:val="ru-RU"/>
-        </w:rPr>
-        <w:t>Белим Светлана Юрьевна</w:t>
+        <w:t>2</w:t>
+      </w:r>
+      <w:r>
+        <w:tab/>
+      </w:r>
+      <w:r>
+        <w:tab/>
+        <w:t>Группа</w:t>
+      </w:r>
+      <w:r>
+        <w:tab/>
       </w:r>
       <w:r>
         <w:rPr>
           <w:u w:val="single"/>
         </w:rPr>
-        <w:t>                                </w:t>
+        <w:t>ФИТ-242</w:t>
+      </w:r>
+    </w:p>
+    <w:p>
+      <w:pPr>
+        <w:spacing w:line="360" w:lineRule="auto"/>
+        <w:ind w:left="5039" w:hanging="1920"/>
+      </w:pPr>
+      <w:r>
+        <w:t>Направление</w:t>
+      </w:r>
+      <w:r>
+        <w:tab/>
+      </w:r>
+      <w:r>
+        <w:rPr>
+          <w:u w:val="single"/>
+        </w:rPr>
+        <w:t>02.03.02 Фундаментальная информатика и информационные технологии</w:t>
       </w:r>
     </w:p>
     <w:p>
       <w:pPr>
         <w:spacing w:line="240" w:lineRule="auto"/>
         <w:ind w:left="3120" w:firstLine="0"/>
+      </w:pPr>
+      <w:r>
+        <w:t>Проверил</w:t>
+      </w:r>
+      <w:r>
+        <w:tab/>
+      </w:r>
+      <w:r>
+        <w:tab/>
+      </w:r>
+      <w:r>
         <w:rPr>
-          <w:lang w:val="ru-RU"/>
+          <w:u w:val="single"/>
         </w:rPr>
+        <w:t>канд. пед. наук, доцент                  </w:t>
+      </w:r>
+    </w:p>
+    <w:p>
+      <w:pPr>
+        <w:spacing w:line="360" w:lineRule="auto"/>
+        <w:ind w:left="6406" w:firstLine="0"/>
       </w:pPr>
       <w:r>
         <w:rPr>
-          <w:lang w:val="ru-RU"/>
+          <w:sz w:val="18"/>
         </w:rPr>
+        <w:t>должность</w:t>
+      </w:r>
+    </w:p>
+    <w:p>
+      <w:pPr>
+        <w:spacing w:line="240" w:lineRule="auto"/>
+        <w:ind w:left="5102" w:firstLine="0"/>
+      </w:pPr>
+      <w:r>
+        <w:rPr>
+          <w:u w:val="single"/>
+        </w:rPr>
+        <w:t>Белим Светлана Юрьевна                                </w:t>
+      </w:r>
+    </w:p>
+    <w:p>
+      <w:pPr>
+        <w:spacing w:line="240" w:lineRule="auto"/>
+        <w:ind w:left="3120" w:firstLine="0"/>
+      </w:pPr>
+      <w:r>
         <w:t>Выполнил</w:t>
       </w:r>
       <w:r>
-        <w:rPr>
-          <w:lang w:val="ru-RU"/>
-        </w:rPr>
         <w:tab/>
       </w:r>
       <w:r>
@@ -379,14 +253,10 @@
       <w:pPr>
         <w:spacing w:line="360" w:lineRule="auto"/>
         <w:ind w:left="6519" w:firstLine="0"/>
-        <w:rPr>
-          <w:lang w:val="ru-RU"/>
-        </w:rPr>
       </w:pPr>
       <w:r>
         <w:rPr>
           <w:sz w:val="18"/>
-          <w:lang w:val="ru-RU"/>
         </w:rPr>
         <w:t>дата, подпись студента</w:t>
       </w:r>
@@ -395,9 +265,6 @@
       <w:pPr>
         <w:spacing w:line="240" w:lineRule="auto"/>
         <w:ind w:left="5102" w:firstLine="0"/>
-        <w:rPr>
-          <w:lang w:val="ru-RU"/>
-        </w:rPr>
       </w:pPr>
       <w:r>
         <w:rPr>
@@ -468,7 +335,7 @@
       <w:r>
         <w:fldChar w:fldCharType="separate"/>
       </w:r>
-      <w:hyperlink w:anchor="_Toc241610193" w:history="1">
+      <w:hyperlink w:anchor="_Toc241668350" w:history="1">
         <w:r>
           <w:rPr>
             <w:rStyle w:val="aff8"/>
@@ -495,7 +362,7 @@
             <w:noProof/>
             <w:webHidden/>
           </w:rPr>
-          <w:instrText xml:space="preserve"> PAGEREF _Toc241610193 \h </w:instrText>
+          <w:instrText xml:space="preserve"> PAGEREF _Toc241668350 \h </w:instrText>
         </w:r>
         <w:r>
           <w:rPr>
@@ -542,7 +409,7 @@
           <w14:ligatures w14:val="standardContextual"/>
         </w:rPr>
       </w:pPr>
-      <w:hyperlink w:anchor="_Toc241610194" w:history="1">
+      <w:hyperlink w:anchor="_Toc241668351" w:history="1">
         <w:r>
           <w:rPr>
             <w:rStyle w:val="aff8"/>
@@ -569,7 +436,7 @@
             <w:noProof/>
             <w:webHidden/>
           </w:rPr>
-          <w:instrText xml:space="preserve"> PAGEREF _Toc241610194 \h </w:instrText>
+          <w:instrText xml:space="preserve"> PAGEREF _Toc241668351 \h </w:instrText>
         </w:r>
         <w:r>
           <w:rPr>
@@ -616,7 +483,7 @@
           <w14:ligatures w14:val="standardContextual"/>
         </w:rPr>
       </w:pPr>
-      <w:hyperlink w:anchor="_Toc241610195" w:history="1">
+      <w:hyperlink w:anchor="_Toc241668352" w:history="1">
         <w:r>
           <w:rPr>
             <w:rStyle w:val="aff8"/>
@@ -643,7 +510,7 @@
             <w:noProof/>
             <w:webHidden/>
           </w:rPr>
-          <w:instrText xml:space="preserve"> PAGEREF _Toc241610195 \h </w:instrText>
+          <w:instrText xml:space="preserve"> PAGEREF _Toc241668352 \h </w:instrText>
         </w:r>
         <w:r>
           <w:rPr>
@@ -690,7 +557,7 @@
           <w14:ligatures w14:val="standardContextual"/>
         </w:rPr>
       </w:pPr>
-      <w:hyperlink w:anchor="_Toc241610196" w:history="1">
+      <w:hyperlink w:anchor="_Toc241668353" w:history="1">
         <w:r>
           <w:rPr>
             <w:rStyle w:val="aff8"/>
@@ -717,7 +584,7 @@
             <w:noProof/>
             <w:webHidden/>
           </w:rPr>
-          <w:instrText xml:space="preserve"> PAGEREF _Toc241610196 \h </w:instrText>
+          <w:instrText xml:space="preserve"> PAGEREF _Toc241668353 \h </w:instrText>
         </w:r>
         <w:r>
           <w:rPr>
@@ -764,7 +631,7 @@
           <w14:ligatures w14:val="standardContextual"/>
         </w:rPr>
       </w:pPr>
-      <w:hyperlink w:anchor="_Toc241610197" w:history="1">
+      <w:hyperlink w:anchor="_Toc241668354" w:history="1">
         <w:r>
           <w:rPr>
             <w:rStyle w:val="aff8"/>
@@ -791,7 +658,7 @@
             <w:noProof/>
             <w:webHidden/>
           </w:rPr>
-          <w:instrText xml:space="preserve"> PAGEREF _Toc241610197 \h </w:instrText>
+          <w:instrText xml:space="preserve"> PAGEREF _Toc241668354 \h </w:instrText>
         </w:r>
         <w:r>
           <w:rPr>
@@ -838,7 +705,7 @@
           <w14:ligatures w14:val="standardContextual"/>
         </w:rPr>
       </w:pPr>
-      <w:hyperlink w:anchor="_Toc241610198" w:history="1">
+      <w:hyperlink w:anchor="_Toc241668355" w:history="1">
         <w:r>
           <w:rPr>
             <w:rStyle w:val="aff8"/>
@@ -865,7 +732,7 @@
             <w:noProof/>
             <w:webHidden/>
           </w:rPr>
-          <w:instrText xml:space="preserve"> PAGEREF _Toc241610198 \h </w:instrText>
+          <w:instrText xml:space="preserve"> PAGEREF _Toc241668355 \h </w:instrText>
         </w:r>
         <w:r>
           <w:rPr>
@@ -912,7 +779,7 @@
           <w14:ligatures w14:val="standardContextual"/>
         </w:rPr>
       </w:pPr>
-      <w:hyperlink w:anchor="_Toc241610199" w:history="1">
+      <w:hyperlink w:anchor="_Toc241668356" w:history="1">
         <w:r>
           <w:rPr>
             <w:rStyle w:val="aff8"/>
@@ -939,7 +806,7 @@
             <w:noProof/>
             <w:webHidden/>
           </w:rPr>
-          <w:instrText xml:space="preserve"> PAGEREF _Toc241610199 \h </w:instrText>
+          <w:instrText xml:space="preserve"> PAGEREF _Toc241668356 \h </w:instrText>
         </w:r>
         <w:r>
           <w:rPr>
@@ -983,16 +850,12 @@
       <w:pPr>
         <w:pStyle w:val="1"/>
         <w:pageBreakBefore/>
-        <w:rPr>
-          <w:lang w:val="ru-RU"/>
-        </w:rPr>
-      </w:pPr>
-      <w:bookmarkStart w:id="0" w:name="_Toc241610193"/>
+      </w:pPr>
+      <w:bookmarkStart w:id="0" w:name="_Toc241668350"/>
       <w:r>
         <w:rPr>
           <w:rFonts w:ascii="Times New Roman" w:eastAsia="Times New Roman" w:hAnsi="Times New Roman" w:cs="Times New Roman"/>
           <w:b w:val="0"/>
-          <w:lang w:val="ru-RU"/>
         </w:rPr>
         <w:lastRenderedPageBreak/>
         <w:t>ВВЕДЕНИЕ</w:t>
@@ -1002,53 +865,25 @@
     <w:p>
       <w:pPr>
         <w:jc w:val="both"/>
-        <w:rPr>
-          <w:lang w:val="ru-RU"/>
-        </w:rPr>
-      </w:pPr>
-      <w:r>
-        <w:rPr>
-          <w:lang w:val="ru-RU"/>
-        </w:rPr>
+      </w:pPr>
+      <w:r>
         <w:t>Цель работы – исследование математической модели и криптографических свойств классического симметричного моноалфавитного шифра Цезаря, разработка программного комплекса для прямого и обратного шифрования текстов в дискретном кольце вычетов по модулю мощности алфавита, а также реализация алгоритма криптоанализа шифр-текста методом полного перебора ключевого пространства (</w:t>
       </w:r>
       <w:r>
         <w:rPr>
           <w:i/>
         </w:rPr>
-        <w:t>brute</w:t>
-      </w:r>
-      <w:r>
-        <w:rPr>
-          <w:i/>
-          <w:lang w:val="ru-RU"/>
-        </w:rPr>
-        <w:t>-</w:t>
-      </w:r>
-      <w:r>
-        <w:rPr>
-          <w:i/>
-        </w:rPr>
-        <w:t>force</w:t>
-      </w:r>
-      <w:r>
-        <w:rPr>
-          <w:lang w:val="ru-RU"/>
-        </w:rPr>
+        <w:t>brute-force</w:t>
+      </w:r>
+      <w:r>
         <w:t>) для индивидуального варианта 16 в соответствии с методическими указаниями кафедры.</w:t>
       </w:r>
     </w:p>
     <w:p>
       <w:pPr>
         <w:jc w:val="both"/>
-        <w:rPr>
-          <w:lang w:val="ru-RU"/>
-        </w:rPr>
-      </w:pPr>
-      <w:r>
-        <w:rPr>
-          <w:lang w:val="ru-RU"/>
-        </w:rPr>
+      </w:pPr>
+      <w:r>
         <w:t>Для достижения поставленной цели необходимо решить следующие задачи:</w:t>
       </w:r>
     </w:p>
@@ -1056,14 +891,8 @@
       <w:pPr>
         <w:ind w:left="425" w:firstLine="0"/>
         <w:jc w:val="both"/>
-        <w:rPr>
-          <w:lang w:val="ru-RU"/>
-        </w:rPr>
-      </w:pPr>
-      <w:r>
-        <w:rPr>
-          <w:lang w:val="ru-RU"/>
-        </w:rPr>
+      </w:pPr>
+      <w:r>
         <w:t xml:space="preserve">1. Изучить математический аппарат моноалфавитной замены, структуру алфавитной кодировки и операции посимвольного циклического сдвига в кольце </w:t>
       </w:r>
       <m:oMath>
@@ -1091,7 +920,6 @@
                   </m:rPr>
                   <w:rPr>
                     <w:rFonts w:ascii="Cambria Math" w:hAnsi="Cambria Math"/>
-                    <w:lang w:val="ru-RU"/>
                   </w:rPr>
                   <m:t>Z</m:t>
                 </m:r>
@@ -1109,9 +937,6 @@
         </m:box>
       </m:oMath>
       <w:r>
-        <w:rPr>
-          <w:lang w:val="ru-RU"/>
-        </w:rPr>
         <w:t>.</w:t>
       </w:r>
     </w:p>
@@ -1119,14 +944,8 @@
       <w:pPr>
         <w:ind w:left="425" w:firstLine="0"/>
         <w:jc w:val="both"/>
-        <w:rPr>
-          <w:lang w:val="ru-RU"/>
-        </w:rPr>
-      </w:pPr>
-      <w:r>
-        <w:rPr>
-          <w:lang w:val="ru-RU"/>
-        </w:rPr>
+      </w:pPr>
+      <w:r>
         <w:t xml:space="preserve">2. Разработать программный модуль на языке </w:t>
       </w:r>
       <w:r>
@@ -1136,9 +955,6 @@
         <w:t>Python</w:t>
       </w:r>
       <w:r>
-        <w:rPr>
-          <w:lang w:val="ru-RU"/>
-        </w:rPr>
         <w:t>, обеспечивающий кодирование символов, прямое зашифрование, обратное расшифрование и исчерпывающий перебор ключевого пространства.</w:t>
       </w:r>
     </w:p>
@@ -1146,15 +962,12 @@
       <w:pPr>
         <w:ind w:left="425" w:firstLine="0"/>
         <w:jc w:val="both"/>
-        <w:rPr>
-          <w:lang w:val="ru-RU"/>
-        </w:rPr>
-      </w:pPr>
-      <w:r>
-        <w:rPr>
-          <w:lang w:val="ru-RU"/>
-        </w:rPr>
-        <w:t xml:space="preserve">3. Выполнить криптоанализ перехваченного шифр-текста варианта 16: определить истинный секретный ключ </w:t>
+      </w:pPr>
+      <w:r>
+        <w:t xml:space="preserve">3. </w:t>
+      </w:r>
+      <w:r>
+        <w:t xml:space="preserve">Выполнить криптоанализ перехваченного шифр-текста варианта 16: определить истинный секретный ключ </w:t>
       </w:r>
       <m:oMath>
         <m:box>
@@ -1176,9 +989,6 @@
         </m:box>
       </m:oMath>
       <w:r>
-        <w:rPr>
-          <w:lang w:val="ru-RU"/>
-        </w:rPr>
         <w:t>, восстановить исходный открытый текст, установить автора и название литературного произведения.</w:t>
       </w:r>
     </w:p>
@@ -1186,14 +996,8 @@
       <w:pPr>
         <w:ind w:left="425" w:firstLine="0"/>
         <w:jc w:val="both"/>
-        <w:rPr>
-          <w:lang w:val="ru-RU"/>
-        </w:rPr>
-      </w:pPr>
-      <w:r>
-        <w:rPr>
-          <w:lang w:val="ru-RU"/>
-        </w:rPr>
+      </w:pPr>
+      <w:r>
         <w:t>4. Выполнить контрольное зашифрование открытой строки, содержащей фамилию автора и название произведения, найденным ключом.</w:t>
       </w:r>
     </w:p>
@@ -1201,16 +1005,12 @@
       <w:pPr>
         <w:pStyle w:val="1"/>
         <w:pageBreakBefore/>
-        <w:rPr>
-          <w:lang w:val="ru-RU"/>
-        </w:rPr>
-      </w:pPr>
-      <w:bookmarkStart w:id="1" w:name="_Toc241610194"/>
+      </w:pPr>
+      <w:bookmarkStart w:id="1" w:name="_Toc241668351"/>
       <w:r>
         <w:rPr>
           <w:rFonts w:ascii="Times New Roman" w:eastAsia="Times New Roman" w:hAnsi="Times New Roman" w:cs="Times New Roman"/>
           <w:b w:val="0"/>
-          <w:lang w:val="ru-RU"/>
         </w:rPr>
         <w:lastRenderedPageBreak/>
         <w:t>ОСНОВНАЯ ЧАСТЬ</w:t>
@@ -1220,15 +1020,11 @@
     <w:p>
       <w:pPr>
         <w:pStyle w:val="21"/>
-        <w:rPr>
-          <w:lang w:val="ru-RU"/>
-        </w:rPr>
-      </w:pPr>
-      <w:bookmarkStart w:id="2" w:name="_Toc241610195"/>
+      </w:pPr>
+      <w:bookmarkStart w:id="2" w:name="_Toc241668352"/>
       <w:r>
         <w:rPr>
           <w:rFonts w:ascii="Times New Roman" w:eastAsia="Times New Roman" w:hAnsi="Times New Roman" w:cs="Times New Roman"/>
-          <w:lang w:val="ru-RU"/>
         </w:rPr>
         <w:t>1. Основные сведения и математическая модель</w:t>
       </w:r>
@@ -1237,14 +1033,8 @@
     <w:p>
       <w:pPr>
         <w:jc w:val="both"/>
-        <w:rPr>
-          <w:lang w:val="ru-RU"/>
-        </w:rPr>
-      </w:pPr>
-      <w:r>
-        <w:rPr>
-          <w:lang w:val="ru-RU"/>
-        </w:rPr>
+      </w:pPr>
+      <w:r>
         <w:t xml:space="preserve">Шифр Цезаря представляет собой классический моноалфавитный шифр простой подстановки, реализующий преобразование циклического сдвига в кольце вычетов </w:t>
       </w:r>
       <m:oMath>
@@ -1272,7 +1062,6 @@
                   </m:rPr>
                   <w:rPr>
                     <w:rFonts w:ascii="Cambria Math" w:hAnsi="Cambria Math"/>
-                    <w:lang w:val="ru-RU"/>
                   </w:rPr>
                   <m:t>Z</m:t>
                 </m:r>
@@ -1290,9 +1079,6 @@
         </m:box>
       </m:oMath>
       <w:r>
-        <w:rPr>
-          <w:lang w:val="ru-RU"/>
-        </w:rPr>
         <w:t xml:space="preserve">, где </w:t>
       </w:r>
       <m:oMath>
@@ -1315,9 +1101,6 @@
         </m:box>
       </m:oMath>
       <w:r>
-        <w:rPr>
-          <w:lang w:val="ru-RU"/>
-        </w:rPr>
         <w:t xml:space="preserve"> – мощность используемого алфавита. Каждому символу открытого текста сопоставляется числовой индекс </w:t>
       </w:r>
       <m:oMath>
@@ -1361,7 +1144,6 @@
               </m:rPr>
               <w:rPr>
                 <w:rFonts w:ascii="Cambria Math" w:hAnsi="Cambria Math"/>
-                <w:lang w:val="ru-RU"/>
               </w:rPr>
               <m:t>∈{0,1,…,</m:t>
             </m:r>
@@ -1377,7 +1159,6 @@
               </m:rPr>
               <w:rPr>
                 <w:rFonts w:ascii="Cambria Math" w:hAnsi="Cambria Math"/>
-                <w:lang w:val="ru-RU"/>
               </w:rPr>
               <m:t>-1}</m:t>
             </m:r>
@@ -1385,23 +1166,14 @@
         </m:box>
       </m:oMath>
       <w:r>
-        <w:rPr>
-          <w:lang w:val="ru-RU"/>
-        </w:rPr>
         <w:t>.</w:t>
       </w:r>
     </w:p>
     <w:p>
       <w:pPr>
         <w:jc w:val="both"/>
-        <w:rPr>
-          <w:lang w:val="ru-RU"/>
-        </w:rPr>
-      </w:pPr>
-      <w:r>
-        <w:rPr>
-          <w:lang w:val="ru-RU"/>
-        </w:rPr>
+      </w:pPr>
+      <w:r>
         <w:t>Прямое преобразование шифра Цезаря определяется соотношением:</w:t>
       </w:r>
     </w:p>
@@ -1410,9 +1182,6 @@
         <w:spacing w:before="120" w:after="120"/>
         <w:ind w:firstLine="0"/>
         <w:jc w:val="center"/>
-        <w:rPr>
-          <w:lang w:val="ru-RU"/>
-        </w:rPr>
       </w:pPr>
       <m:oMathPara>
         <m:oMath>
@@ -1437,7 +1206,6 @@
                 </m:rPr>
                 <w:rPr>
                   <w:rFonts w:ascii="Cambria Math" w:hAnsi="Cambria Math"/>
-                  <w:lang w:val="ru-RU"/>
                 </w:rPr>
                 <m:t>=</m:t>
               </m:r>
@@ -1472,7 +1240,6 @@
                 </m:rPr>
                 <w:rPr>
                   <w:rFonts w:ascii="Cambria Math" w:hAnsi="Cambria Math"/>
-                  <w:lang w:val="ru-RU"/>
                 </w:rPr>
                 <m:t>(</m:t>
               </m:r>
@@ -1488,7 +1255,6 @@
                 </m:rPr>
                 <w:rPr>
                   <w:rFonts w:ascii="Cambria Math" w:hAnsi="Cambria Math"/>
-                  <w:lang w:val="ru-RU"/>
                 </w:rPr>
                 <m:t>)=(</m:t>
               </m:r>
@@ -1504,7 +1270,6 @@
                 </m:rPr>
                 <w:rPr>
                   <w:rFonts w:ascii="Cambria Math" w:hAnsi="Cambria Math"/>
-                  <w:lang w:val="ru-RU"/>
                 </w:rPr>
                 <m:t>+</m:t>
               </m:r>
@@ -1520,7 +1285,6 @@
                 </m:rPr>
                 <w:rPr>
                   <w:rFonts w:ascii="Cambria Math" w:hAnsi="Cambria Math"/>
-                  <w:lang w:val="ru-RU"/>
                 </w:rPr>
                 <m:t>)</m:t>
               </m:r>
@@ -1581,14 +1345,8 @@
     <w:p>
       <w:pPr>
         <w:jc w:val="both"/>
-        <w:rPr>
-          <w:lang w:val="ru-RU"/>
-        </w:rPr>
-      </w:pPr>
-      <w:r>
-        <w:rPr>
-          <w:lang w:val="ru-RU"/>
-        </w:rPr>
+      </w:pPr>
+      <w:r>
         <w:t>Обратное преобразование шифра Цезаря определяется соотношением:</w:t>
       </w:r>
     </w:p>
@@ -1597,9 +1355,6 @@
         <w:spacing w:before="120" w:after="120"/>
         <w:ind w:firstLine="0"/>
         <w:jc w:val="center"/>
-        <w:rPr>
-          <w:lang w:val="ru-RU"/>
-        </w:rPr>
       </w:pPr>
       <m:oMathPara>
         <m:oMath>
@@ -1624,7 +1379,6 @@
                 </m:rPr>
                 <w:rPr>
                   <w:rFonts w:ascii="Cambria Math" w:hAnsi="Cambria Math"/>
-                  <w:lang w:val="ru-RU"/>
                 </w:rPr>
                 <m:t>=</m:t>
               </m:r>
@@ -1659,7 +1413,6 @@
                 </m:rPr>
                 <w:rPr>
                   <w:rFonts w:ascii="Cambria Math" w:hAnsi="Cambria Math"/>
-                  <w:lang w:val="ru-RU"/>
                 </w:rPr>
                 <m:t>(</m:t>
               </m:r>
@@ -1675,7 +1428,6 @@
                 </m:rPr>
                 <w:rPr>
                   <w:rFonts w:ascii="Cambria Math" w:hAnsi="Cambria Math"/>
-                  <w:lang w:val="ru-RU"/>
                 </w:rPr>
                 <m:t>)=(</m:t>
               </m:r>
@@ -1691,7 +1443,6 @@
                 </m:rPr>
                 <w:rPr>
                   <w:rFonts w:ascii="Cambria Math" w:hAnsi="Cambria Math"/>
-                  <w:lang w:val="ru-RU"/>
                 </w:rPr>
                 <m:t>-</m:t>
               </m:r>
@@ -1707,7 +1458,6 @@
                 </m:rPr>
                 <w:rPr>
                   <w:rFonts w:ascii="Cambria Math" w:hAnsi="Cambria Math"/>
-                  <w:lang w:val="ru-RU"/>
                 </w:rPr>
                 <m:t>)</m:t>
               </m:r>
@@ -1768,14 +1518,8 @@
     <w:p>
       <w:pPr>
         <w:jc w:val="both"/>
-        <w:rPr>
-          <w:lang w:val="ru-RU"/>
-        </w:rPr>
-      </w:pPr>
-      <w:r>
-        <w:rPr>
-          <w:lang w:val="ru-RU"/>
-        </w:rPr>
+      </w:pPr>
+      <w:r>
         <w:t xml:space="preserve">где </w:t>
       </w:r>
       <m:oMath>
@@ -1798,9 +1542,6 @@
         </m:box>
       </m:oMath>
       <w:r>
-        <w:rPr>
-          <w:lang w:val="ru-RU"/>
-        </w:rPr>
         <w:t xml:space="preserve"> – числовой код символа открытого сообщения, </w:t>
       </w:r>
       <m:oMath>
@@ -1823,9 +1564,6 @@
         </m:box>
       </m:oMath>
       <w:r>
-        <w:rPr>
-          <w:lang w:val="ru-RU"/>
-        </w:rPr>
         <w:t xml:space="preserve"> – числовой код символа зашифрованного сообщения, </w:t>
       </w:r>
       <m:oMath>
@@ -1850,7 +1588,6 @@
               </m:rPr>
               <w:rPr>
                 <w:rFonts w:ascii="Cambria Math" w:hAnsi="Cambria Math"/>
-                <w:lang w:val="ru-RU"/>
               </w:rPr>
               <m:t>∈{1,2,…,</m:t>
             </m:r>
@@ -1866,7 +1603,6 @@
               </m:rPr>
               <w:rPr>
                 <w:rFonts w:ascii="Cambria Math" w:hAnsi="Cambria Math"/>
-                <w:lang w:val="ru-RU"/>
               </w:rPr>
               <m:t>-1}</m:t>
             </m:r>
@@ -1874,9 +1610,6 @@
         </m:box>
       </m:oMath>
       <w:r>
-        <w:rPr>
-          <w:lang w:val="ru-RU"/>
-        </w:rPr>
         <w:t xml:space="preserve"> – секретный ключ шифрования, </w:t>
       </w:r>
       <m:oMath>
@@ -1901,7 +1634,6 @@
               </m:rPr>
               <w:rPr>
                 <w:rFonts w:ascii="Cambria Math" w:hAnsi="Cambria Math"/>
-                <w:lang w:val="ru-RU"/>
               </w:rPr>
               <m:t>=32</m:t>
             </m:r>
@@ -1909,45 +1641,24 @@
         </m:box>
       </m:oMath>
       <w:r>
-        <w:rPr>
-          <w:lang w:val="ru-RU"/>
-        </w:rPr>
         <w:t xml:space="preserve"> – мощность используемого русского алфавита. В соответствии с методическими указаниями буквы «е» и «ё» объединены под единым числовым кодом 5.</w:t>
       </w:r>
     </w:p>
     <w:p>
       <w:pPr>
         <w:jc w:val="both"/>
-        <w:rPr>
-          <w:lang w:val="ru-RU"/>
-        </w:rPr>
-      </w:pPr>
-      <w:r>
-        <w:rPr>
-          <w:lang w:val="ru-RU"/>
-        </w:rPr>
+      </w:pPr>
+      <w:r>
         <w:t>В таблице представлена полная таблица кодировки символов русского алфавита, применяемая при выполнении работы.</w:t>
       </w:r>
     </w:p>
-    <w:p>
-      <w:pPr>
-        <w:rPr>
-          <w:lang w:val="ru-RU"/>
-        </w:rPr>
-      </w:pPr>
-    </w:p>
+    <w:p/>
     <w:p>
       <w:pPr>
         <w:keepNext/>
         <w:ind w:firstLine="0"/>
-        <w:rPr>
-          <w:lang w:val="ru-RU"/>
-        </w:rPr>
-      </w:pPr>
-      <w:r>
-        <w:rPr>
-          <w:lang w:val="ru-RU"/>
-        </w:rPr>
+      </w:pPr>
+      <w:r>
         <w:t>Таблица 1 – Таблица кодировки символов русского алфавита (</w:t>
       </w:r>
       <w:r>
@@ -1957,9 +1668,6 @@
         <w:t>m</w:t>
       </w:r>
       <w:r>
-        <w:rPr>
-          <w:lang w:val="ru-RU"/>
-        </w:rPr>
         <w:t xml:space="preserve"> = 32)</w:t>
       </w:r>
     </w:p>
@@ -3048,7 +2756,7 @@
       <w:pPr>
         <w:pStyle w:val="21"/>
       </w:pPr>
-      <w:bookmarkStart w:id="3" w:name="_Toc241610196"/>
+      <w:bookmarkStart w:id="3" w:name="_Toc241668353"/>
       <w:r>
         <w:rPr>
           <w:rFonts w:ascii="Times New Roman" w:eastAsia="Times New Roman" w:hAnsi="Times New Roman" w:cs="Times New Roman"/>
@@ -3061,42 +2769,28 @@
     <w:p>
       <w:pPr>
         <w:jc w:val="both"/>
-        <w:rPr>
-          <w:lang w:val="ru-RU"/>
-        </w:rPr>
-      </w:pPr>
-      <w:r>
-        <w:rPr>
-          <w:lang w:val="ru-RU"/>
-        </w:rPr>
+      </w:pPr>
+      <w:r>
         <w:t>Для варианта 16 исходное зашифрованное сообщение имеет следующий вид:</w:t>
       </w:r>
     </w:p>
     <w:p>
       <w:pPr>
         <w:jc w:val="both"/>
-        <w:rPr>
-          <w:lang w:val="ru-RU"/>
-        </w:rPr>
       </w:pPr>
       <w:r>
         <w:rPr>
           <w:b/>
-          <w:lang w:val="ru-RU"/>
         </w:rPr>
         <w:t>ШИФР-ТЕКСТ (ШТ):</w:t>
       </w:r>
       <w:r>
-        <w:rPr>
-          <w:lang w:val="ru-RU"/>
-        </w:rPr>
         <w:br/>
       </w:r>
       <w:r>
         <w:rPr>
           <w:rFonts w:ascii="DejaVu Sans" w:eastAsia="DejaVu Sans" w:hAnsi="DejaVu Sans" w:cs="DejaVu Sans"/>
           <w:sz w:val="22"/>
-          <w:lang w:val="ru-RU"/>
         </w:rPr>
         <w:t>юяингщжсадвгмюруюцэьцгтяфдщшуцшхсвшуцшхяпфяуябщг</w:t>
       </w:r>
@@ -3104,14 +2798,8 @@
     <w:p>
       <w:pPr>
         <w:jc w:val="both"/>
-        <w:rPr>
-          <w:lang w:val="ru-RU"/>
-        </w:rPr>
-      </w:pPr>
-      <w:r>
-        <w:rPr>
-          <w:lang w:val="ru-RU"/>
-        </w:rPr>
+      </w:pPr>
+      <w:r>
         <w:t xml:space="preserve">Длина шифр-текста составляет 48 символов. Так как объем ключевого пространства шифра Цезаря ограничен величиной </w:t>
       </w:r>
       <m:oMath>
@@ -3136,7 +2824,6 @@
               </m:rPr>
               <w:rPr>
                 <w:rFonts w:ascii="Cambria Math" w:hAnsi="Cambria Math"/>
-                <w:lang w:val="ru-RU"/>
               </w:rPr>
               <m:t>-1=31</m:t>
             </m:r>
@@ -3144,34 +2831,15 @@
         </m:box>
       </m:oMath>
       <w:r>
-        <w:rPr>
-          <w:lang w:val="ru-RU"/>
-        </w:rPr>
         <w:t>, криптоанализ проводился методом полного исчерпывающего перебора (</w:t>
       </w:r>
       <w:r>
         <w:rPr>
           <w:i/>
         </w:rPr>
-        <w:t>brute</w:t>
-      </w:r>
-      <w:r>
-        <w:rPr>
-          <w:i/>
-          <w:lang w:val="ru-RU"/>
-        </w:rPr>
-        <w:t>-</w:t>
-      </w:r>
-      <w:r>
-        <w:rPr>
-          <w:i/>
-        </w:rPr>
-        <w:t>force</w:t>
-      </w:r>
-      <w:r>
-        <w:rPr>
-          <w:lang w:val="ru-RU"/>
-        </w:rPr>
+        <w:t>brute-force</w:t>
+      </w:r>
+      <w:r>
         <w:t xml:space="preserve">). Результаты дешифрования исходного шифр-текста для всех возможных ключей </w:t>
       </w:r>
       <m:oMath>
@@ -3196,7 +2864,6 @@
               </m:rPr>
               <w:rPr>
                 <w:rFonts w:ascii="Cambria Math" w:hAnsi="Cambria Math"/>
-                <w:lang w:val="ru-RU"/>
               </w:rPr>
               <m:t>∈{1,2,…,31}</m:t>
             </m:r>
@@ -3204,31 +2871,16 @@
         </m:box>
       </m:oMath>
       <w:r>
-        <w:rPr>
-          <w:lang w:val="ru-RU"/>
-        </w:rPr>
         <w:t xml:space="preserve"> приведены в таблице.</w:t>
       </w:r>
     </w:p>
-    <w:p>
-      <w:pPr>
-        <w:rPr>
-          <w:lang w:val="ru-RU"/>
-        </w:rPr>
-      </w:pPr>
-    </w:p>
+    <w:p/>
     <w:p>
       <w:pPr>
         <w:keepNext/>
         <w:ind w:firstLine="0"/>
-        <w:rPr>
-          <w:lang w:val="ru-RU"/>
-        </w:rPr>
-      </w:pPr>
-      <w:r>
-        <w:rPr>
-          <w:lang w:val="ru-RU"/>
-        </w:rPr>
+      </w:pPr>
+      <w:r>
         <w:t>Таблица 2 – Варианты расшифрования исходного ШТ при различных значениях ключа</w:t>
       </w:r>
     </w:p>
@@ -4447,14 +4099,8 @@
     <w:p>
       <w:pPr>
         <w:jc w:val="both"/>
-        <w:rPr>
-          <w:lang w:val="ru-RU"/>
-        </w:rPr>
-      </w:pPr>
-      <w:r>
-        <w:rPr>
-          <w:lang w:val="ru-RU"/>
-        </w:rPr>
+      </w:pPr>
+      <w:r>
         <w:t xml:space="preserve">По результатам анализа таблицы перебора единственным осмысленным текстом является вариант при значении ключа </w:t>
       </w:r>
       <m:oMath>
@@ -4479,7 +4125,6 @@
               </m:rPr>
               <w:rPr>
                 <w:rFonts w:ascii="Cambria Math" w:hAnsi="Cambria Math"/>
-                <w:lang w:val="ru-RU"/>
               </w:rPr>
               <m:t>=17</m:t>
             </m:r>
@@ -4487,36 +4132,26 @@
         </m:box>
       </m:oMath>
       <w:r>
-        <w:rPr>
-          <w:lang w:val="ru-RU"/>
-        </w:rPr>
         <w:t>:</w:t>
       </w:r>
     </w:p>
     <w:p>
       <w:pPr>
-        <w:rPr>
-          <w:lang w:val="ru-RU"/>
-        </w:rPr>
+        <w:jc w:val="both"/>
       </w:pPr>
       <w:r>
         <w:rPr>
           <w:b/>
-          <w:lang w:val="ru-RU"/>
         </w:rPr>
         <w:t>РАСШИФРОВАННЫЙ ТЕКСТ (ОТ):</w:t>
       </w:r>
       <w:r>
-        <w:rPr>
-          <w:lang w:val="ru-RU"/>
-        </w:rPr>
         <w:br/>
       </w:r>
       <w:r>
         <w:rPr>
           <w:rFonts w:ascii="DejaVu Sans" w:eastAsia="DejaVu Sans" w:hAnsi="DejaVu Sans" w:cs="DejaVu Sans"/>
           <w:sz w:val="22"/>
-          <w:lang w:val="ru-RU"/>
         </w:rPr>
         <w:t>ночьтихапустынявнемлетбогуизвездасзвездоюговорит</w:t>
       </w:r>
@@ -4524,127 +4159,91 @@
     <w:p>
       <w:pPr>
         <w:jc w:val="both"/>
-        <w:rPr>
-          <w:lang w:val="ru-RU"/>
-        </w:rPr>
       </w:pPr>
       <w:r>
         <w:rPr>
           <w:b/>
-          <w:lang w:val="ru-RU"/>
         </w:rPr>
         <w:t>КЛЮЧ:</w:t>
       </w:r>
       <w:r>
-        <w:rPr>
-          <w:lang w:val="ru-RU"/>
-        </w:rPr>
         <w:br/>
+      </w:r>
+      <w:r>
         <w:t>17</w:t>
       </w:r>
     </w:p>
     <w:p>
       <w:pPr>
-        <w:rPr>
-          <w:lang w:val="ru-RU"/>
-        </w:rPr>
+        <w:jc w:val="both"/>
       </w:pPr>
       <w:r>
         <w:rPr>
           <w:b/>
-          <w:lang w:val="ru-RU"/>
         </w:rPr>
         <w:t>АВТОР И ПРОИЗВЕДЕНИЕ (ОТ):</w:t>
       </w:r>
       <w:r>
-        <w:rPr>
-          <w:lang w:val="ru-RU"/>
-        </w:rPr>
         <w:br/>
+      </w:r>
+      <w:r>
         <w:t>М. Ю. Лермонтов, «Выхожу один я на дорогу»</w:t>
       </w:r>
     </w:p>
     <w:p>
       <w:pPr>
         <w:jc w:val="both"/>
-        <w:rPr>
-          <w:lang w:val="ru-RU"/>
-        </w:rPr>
-      </w:pPr>
-      <w:r>
-        <w:rPr>
-          <w:lang w:val="ru-RU"/>
-        </w:rPr>
+      </w:pPr>
+      <w:r>
         <w:t>Строка представляет собой фрагмент первой строфы стихотворения:</w:t>
       </w:r>
     </w:p>
     <w:p>
       <w:pPr>
-        <w:jc w:val="center"/>
-        <w:rPr>
-          <w:lang w:val="ru-RU"/>
-        </w:rPr>
-      </w:pPr>
-      <w:r>
-        <w:rPr>
-          <w:lang w:val="ru-RU"/>
-        </w:rPr>
+        <w:jc w:val="both"/>
+      </w:pPr>
+      <w:r>
         <w:t>Выхожу один я на дорогу;</w:t>
       </w:r>
       <w:r>
-        <w:rPr>
-          <w:lang w:val="ru-RU"/>
-        </w:rPr>
         <w:br/>
+      </w:r>
+      <w:r>
         <w:t>Сквозь туман кремнистый путь блестит;</w:t>
       </w:r>
       <w:r>
-        <w:rPr>
-          <w:lang w:val="ru-RU"/>
-        </w:rPr>
         <w:br/>
+      </w:r>
+      <w:r>
         <w:t>Ночь тиха. Пустыня внемлет Богу,</w:t>
       </w:r>
       <w:r>
-        <w:rPr>
-          <w:lang w:val="ru-RU"/>
-        </w:rPr>
         <w:br/>
+      </w:r>
+      <w:r>
         <w:t>И звезда с звездою говорит.</w:t>
       </w:r>
     </w:p>
     <w:p>
       <w:pPr>
         <w:jc w:val="both"/>
-        <w:rPr>
-          <w:lang w:val="ru-RU"/>
-        </w:rPr>
-      </w:pPr>
-      <w:r>
-        <w:rPr>
-          <w:lang w:val="ru-RU"/>
-        </w:rPr>
+      </w:pPr>
+      <w:r>
         <w:t>В соответствии с заданием методических указаний выполнено контрольное зашифрование строки, составленной из фамилии автора и названия произведения:</w:t>
       </w:r>
     </w:p>
     <w:p>
       <w:pPr>
         <w:ind w:left="425" w:firstLine="0"/>
-        <w:rPr>
-          <w:lang w:val="ru-RU"/>
-        </w:rPr>
-      </w:pPr>
-      <w:r>
-        <w:rPr>
-          <w:lang w:val="ru-RU"/>
-        </w:rPr>
+        <w:jc w:val="both"/>
+      </w:pPr>
+      <w:r>
         <w:t xml:space="preserve">• Исходная открытая строка: </w:t>
       </w:r>
       <w:r>
         <w:rPr>
           <w:rFonts w:ascii="DejaVu Sans" w:eastAsia="DejaVu Sans" w:hAnsi="DejaVu Sans" w:cs="DejaVu Sans"/>
           <w:sz w:val="22"/>
-          <w:lang w:val="ru-RU"/>
         </w:rPr>
         <w:t>лермонтоввыхожуодинянадорогу</w:t>
       </w:r>
@@ -4652,34 +4251,24 @@
     <w:p>
       <w:pPr>
         <w:ind w:left="425" w:firstLine="0"/>
-        <w:rPr>
-          <w:lang w:val="ru-RU"/>
-        </w:rPr>
-      </w:pPr>
-      <w:r>
-        <w:rPr>
-          <w:lang w:val="ru-RU"/>
-        </w:rPr>
+        <w:jc w:val="both"/>
+      </w:pPr>
+      <w:r>
         <w:t xml:space="preserve">• </w:t>
       </w:r>
       <w:r>
         <w:rPr>
           <w:b/>
-          <w:lang w:val="ru-RU"/>
         </w:rPr>
         <w:t>ЗАШИФРОВАННЫЕ ФАМИЛИЯ И НАЗВАНИЕ (ШТ):</w:t>
       </w:r>
       <w:r>
-        <w:rPr>
-          <w:lang w:val="ru-RU"/>
-        </w:rPr>
         <w:br/>
       </w:r>
       <w:r>
         <w:rPr>
           <w:rFonts w:ascii="DejaVu Sans" w:eastAsia="DejaVu Sans" w:hAnsi="DejaVu Sans" w:cs="DejaVu Sans"/>
           <w:sz w:val="22"/>
-          <w:lang w:val="ru-RU"/>
         </w:rPr>
         <w:t>ьцбэяюгяуумжячдяхщюрюсхябяфд</w:t>
       </w:r>
@@ -4687,15 +4276,11 @@
     <w:p>
       <w:pPr>
         <w:pStyle w:val="21"/>
-        <w:rPr>
-          <w:lang w:val="ru-RU"/>
-        </w:rPr>
-      </w:pPr>
-      <w:bookmarkStart w:id="4" w:name="_Toc241610197"/>
+      </w:pPr>
+      <w:bookmarkStart w:id="4" w:name="_Toc241668354"/>
       <w:r>
         <w:rPr>
           <w:rFonts w:ascii="Times New Roman" w:eastAsia="Times New Roman" w:hAnsi="Times New Roman" w:cs="Times New Roman"/>
-          <w:lang w:val="ru-RU"/>
         </w:rPr>
         <w:t>3. Программная реализация</w:t>
       </w:r>
@@ -4704,14 +4289,8 @@
     <w:p>
       <w:pPr>
         <w:jc w:val="both"/>
-        <w:rPr>
-          <w:lang w:val="ru-RU"/>
-        </w:rPr>
-      </w:pPr>
-      <w:r>
-        <w:rPr>
-          <w:lang w:val="ru-RU"/>
-        </w:rPr>
+      </w:pPr>
+      <w:r>
         <w:t xml:space="preserve">Программный модуль шифра Цезаря реализован на языке </w:t>
       </w:r>
       <w:r>
@@ -4721,9 +4300,6 @@
         <w:t>Python</w:t>
       </w:r>
       <w:r>
-        <w:rPr>
-          <w:lang w:val="ru-RU"/>
-        </w:rPr>
         <w:t>. В листинге приведена реализация математического ядра, функций прямого и обратного шифрования, а также процедуры полного перебора ключей.</w:t>
       </w:r>
     </w:p>
@@ -4731,14 +4307,8 @@
       <w:pPr>
         <w:keepNext/>
         <w:ind w:firstLine="0"/>
-        <w:rPr>
-          <w:lang w:val="ru-RU"/>
-        </w:rPr>
-      </w:pPr>
-      <w:r>
-        <w:rPr>
-          <w:lang w:val="ru-RU"/>
-        </w:rPr>
+      </w:pPr>
+      <w:r>
         <w:lastRenderedPageBreak/>
         <w:t>Листинг 1 – Реализация алгоритмов шифрования Цезаря и перебора ключей (</w:t>
       </w:r>
@@ -4746,38 +4316,9 @@
         <w:rPr>
           <w:i/>
         </w:rPr>
-        <w:t>caesar</w:t>
-      </w:r>
-      <w:r>
-        <w:rPr>
-          <w:i/>
-          <w:lang w:val="ru-RU"/>
-        </w:rPr>
-        <w:t>_</w:t>
-      </w:r>
-      <w:r>
-        <w:rPr>
-          <w:i/>
-        </w:rPr>
-        <w:t>cipher</w:t>
-      </w:r>
-      <w:r>
-        <w:rPr>
-          <w:i/>
-          <w:lang w:val="ru-RU"/>
-        </w:rPr>
-        <w:t>.</w:t>
-      </w:r>
-      <w:r>
-        <w:rPr>
-          <w:i/>
-        </w:rPr>
-        <w:t>py</w:t>
-      </w:r>
-      <w:r>
-        <w:rPr>
-          <w:lang w:val="ru-RU"/>
-        </w:rPr>
+        <w:t>caesar_cipher.py</w:t>
+      </w:r>
+      <w:r>
         <w:t>)</w:t>
       </w:r>
     </w:p>
@@ -6073,40 +5614,25 @@
       <w:pPr>
         <w:spacing w:after="120" w:line="240" w:lineRule="auto"/>
         <w:ind w:firstLine="0"/>
-        <w:rPr>
-          <w:lang w:val="ru-RU"/>
-        </w:rPr>
       </w:pPr>
       <w:r>
         <w:rPr>
           <w:rFonts w:ascii="DejaVu Sans" w:eastAsia="DejaVu Sans" w:hAnsi="DejaVu Sans" w:cs="DejaVu Sans"/>
           <w:sz w:val="22"/>
         </w:rPr>
-        <w:t xml:space="preserve">        </w:t>
-      </w:r>
-      <w:r>
-        <w:rPr>
-          <w:rFonts w:ascii="DejaVu Sans" w:eastAsia="DejaVu Sans" w:hAnsi="DejaVu Sans" w:cs="DejaVu Sans"/>
-          <w:sz w:val="22"/>
-          <w:lang w:val="ru-RU"/>
-        </w:rPr>
-        <w:t>]</w:t>
+        <w:t xml:space="preserve">        ]</w:t>
       </w:r>
     </w:p>
     <w:p>
       <w:pPr>
         <w:pStyle w:val="1"/>
         <w:pageBreakBefore/>
-        <w:rPr>
-          <w:lang w:val="ru-RU"/>
-        </w:rPr>
-      </w:pPr>
-      <w:bookmarkStart w:id="5" w:name="_Toc241610198"/>
+      </w:pPr>
+      <w:bookmarkStart w:id="5" w:name="_Toc241668355"/>
       <w:r>
         <w:rPr>
           <w:rFonts w:ascii="Times New Roman" w:eastAsia="Times New Roman" w:hAnsi="Times New Roman" w:cs="Times New Roman"/>
           <w:b w:val="0"/>
-          <w:lang w:val="ru-RU"/>
         </w:rPr>
         <w:lastRenderedPageBreak/>
         <w:t>ЗАКЛЮЧЕНИЕ</w:t>
@@ -6116,14 +5642,8 @@
     <w:p>
       <w:pPr>
         <w:jc w:val="both"/>
-        <w:rPr>
-          <w:lang w:val="ru-RU"/>
-        </w:rPr>
-      </w:pPr>
-      <w:r>
-        <w:rPr>
-          <w:lang w:val="ru-RU"/>
-        </w:rPr>
+      </w:pPr>
+      <w:r>
         <w:t>В ходе выполнения лабораторной работы были получены следующие основные результаты:</w:t>
       </w:r>
     </w:p>
@@ -6131,15 +5651,12 @@
       <w:pPr>
         <w:ind w:left="425" w:firstLine="0"/>
         <w:jc w:val="both"/>
-        <w:rPr>
-          <w:lang w:val="ru-RU"/>
-        </w:rPr>
-      </w:pPr>
-      <w:r>
-        <w:rPr>
-          <w:lang w:val="ru-RU"/>
-        </w:rPr>
-        <w:t xml:space="preserve">1. Изучены математические основы моноалфавитной замены и модулярной арифметики на примере симметричного шифра Цезаря в кольце вычетов </w:t>
+      </w:pPr>
+      <w:r>
+        <w:t xml:space="preserve">1. </w:t>
+      </w:r>
+      <w:r>
+        <w:t xml:space="preserve">Изучены математические основы моноалфавитной замены и модулярной арифметики на примере симметричного шифра Цезаря в кольце вычетов </w:t>
       </w:r>
       <m:oMath>
         <m:box>
@@ -6166,7 +5683,6 @@
                   </m:rPr>
                   <w:rPr>
                     <w:rFonts w:ascii="Cambria Math" w:hAnsi="Cambria Math"/>
-                    <w:lang w:val="ru-RU"/>
                   </w:rPr>
                   <m:t>Z</m:t>
                 </m:r>
@@ -6184,9 +5700,6 @@
         </m:box>
       </m:oMath>
       <w:r>
-        <w:rPr>
-          <w:lang w:val="ru-RU"/>
-        </w:rPr>
         <w:t>.</w:t>
       </w:r>
     </w:p>
@@ -6194,14 +5707,8 @@
       <w:pPr>
         <w:ind w:left="425" w:firstLine="0"/>
         <w:jc w:val="both"/>
-        <w:rPr>
-          <w:lang w:val="ru-RU"/>
-        </w:rPr>
-      </w:pPr>
-      <w:r>
-        <w:rPr>
-          <w:lang w:val="ru-RU"/>
-        </w:rPr>
+      </w:pPr>
+      <w:r>
         <w:t xml:space="preserve">2. Разработан программный модуль на языке </w:t>
       </w:r>
       <w:r>
@@ -6211,9 +5718,6 @@
         <w:t>Python</w:t>
       </w:r>
       <w:r>
-        <w:rPr>
-          <w:lang w:val="ru-RU"/>
-        </w:rPr>
         <w:t>, реализующий алгоритмы посимвольного шифрования, дешифрования и исчерпывающего перебора ключевого пространства.</w:t>
       </w:r>
     </w:p>
@@ -6221,14 +5725,8 @@
       <w:pPr>
         <w:ind w:left="425" w:firstLine="0"/>
         <w:jc w:val="both"/>
-        <w:rPr>
-          <w:lang w:val="ru-RU"/>
-        </w:rPr>
-      </w:pPr>
-      <w:r>
-        <w:rPr>
-          <w:lang w:val="ru-RU"/>
-        </w:rPr>
+      </w:pPr>
+      <w:r>
         <w:t xml:space="preserve">3. Проведен криптоанализ перехваченного шифр-текста индивидуального варианта 16. Установлен истинный ключ </w:t>
       </w:r>
       <m:oMath>
@@ -6253,7 +5751,6 @@
               </m:rPr>
               <w:rPr>
                 <w:rFonts w:ascii="Cambria Math" w:hAnsi="Cambria Math"/>
-                <w:lang w:val="ru-RU"/>
               </w:rPr>
               <m:t>=17</m:t>
             </m:r>
@@ -6261,9 +5758,6 @@
         </m:box>
       </m:oMath>
       <w:r>
-        <w:rPr>
-          <w:lang w:val="ru-RU"/>
-        </w:rPr>
         <w:t>, восстановлен исходный открытый текст цитаты из произведения М. Ю. Лермонтова «Выхожу один я на дорогу», и выполнено контрольное зашифрование авторской строки.</w:t>
       </w:r>
     </w:p>
@@ -6271,14 +5765,8 @@
       <w:pPr>
         <w:ind w:left="425" w:firstLine="0"/>
         <w:jc w:val="both"/>
-        <w:rPr>
-          <w:lang w:val="ru-RU"/>
-        </w:rPr>
-      </w:pPr>
-      <w:r>
-        <w:rPr>
-          <w:lang w:val="ru-RU"/>
-        </w:rPr>
+      </w:pPr>
+      <w:r>
         <w:t>4. Практически подтверждена абсолютная криптографическая нестойкость шифра Цезаря к атаке на основе только шифр-текста вследствие малого объема пространства возможных ключей (</w:t>
       </w:r>
       <m:oMath>
@@ -6303,7 +5791,6 @@
               </m:rPr>
               <w:rPr>
                 <w:rFonts w:ascii="Cambria Math" w:hAnsi="Cambria Math"/>
-                <w:lang w:val="ru-RU"/>
               </w:rPr>
               <m:t>-1=31</m:t>
             </m:r>
@@ -6311,9 +5798,6 @@
         </m:box>
       </m:oMath>
       <w:r>
-        <w:rPr>
-          <w:lang w:val="ru-RU"/>
-        </w:rPr>
         <w:t>).</w:t>
       </w:r>
     </w:p>
@@ -6321,16 +5805,12 @@
       <w:pPr>
         <w:pStyle w:val="1"/>
         <w:pageBreakBefore/>
-        <w:rPr>
-          <w:lang w:val="ru-RU"/>
-        </w:rPr>
-      </w:pPr>
-      <w:bookmarkStart w:id="6" w:name="_Toc241610199"/>
+      </w:pPr>
+      <w:bookmarkStart w:id="6" w:name="_Toc241668356"/>
       <w:r>
         <w:rPr>
           <w:rFonts w:ascii="Times New Roman" w:eastAsia="Times New Roman" w:hAnsi="Times New Roman" w:cs="Times New Roman"/>
           <w:b w:val="0"/>
-          <w:lang w:val="ru-RU"/>
         </w:rPr>
         <w:lastRenderedPageBreak/>
         <w:t>СПИСОК ИСПОЛЬЗОВАННЫХ ИСТОЧНИКОВ</w:t>
@@ -6340,133 +5820,31 @@
     <w:p>
       <w:pPr>
         <w:jc w:val="both"/>
-        <w:rPr>
-          <w:lang w:val="ru-RU"/>
-        </w:rPr>
-      </w:pPr>
-      <w:r>
-        <w:rPr>
-          <w:lang w:val="ru-RU"/>
-        </w:rPr>
-        <w:t>1. Белим, С. Ю. Математические основы защиты информации : методические указания к лабораторным работам / С. Ю. Белим, С. В. Белим. — Омск : Издательство ОмГТУ, 2023. — 56 с. — Текст : электронный.</w:t>
+      </w:pPr>
+      <w:r>
+        <w:t xml:space="preserve">1. </w:t>
+      </w:r>
+      <w:r>
+        <w:t>Белим, С. Ю. Математические основы защиты информации : методические указания к лабораторным работам / С. Ю. Белим, С. В. Белим. — Омск : Издательство ОмГТУ, 2023. — 56 с. — Текст : электронный.</w:t>
       </w:r>
     </w:p>
     <w:p>
       <w:pPr>
         <w:jc w:val="both"/>
-        <w:rPr>
-          <w:lang w:val="ru-RU"/>
-        </w:rPr>
-      </w:pPr>
-      <w:r>
-        <w:rPr>
-          <w:lang w:val="ru-RU"/>
-        </w:rPr>
+      </w:pPr>
+      <w:r>
         <w:t>2. Бабаш, А. В. Криптографические методы защиты информации : учебник для вузов / А. В. Бабаш, Г. П. Шанкин. — Москва : Гелиос АРВ, 2016. — 512 с. — Текст : непосредственный.</w:t>
       </w:r>
     </w:p>
     <w:p>
       <w:pPr>
         <w:jc w:val="both"/>
-        <w:rPr>
-          <w:lang w:val="ru-RU"/>
-        </w:rPr>
-      </w:pPr>
-      <w:r>
-        <w:rPr>
-          <w:lang w:val="ru-RU"/>
-        </w:rPr>
+      </w:pPr>
+      <w:r>
         <w:t xml:space="preserve">3. </w:t>
       </w:r>
       <w:r>
-        <w:t>Python</w:t>
-      </w:r>
-      <w:r>
-        <w:rPr>
-          <w:lang w:val="ru-RU"/>
-        </w:rPr>
-        <w:t xml:space="preserve"> 3 </w:t>
-      </w:r>
-      <w:r>
-        <w:t>Documentation</w:t>
-      </w:r>
-      <w:r>
-        <w:rPr>
-          <w:lang w:val="ru-RU"/>
-        </w:rPr>
-        <w:t xml:space="preserve"> : [сайт] / </w:t>
-      </w:r>
-      <w:r>
-        <w:t>Python</w:t>
-      </w:r>
-      <w:r>
-        <w:rPr>
-          <w:lang w:val="ru-RU"/>
-        </w:rPr>
-        <w:t xml:space="preserve"> </w:t>
-      </w:r>
-      <w:r>
-        <w:t>Software</w:t>
-      </w:r>
-      <w:r>
-        <w:rPr>
-          <w:lang w:val="ru-RU"/>
-        </w:rPr>
-        <w:t xml:space="preserve"> </w:t>
-      </w:r>
-      <w:r>
-        <w:t>Foundation</w:t>
-      </w:r>
-      <w:r>
-        <w:rPr>
-          <w:lang w:val="ru-RU"/>
-        </w:rPr>
-        <w:t xml:space="preserve">. — </w:t>
-      </w:r>
-      <w:r>
-        <w:t>URL</w:t>
-      </w:r>
-      <w:r>
-        <w:rPr>
-          <w:lang w:val="ru-RU"/>
-        </w:rPr>
-        <w:t xml:space="preserve">: </w:t>
-      </w:r>
-      <w:r>
-        <w:t>https</w:t>
-      </w:r>
-      <w:r>
-        <w:rPr>
-          <w:lang w:val="ru-RU"/>
-        </w:rPr>
-        <w:t>://</w:t>
-      </w:r>
-      <w:r>
-        <w:t>docs</w:t>
-      </w:r>
-      <w:r>
-        <w:rPr>
-          <w:lang w:val="ru-RU"/>
-        </w:rPr>
-        <w:t>.</w:t>
-      </w:r>
-      <w:r>
-        <w:t>python</w:t>
-      </w:r>
-      <w:r>
-        <w:rPr>
-          <w:lang w:val="ru-RU"/>
-        </w:rPr>
-        <w:t>.</w:t>
-      </w:r>
-      <w:r>
-        <w:t>org</w:t>
-      </w:r>
-      <w:r>
-        <w:rPr>
-          <w:lang w:val="ru-RU"/>
-        </w:rPr>
-        <w:t>/3/ (дата обращения: 29.09.2026). — Текст : электронный.</w:t>
+        <w:t>Python 3 Documentation : [сайт] / Python Software Foundation. — URL: https://docs.python.org/3/ (дата обращения: 29.09.2026). — Текст : электронный.</w:t>
       </w:r>
     </w:p>
     <w:sectPr>
@@ -6576,14 +5954,10 @@
       <w:spacing w:before="20"/>
       <w:ind w:firstLine="0"/>
       <w:jc w:val="center"/>
-      <w:rPr>
-        <w:lang w:val="ru-RU"/>
-      </w:rPr>
     </w:pPr>
     <w:r>
       <w:rPr>
         <w:sz w:val="24"/>
-        <w:lang w:val="ru-RU"/>
       </w:rPr>
       <w:t>Министерство науки и высшего образования РФ</w:t>
     </w:r>
@@ -6593,14 +5967,10 @@
       <w:spacing w:before="60" w:after="240" w:line="240" w:lineRule="auto"/>
       <w:ind w:firstLine="0"/>
       <w:jc w:val="center"/>
-      <w:rPr>
-        <w:lang w:val="ru-RU"/>
-      </w:rPr>
     </w:pPr>
     <w:r>
       <w:rPr>
         <w:sz w:val="24"/>
-        <w:lang w:val="ru-RU"/>
       </w:rPr>
       <w:t>федеральное государственное автономное образовательное учреждение высшего образования</w:t>
     </w:r>
@@ -6610,14 +5980,10 @@
       <w:spacing w:line="240" w:lineRule="auto"/>
       <w:ind w:left="2060" w:firstLine="0"/>
       <w:jc w:val="center"/>
-      <w:rPr>
-        <w:lang w:val="ru-RU"/>
-      </w:rPr>
     </w:pPr>
     <w:r>
       <w:rPr>
         <w:sz w:val="24"/>
-        <w:lang w:val="ru-RU"/>
       </w:rPr>
       <w:t>«Омский государственный технический университет»</w:t>
     </w:r>
@@ -6627,14 +5993,10 @@
       <w:spacing w:before="240" w:line="240" w:lineRule="auto"/>
       <w:ind w:firstLine="0"/>
       <w:jc w:val="center"/>
-      <w:rPr>
-        <w:lang w:val="ru-RU"/>
-      </w:rPr>
     </w:pPr>
     <w:r>
       <w:rPr>
         <w:sz w:val="24"/>
-        <w:lang w:val="ru-RU"/>
       </w:rPr>
       <w:t>Факультет информационных технологий и компьютерных систем</w:t>
     </w:r>
@@ -6644,14 +6006,10 @@
       <w:spacing w:before="240" w:line="240" w:lineRule="auto"/>
       <w:ind w:firstLine="0"/>
       <w:jc w:val="center"/>
-      <w:rPr>
-        <w:lang w:val="ru-RU"/>
-      </w:rPr>
     </w:pPr>
     <w:r>
       <w:rPr>
         <w:sz w:val="24"/>
-        <w:lang w:val="ru-RU"/>
       </w:rPr>
       <w:t>Кафедра «Прикладная математика и фундаментальная информатика»</w:t>
     </w:r>
@@ -6852,31 +6210,31 @@
       </w:rPr>
     </w:lvl>
   </w:abstractNum>
-  <w:num w:numId="1" w16cid:durableId="1279602519">
+  <w:num w:numId="1" w16cid:durableId="330183360">
     <w:abstractNumId w:val="8"/>
   </w:num>
-  <w:num w:numId="2" w16cid:durableId="117575188">
+  <w:num w:numId="2" w16cid:durableId="833960296">
     <w:abstractNumId w:val="6"/>
   </w:num>
-  <w:num w:numId="3" w16cid:durableId="1200777108">
+  <w:num w:numId="3" w16cid:durableId="1430002873">
     <w:abstractNumId w:val="5"/>
   </w:num>
-  <w:num w:numId="4" w16cid:durableId="948701068">
+  <w:num w:numId="4" w16cid:durableId="590891873">
     <w:abstractNumId w:val="4"/>
   </w:num>
-  <w:num w:numId="5" w16cid:durableId="2110537896">
+  <w:num w:numId="5" w16cid:durableId="957760230">
     <w:abstractNumId w:val="7"/>
   </w:num>
-  <w:num w:numId="6" w16cid:durableId="1391610966">
+  <w:num w:numId="6" w16cid:durableId="565143111">
     <w:abstractNumId w:val="3"/>
   </w:num>
-  <w:num w:numId="7" w16cid:durableId="1221286208">
+  <w:num w:numId="7" w16cid:durableId="316109333">
     <w:abstractNumId w:val="2"/>
   </w:num>
-  <w:num w:numId="8" w16cid:durableId="827281264">
+  <w:num w:numId="8" w16cid:durableId="203325258">
     <w:abstractNumId w:val="1"/>
   </w:num>
-  <w:num w:numId="9" w16cid:durableId="1881627212">
+  <w:num w:numId="9" w16cid:durableId="499778831">
     <w:abstractNumId w:val="0"/>
   </w:num>
 </w:numbering>
@@ -18314,7 +17672,7 @@
     <w:autoRedefine/>
     <w:uiPriority w:val="39"/>
     <w:unhideWhenUsed/>
-    <w:rsid w:val="009452FA"/>
+    <w:rsid w:val="004B0F23"/>
     <w:pPr>
       <w:spacing w:after="100"/>
     </w:pPr>
@@ -18326,7 +17684,7 @@
     <w:autoRedefine/>
     <w:uiPriority w:val="39"/>
     <w:unhideWhenUsed/>
-    <w:rsid w:val="009452FA"/>
+    <w:rsid w:val="004B0F23"/>
     <w:pPr>
       <w:spacing w:after="100"/>
       <w:ind w:left="280"/>
@@ -18337,7 +17695,7 @@
     <w:basedOn w:val="a2"/>
     <w:uiPriority w:val="99"/>
     <w:unhideWhenUsed/>
-    <w:rsid w:val="009452FA"/>
+    <w:rsid w:val="004B0F23"/>
     <w:rPr>
       <w:color w:val="0000FF" w:themeColor="hyperlink"/>
       <w:u w:val="single"/>

</xml_diff>

<commit_message>
docs: regenerate lab 1 and lab 2 report docx files
</commit_message>
<xml_diff>
--- a/lab_1/report.docx
+++ b/lab_1/report.docx
@@ -335,7 +335,7 @@
       <w:r>
         <w:fldChar w:fldCharType="separate"/>
       </w:r>
-      <w:hyperlink w:anchor="_Toc241668350" w:history="1">
+      <w:hyperlink w:anchor="_Toc241668668" w:history="1">
         <w:r>
           <w:rPr>
             <w:rStyle w:val="aff8"/>
@@ -362,7 +362,7 @@
             <w:noProof/>
             <w:webHidden/>
           </w:rPr>
-          <w:instrText xml:space="preserve"> PAGEREF _Toc241668350 \h </w:instrText>
+          <w:instrText xml:space="preserve"> PAGEREF _Toc241668668 \h </w:instrText>
         </w:r>
         <w:r>
           <w:rPr>
@@ -409,7 +409,7 @@
           <w14:ligatures w14:val="standardContextual"/>
         </w:rPr>
       </w:pPr>
-      <w:hyperlink w:anchor="_Toc241668351" w:history="1">
+      <w:hyperlink w:anchor="_Toc241668669" w:history="1">
         <w:r>
           <w:rPr>
             <w:rStyle w:val="aff8"/>
@@ -436,7 +436,7 @@
             <w:noProof/>
             <w:webHidden/>
           </w:rPr>
-          <w:instrText xml:space="preserve"> PAGEREF _Toc241668351 \h </w:instrText>
+          <w:instrText xml:space="preserve"> PAGEREF _Toc241668669 \h </w:instrText>
         </w:r>
         <w:r>
           <w:rPr>
@@ -483,7 +483,7 @@
           <w14:ligatures w14:val="standardContextual"/>
         </w:rPr>
       </w:pPr>
-      <w:hyperlink w:anchor="_Toc241668352" w:history="1">
+      <w:hyperlink w:anchor="_Toc241668670" w:history="1">
         <w:r>
           <w:rPr>
             <w:rStyle w:val="aff8"/>
@@ -510,7 +510,7 @@
             <w:noProof/>
             <w:webHidden/>
           </w:rPr>
-          <w:instrText xml:space="preserve"> PAGEREF _Toc241668352 \h </w:instrText>
+          <w:instrText xml:space="preserve"> PAGEREF _Toc241668670 \h </w:instrText>
         </w:r>
         <w:r>
           <w:rPr>
@@ -557,7 +557,7 @@
           <w14:ligatures w14:val="standardContextual"/>
         </w:rPr>
       </w:pPr>
-      <w:hyperlink w:anchor="_Toc241668353" w:history="1">
+      <w:hyperlink w:anchor="_Toc241668671" w:history="1">
         <w:r>
           <w:rPr>
             <w:rStyle w:val="aff8"/>
@@ -584,7 +584,7 @@
             <w:noProof/>
             <w:webHidden/>
           </w:rPr>
-          <w:instrText xml:space="preserve"> PAGEREF _Toc241668353 \h </w:instrText>
+          <w:instrText xml:space="preserve"> PAGEREF _Toc241668671 \h </w:instrText>
         </w:r>
         <w:r>
           <w:rPr>
@@ -631,7 +631,7 @@
           <w14:ligatures w14:val="standardContextual"/>
         </w:rPr>
       </w:pPr>
-      <w:hyperlink w:anchor="_Toc241668354" w:history="1">
+      <w:hyperlink w:anchor="_Toc241668672" w:history="1">
         <w:r>
           <w:rPr>
             <w:rStyle w:val="aff8"/>
@@ -658,7 +658,7 @@
             <w:noProof/>
             <w:webHidden/>
           </w:rPr>
-          <w:instrText xml:space="preserve"> PAGEREF _Toc241668354 \h </w:instrText>
+          <w:instrText xml:space="preserve"> PAGEREF _Toc241668672 \h </w:instrText>
         </w:r>
         <w:r>
           <w:rPr>
@@ -705,7 +705,7 @@
           <w14:ligatures w14:val="standardContextual"/>
         </w:rPr>
       </w:pPr>
-      <w:hyperlink w:anchor="_Toc241668355" w:history="1">
+      <w:hyperlink w:anchor="_Toc241668673" w:history="1">
         <w:r>
           <w:rPr>
             <w:rStyle w:val="aff8"/>
@@ -732,7 +732,7 @@
             <w:noProof/>
             <w:webHidden/>
           </w:rPr>
-          <w:instrText xml:space="preserve"> PAGEREF _Toc241668355 \h </w:instrText>
+          <w:instrText xml:space="preserve"> PAGEREF _Toc241668673 \h </w:instrText>
         </w:r>
         <w:r>
           <w:rPr>
@@ -779,7 +779,7 @@
           <w14:ligatures w14:val="standardContextual"/>
         </w:rPr>
       </w:pPr>
-      <w:hyperlink w:anchor="_Toc241668356" w:history="1">
+      <w:hyperlink w:anchor="_Toc241668674" w:history="1">
         <w:r>
           <w:rPr>
             <w:rStyle w:val="aff8"/>
@@ -806,7 +806,7 @@
             <w:noProof/>
             <w:webHidden/>
           </w:rPr>
-          <w:instrText xml:space="preserve"> PAGEREF _Toc241668356 \h </w:instrText>
+          <w:instrText xml:space="preserve"> PAGEREF _Toc241668674 \h </w:instrText>
         </w:r>
         <w:r>
           <w:rPr>
@@ -851,7 +851,7 @@
         <w:pStyle w:val="1"/>
         <w:pageBreakBefore/>
       </w:pPr>
-      <w:bookmarkStart w:id="0" w:name="_Toc241668350"/>
+      <w:bookmarkStart w:id="0" w:name="_Toc241668668"/>
       <w:r>
         <w:rPr>
           <w:rFonts w:ascii="Times New Roman" w:eastAsia="Times New Roman" w:hAnsi="Times New Roman" w:cs="Times New Roman"/>
@@ -1006,7 +1006,7 @@
         <w:pStyle w:val="1"/>
         <w:pageBreakBefore/>
       </w:pPr>
-      <w:bookmarkStart w:id="1" w:name="_Toc241668351"/>
+      <w:bookmarkStart w:id="1" w:name="_Toc241668669"/>
       <w:r>
         <w:rPr>
           <w:rFonts w:ascii="Times New Roman" w:eastAsia="Times New Roman" w:hAnsi="Times New Roman" w:cs="Times New Roman"/>
@@ -1021,7 +1021,7 @@
       <w:pPr>
         <w:pStyle w:val="21"/>
       </w:pPr>
-      <w:bookmarkStart w:id="2" w:name="_Toc241668352"/>
+      <w:bookmarkStart w:id="2" w:name="_Toc241668670"/>
       <w:r>
         <w:rPr>
           <w:rFonts w:ascii="Times New Roman" w:eastAsia="Times New Roman" w:hAnsi="Times New Roman" w:cs="Times New Roman"/>
@@ -2756,7 +2756,7 @@
       <w:pPr>
         <w:pStyle w:val="21"/>
       </w:pPr>
-      <w:bookmarkStart w:id="3" w:name="_Toc241668353"/>
+      <w:bookmarkStart w:id="3" w:name="_Toc241668671"/>
       <w:r>
         <w:rPr>
           <w:rFonts w:ascii="Times New Roman" w:eastAsia="Times New Roman" w:hAnsi="Times New Roman" w:cs="Times New Roman"/>
@@ -4277,7 +4277,7 @@
       <w:pPr>
         <w:pStyle w:val="21"/>
       </w:pPr>
-      <w:bookmarkStart w:id="4" w:name="_Toc241668354"/>
+      <w:bookmarkStart w:id="4" w:name="_Toc241668672"/>
       <w:r>
         <w:rPr>
           <w:rFonts w:ascii="Times New Roman" w:eastAsia="Times New Roman" w:hAnsi="Times New Roman" w:cs="Times New Roman"/>
@@ -5628,7 +5628,7 @@
         <w:pStyle w:val="1"/>
         <w:pageBreakBefore/>
       </w:pPr>
-      <w:bookmarkStart w:id="5" w:name="_Toc241668355"/>
+      <w:bookmarkStart w:id="5" w:name="_Toc241668673"/>
       <w:r>
         <w:rPr>
           <w:rFonts w:ascii="Times New Roman" w:eastAsia="Times New Roman" w:hAnsi="Times New Roman" w:cs="Times New Roman"/>
@@ -5806,7 +5806,7 @@
         <w:pStyle w:val="1"/>
         <w:pageBreakBefore/>
       </w:pPr>
-      <w:bookmarkStart w:id="6" w:name="_Toc241668356"/>
+      <w:bookmarkStart w:id="6" w:name="_Toc241668674"/>
       <w:r>
         <w:rPr>
           <w:rFonts w:ascii="Times New Roman" w:eastAsia="Times New Roman" w:hAnsi="Times New Roman" w:cs="Times New Roman"/>
@@ -6210,31 +6210,31 @@
       </w:rPr>
     </w:lvl>
   </w:abstractNum>
-  <w:num w:numId="1" w16cid:durableId="330183360">
+  <w:num w:numId="1" w16cid:durableId="1939681741">
     <w:abstractNumId w:val="8"/>
   </w:num>
-  <w:num w:numId="2" w16cid:durableId="833960296">
+  <w:num w:numId="2" w16cid:durableId="700782705">
     <w:abstractNumId w:val="6"/>
   </w:num>
-  <w:num w:numId="3" w16cid:durableId="1430002873">
+  <w:num w:numId="3" w16cid:durableId="383337287">
     <w:abstractNumId w:val="5"/>
   </w:num>
-  <w:num w:numId="4" w16cid:durableId="590891873">
+  <w:num w:numId="4" w16cid:durableId="378748592">
     <w:abstractNumId w:val="4"/>
   </w:num>
-  <w:num w:numId="5" w16cid:durableId="957760230">
+  <w:num w:numId="5" w16cid:durableId="1249464747">
     <w:abstractNumId w:val="7"/>
   </w:num>
-  <w:num w:numId="6" w16cid:durableId="565143111">
+  <w:num w:numId="6" w16cid:durableId="935941589">
     <w:abstractNumId w:val="3"/>
   </w:num>
-  <w:num w:numId="7" w16cid:durableId="316109333">
+  <w:num w:numId="7" w16cid:durableId="1743986710">
     <w:abstractNumId w:val="2"/>
   </w:num>
-  <w:num w:numId="8" w16cid:durableId="203325258">
+  <w:num w:numId="8" w16cid:durableId="257833416">
     <w:abstractNumId w:val="1"/>
   </w:num>
-  <w:num w:numId="9" w16cid:durableId="499778831">
+  <w:num w:numId="9" w16cid:durableId="1911966805">
     <w:abstractNumId w:val="0"/>
   </w:num>
 </w:numbering>
@@ -17672,7 +17672,7 @@
     <w:autoRedefine/>
     <w:uiPriority w:val="39"/>
     <w:unhideWhenUsed/>
-    <w:rsid w:val="004B0F23"/>
+    <w:rsid w:val="005A17AC"/>
     <w:pPr>
       <w:spacing w:after="100"/>
     </w:pPr>
@@ -17684,7 +17684,7 @@
     <w:autoRedefine/>
     <w:uiPriority w:val="39"/>
     <w:unhideWhenUsed/>
-    <w:rsid w:val="004B0F23"/>
+    <w:rsid w:val="005A17AC"/>
     <w:pPr>
       <w:spacing w:after="100"/>
       <w:ind w:left="280"/>
@@ -17695,7 +17695,7 @@
     <w:basedOn w:val="a2"/>
     <w:uiPriority w:val="99"/>
     <w:unhideWhenUsed/>
-    <w:rsid w:val="004B0F23"/>
+    <w:rsid w:val="005A17AC"/>
     <w:rPr>
       <w:color w:val="0000FF" w:themeColor="hyperlink"/>
       <w:u w:val="single"/>

</xml_diff>